<commit_message>
Update PLSDA_SVM_Binary: VIP_TOP_N changed from 1000 to 1500
https://claude.ai/code/session_01MNVMUP3XQfcv4xQxHGe3PS
</commit_message>
<xml_diff>
--- a/PLSDA_SVM_Binary.docx
+++ b/PLSDA_SVM_Binary.docx
@@ -41,7 +41,7 @@
     </w:p>
     <w:p>
       <w:r>
-        <w:t>Binary classification of SSY Raman spectra into PDMS (SSY-PDMS + SSY-Gr-PDMS) vs SiO₂/Si (SSY-SiO₂/Si + SSY-Gr-SiO₂/Si). Uses stratified random 60/20 train/test split (sessions ignored), VIP top-1000 feature selection, 3-LV PLS-DA, 5-fold CV on training set, and external test evaluation for both PLS-DA and SVM-RBF. Per-class Accuracy = (TP+TN)/N  and  Recall = TP/(TP+FN) reported for every model.</w:t>
+        <w:t>Binary classification of SSY Raman spectra into PDMS (SSY-PDMS + SSY-Gr-PDMS) vs SiO₂/Si (SSY-SiO₂/Si + SSY-Gr-SiO₂/Si). Uses stratified random 60/20 train/test split (sessions ignored), VIP top-1500 feature selection, 3-LV PLS-DA, 5-fold CV on training set, and external test evaluation for both PLS-DA and SVM-RBF. Per-class Accuracy = (TP+TN)/N  and  Recall = TP/(TP+FN) reported for every model.</w:t>
       </w:r>
     </w:p>
     <w:p>
@@ -254,7 +254,7 @@
           </w:tcPr>
           <w:p>
             <w:r>
-              <w:t>VIP scores with top-1000 selection highlighted</w:t>
+              <w:t>VIP scores with top-1500 selection highlighted</w:t>
             </w:r>
           </w:p>
         </w:tc>
@@ -753,7 +753,7 @@
         <w:br/>
         <w:t>SG_POLY        = 2</w:t>
         <w:br/>
-        <w:t>VIP_TOP_N      = 1000</w:t>
+        <w:t>VIP_TOP_N      = 1500</w:t>
         <w:br/>
         <w:t>N_COMPONENTS   = 3          # binary PLS-DA: 3 LVs sufficient</w:t>
         <w:br/>

</xml_diff>

<commit_message>
Update PLSDA_SVM_Binary: VIP_TOP_N changed from 1500 to 1800
https://claude.ai/code/session_01MNVMUP3XQfcv4xQxHGe3PS
</commit_message>
<xml_diff>
--- a/PLSDA_SVM_Binary.docx
+++ b/PLSDA_SVM_Binary.docx
@@ -41,7 +41,7 @@
     </w:p>
     <w:p>
       <w:r>
-        <w:t>Binary classification of SSY Raman spectra into PDMS (SSY-PDMS + SSY-Gr-PDMS) vs SiO₂/Si (SSY-SiO₂/Si + SSY-Gr-SiO₂/Si). Uses stratified random 60/20 train/test split (sessions ignored), VIP top-1500 feature selection, 3-LV PLS-DA, 5-fold CV on training set, and external test evaluation for both PLS-DA and SVM-RBF. Per-class Accuracy = (TP+TN)/N  and  Recall = TP/(TP+FN) reported for every model.</w:t>
+        <w:t>Binary classification of SSY Raman spectra into PDMS (SSY-PDMS + SSY-Gr-PDMS) vs SiO₂/Si (SSY-SiO₂/Si + SSY-Gr-SiO₂/Si). Uses stratified random 60/20 train/test split (sessions ignored), VIP top-1800 feature selection, 3-LV PLS-DA, 5-fold CV on training set, and external test evaluation for both PLS-DA and SVM-RBF. Per-class Accuracy = (TP+TN)/N  and  Recall = TP/(TP+FN) reported for every model.</w:t>
       </w:r>
     </w:p>
     <w:p>
@@ -254,7 +254,7 @@
           </w:tcPr>
           <w:p>
             <w:r>
-              <w:t>VIP scores with top-1500 selection highlighted</w:t>
+              <w:t>VIP scores with top-1800 selection highlighted</w:t>
             </w:r>
           </w:p>
         </w:tc>
@@ -753,7 +753,7 @@
         <w:br/>
         <w:t>SG_POLY        = 2</w:t>
         <w:br/>
-        <w:t>VIP_TOP_N      = 1500</w:t>
+        <w:t>VIP_TOP_N      = 1800</w:t>
         <w:br/>
         <w:t>N_COMPONENTS   = 3          # binary PLS-DA: 3 LVs sufficient</w:t>
         <w:br/>

</xml_diff>

<commit_message>
Update PLSDA_SVM_Binary: VIP_TOP_N changed from 1800 to 2200
https://claude.ai/code/session_01MNVMUP3XQfcv4xQxHGe3PS
</commit_message>
<xml_diff>
--- a/PLSDA_SVM_Binary.docx
+++ b/PLSDA_SVM_Binary.docx
@@ -41,7 +41,7 @@
     </w:p>
     <w:p>
       <w:r>
-        <w:t>Binary classification of SSY Raman spectra into PDMS (SSY-PDMS + SSY-Gr-PDMS) vs SiO₂/Si (SSY-SiO₂/Si + SSY-Gr-SiO₂/Si). Uses stratified random 60/20 train/test split (sessions ignored), VIP top-1800 feature selection, 3-LV PLS-DA, 5-fold CV on training set, and external test evaluation for both PLS-DA and SVM-RBF. Per-class Accuracy = (TP+TN)/N  and  Recall = TP/(TP+FN) reported for every model.</w:t>
+        <w:t>Binary classification of SSY Raman spectra into PDMS (SSY-PDMS + SSY-Gr-PDMS) vs SiO₂/Si (SSY-SiO₂/Si + SSY-Gr-SiO₂/Si). Uses stratified random 60/20 train/test split (sessions ignored), VIP top-2200 feature selection, 3-LV PLS-DA, 5-fold CV on training set, and external test evaluation for both PLS-DA and SVM-RBF. Per-class Accuracy = (TP+TN)/N  and  Recall = TP/(TP+FN) reported for every model.</w:t>
       </w:r>
     </w:p>
     <w:p>
@@ -254,7 +254,7 @@
           </w:tcPr>
           <w:p>
             <w:r>
-              <w:t>VIP scores with top-1800 selection highlighted</w:t>
+              <w:t>VIP scores with top-2200 selection highlighted</w:t>
             </w:r>
           </w:p>
         </w:tc>
@@ -753,7 +753,7 @@
         <w:br/>
         <w:t>SG_POLY        = 2</w:t>
         <w:br/>
-        <w:t>VIP_TOP_N      = 1800</w:t>
+        <w:t>VIP_TOP_N      = 2200</w:t>
         <w:br/>
         <w:t>N_COMPONENTS   = 3          # binary PLS-DA: 3 LVs sufficient</w:t>
         <w:br/>

</xml_diff>

<commit_message>
Update PLSDA_SVM_Binary: Gr-only test set (n=10), exclude 10 no-Gr, remove SSY from plots
Test = 5 Gr-PDMS + 5 Gr-SiO2/Si (10 Gr-only spectra).
10 no-Gr spectra (5 per class) excluded entirely from analysis.
Train = 60 (15 Gr + 15 no-Gr per class, 30 per class).
SSY removed from all plot titles and labels.

https://claude.ai/code/session_01MNVMUP3XQfcv4xQxHGe3PS
</commit_message>
<xml_diff>
--- a/PLSDA_SVM_Binary.docx
+++ b/PLSDA_SVM_Binary.docx
@@ -11,7 +11,7 @@
         <w:rPr>
           <w:color w:val="1A1A8C"/>
         </w:rPr>
-        <w:t>PLS-DA + SVM-RBF | Binary Classification | SSY Raman Spectroscopy</w:t>
+        <w:t>PLS-DA + SVM-RBF | Binary Classification | Raman Spectroscopy</w:t>
       </w:r>
     </w:p>
     <w:p>
@@ -24,7 +24,7 @@
           <w:color w:val="444444"/>
           <w:sz w:val="22"/>
         </w:rPr>
-        <w:t>PDMS vs SiO2/Si  |  60 Train / 20 Test  |  5-fold CV + External Test</w:t>
+        <w:t>PDMS vs SiO2/Si  |  60 Train / 10 Test (Gr only)  |  5-fold CV + External Test</w:t>
       </w:r>
     </w:p>
     <w:p/>
@@ -41,7 +41,7 @@
     </w:p>
     <w:p>
       <w:r>
-        <w:t>Binary classification of SSY Raman spectra into PDMS (SSY-PDMS + SSY-Gr-PDMS) vs SiO₂/Si (SSY-SiO₂/Si + SSY-Gr-SiO₂/Si). Uses stratified random 60/20 train/test split (sessions ignored), VIP top-2200 feature selection, 3-LV PLS-DA, 5-fold CV on training set, and external test evaluation for both PLS-DA and SVM-RBF. Per-class Accuracy = (TP+TN)/N  and  Recall = TP/(TP+FN) reported for every model.</w:t>
+        <w:t>Binary classification of Raman spectra into PDMS (PDMS + Gr-PDMS) vs SiO₂/Si (SiO₂/Si + Gr-SiO₂/Si). Split: 10 no-Gr spectra excluded entirely (5 per class); Test = 10 Gr-only spectra (5 Gr-PDMS + 5 Gr-SiO₂/Si); Train = remaining 60 (15 Gr + 15 no-Gr per class). VIP top-2200, 3-LV PLS-DA, 5-fold CV on training set, external test. Per-class Accuracy = (TP+TN)/N  and  Recall = TP/(TP+FN) for every model. SSY not shown in plot titles/labels.</w:t>
       </w:r>
     </w:p>
     <w:p>
@@ -230,7 +230,7 @@
           </w:tcPr>
           <w:p>
             <w:r>
-              <w:t>PLS-DA confusion matrix — External Test + per-class table</w:t>
+              <w:t>PLS-DA confusion matrix — External Test (Gr only, n=10)</w:t>
             </w:r>
           </w:p>
         </w:tc>
@@ -350,7 +350,7 @@
           </w:tcPr>
           <w:p>
             <w:r>
-              <w:t>SVM-RBF cluster plot (PCA space, 5-fold CV + test)</w:t>
+              <w:t>SVM-RBF cluster plot (PCA space, 5-fold CV + Gr test)</w:t>
             </w:r>
           </w:p>
         </w:tc>
@@ -374,7 +374,7 @@
           </w:tcPr>
           <w:p>
             <w:r>
-              <w:t>SVM-RBF cluster plot — test focus</w:t>
+              <w:t>SVM-RBF cluster — Gr-only test focus</w:t>
             </w:r>
           </w:p>
         </w:tc>
@@ -422,7 +422,7 @@
           </w:tcPr>
           <w:p>
             <w:r>
-              <w:t>SVM-RBF confusion matrix — External Test + per-class table</w:t>
+              <w:t>SVM-RBF confusion matrix — External Test (Gr only, n=10)</w:t>
             </w:r>
           </w:p>
         </w:tc>
@@ -585,11 +585,13 @@
         <w:t xml:space="preserve">  Class 2  SiO2/Si : SSY-SiO2/Si + SSY-Gr-SiO2/Si (40 spectra total)</w:t>
         <w:br/>
         <w:br/>
-        <w:t>SPLIT  (stratified random — sessions ignored)</w:t>
-        <w:br/>
-        <w:t xml:space="preserve">  Training : 60 spectra  (30 PDMS + 30 SiO2/Si)</w:t>
-        <w:br/>
-        <w:t xml:space="preserve">  Test     :  20 spectra  (10 PDMS + 10 SiO2/Si)</w:t>
+        <w:t>SPLIT  (Gr-only test set — sessions ignored)</w:t>
+        <w:br/>
+        <w:t xml:space="preserve">  Training : 60 spectra  (10 Gr-PDMS + 20 PDMS + 10 Gr-SiO2/Si + 20 SiO2/Si)</w:t>
+        <w:br/>
+        <w:t xml:space="preserve">  Test     : 20 spectra  — Gr ONLY  (10 Gr-PDMS + 10 Gr-SiO2/Si)</w:t>
+        <w:br/>
+        <w:t xml:space="preserve">             randomly selected from 20 Gr per class; remaining Gr go to train</w:t>
         <w:br/>
         <w:br/>
         <w:t>VALIDATION</w:t>
@@ -639,8 +641,6 @@
         <w:br/>
         <w:t xml:space="preserve">  Results_Binary.xlsx</w:t>
         <w:br/>
-        <w:br/>
-        <w:t>HOW TO RUN (PyCharm Terminal):</w:t>
       </w:r>
     </w:p>
     <w:p>
@@ -653,6 +653,8 @@
           <w:rFonts w:ascii="Courier New" w:hAnsi="Courier New"/>
           <w:sz w:val="16"/>
         </w:rPr>
+        <w:t>HOW TO RUN (PyCharm Terminal):</w:t>
+        <w:br/>
         <w:t xml:space="preserve">  pip install pandas openpyxl scikit-learn scipy matplotlib xlrd</w:t>
         <w:br/>
         <w:t>=============================================================================</w:t>
@@ -696,7 +698,7 @@
         <w:br/>
         <w:t xml:space="preserve">    StratifiedKFold, cross_val_predict,</w:t>
         <w:br/>
-        <w:t xml:space="preserve">    permutation_test_score, train_test_split</w:t>
+        <w:t xml:space="preserve">    permutation_test_score</w:t>
         <w:br/>
         <w:t>)</w:t>
         <w:br/>
@@ -725,8 +727,6 @@
         <w:t># 0.  SETTINGS</w:t>
         <w:br/>
         <w:t># =============================================================================</w:t>
-        <w:br/>
-        <w:t>DATA_PATH      = r"C:\Users\Hira Aman\Desktop\PROF_DOMENICO'S"</w:t>
       </w:r>
     </w:p>
     <w:p>
@@ -739,6 +739,8 @@
           <w:rFonts w:ascii="Courier New" w:hAnsi="Courier New"/>
           <w:sz w:val="16"/>
         </w:rPr>
+        <w:t>DATA_PATH      = r"C:\Users\Hira Aman\Desktop\PROF_DOMENICO'S"</w:t>
+        <w:br/>
         <w:t>FILE_NAME      = "Book1.xls"</w:t>
         <w:br/>
         <w:t>SHEET_NAME     = "Sheet1"</w:t>
@@ -811,8 +813,6 @@
         <w:t>def load_xls(file_path, sheet):</w:t>
         <w:br/>
         <w:t xml:space="preserve">    try:</w:t>
-        <w:br/>
-        <w:t xml:space="preserve">        df = pd.read_excel(file_path, sheet_name=sheet,</w:t>
       </w:r>
     </w:p>
     <w:p>
@@ -825,6 +825,8 @@
           <w:rFonts w:ascii="Courier New" w:hAnsi="Courier New"/>
           <w:sz w:val="16"/>
         </w:rPr>
+        <w:t xml:space="preserve">        df = pd.read_excel(file_path, sheet_name=sheet,</w:t>
+        <w:br/>
         <w:t xml:space="preserve">                           header=0, index_col=0, engine='xlrd')</w:t>
         <w:br/>
         <w:t xml:space="preserve">        print("[INFO] Read engine : xlrd")</w:t>
@@ -902,8 +904,6 @@
         <w:t xml:space="preserve">    raise RuntimeError(</w:t>
         <w:br/>
         <w:t xml:space="preserve">        "\n[ERROR] Cannot read the .xls file.\n"</w:t>
-        <w:br/>
-        <w:t xml:space="preserve">        "Run:  pip install xlrd   then re-run.")</w:t>
       </w:r>
     </w:p>
     <w:p>
@@ -916,10 +916,12 @@
           <w:rFonts w:ascii="Courier New" w:hAnsi="Courier New"/>
           <w:sz w:val="16"/>
         </w:rPr>
+        <w:t xml:space="preserve">        "Run:  pip install xlrd   then re-run.")</w:t>
+        <w:br/>
         <w:br/>
         <w:t># =============================================================================</w:t>
         <w:br/>
-        <w:t># 2.  BINARY CLASS MAPPING</w:t>
+        <w:t># 2.  BINARY CLASS MAPPING  +  Gr / no-Gr FLAG</w:t>
         <w:br/>
         <w:t>#     PDMS    = SSY-PDMS  +  SSY-Gr-PDMS      (anything with 'pdms')</w:t>
         <w:br/>
@@ -946,6 +948,13 @@
         <w:t xml:space="preserve">    else:                        return None</w:t>
         <w:br/>
         <w:br/>
+        <w:t>def has_gr(col_name):</w:t>
+        <w:br/>
+        <w:t xml:space="preserve">    s = col_name.lower()</w:t>
+        <w:br/>
+        <w:t xml:space="preserve">    return bool(re.search(r'[-_]gr[-_]|[-_]gr$|grsl', s))</w:t>
+        <w:br/>
+        <w:br/>
         <w:t># =============================================================================</w:t>
         <w:br/>
         <w:t># 3.  LOAD DATA</w:t>
@@ -954,11 +963,11 @@
         <w:br/>
         <w:t>print("\n" + "=" * 65)</w:t>
         <w:br/>
-        <w:t>print("  PLS-DA + SVM-RBF  |  BINARY  |  SSY Raman  |  450-1800 cm-1")</w:t>
-        <w:br/>
-        <w:t>print("  Class 1: PDMS  (SSY-PDMS + SSY-Gr-PDMS)")</w:t>
-        <w:br/>
-        <w:t>print("  Class 2: SiO2/Si  (SSY-SiO2/Si + SSY-Gr-SiO2/Si)")</w:t>
+        <w:t>print("  PLS-DA + SVM-RBF  |  BINARY  |  Raman  |  450-1800 cm-1")</w:t>
+        <w:br/>
+        <w:t>print("  Class 1: PDMS  (PDMS + Gr-PDMS)")</w:t>
+        <w:br/>
+        <w:t>print("  Class 2: SiO2/Si  (SiO2/Si + Gr-SiO2/Si)")</w:t>
         <w:br/>
         <w:t>print("=" * 65)</w:t>
         <w:br/>
@@ -978,15 +987,6 @@
         <w:t>col_names_all   = raw.columns.tolist()</w:t>
         <w:br/>
         <w:t>X_all           = raw.values.T.astype(float)</w:t>
-        <w:br/>
-        <w:br/>
-        <w:t>crop_mask   = ((wavenumbers_all &gt;= WAVENUMBER_MIN) &amp;</w:t>
-        <w:br/>
-        <w:t xml:space="preserve">               (wavenumbers_all &lt;= WAVENUMBER_MAX))</w:t>
-        <w:br/>
-        <w:t>wavenumbers = wavenumbers_all[crop_mask]</w:t>
-        <w:br/>
-        <w:t>X_crop      = X_all[:, crop_mask]</w:t>
         <w:br/>
       </w:r>
     </w:p>
@@ -1000,6 +1000,15 @@
           <w:rFonts w:ascii="Courier New" w:hAnsi="Courier New"/>
           <w:sz w:val="16"/>
         </w:rPr>
+        <w:t>crop_mask   = ((wavenumbers_all &gt;= WAVENUMBER_MIN) &amp;</w:t>
+        <w:br/>
+        <w:t xml:space="preserve">               (wavenumbers_all &lt;= WAVENUMBER_MAX))</w:t>
+        <w:br/>
+        <w:t>wavenumbers = wavenumbers_all[crop_mask]</w:t>
+        <w:br/>
+        <w:t>X_crop      = X_all[:, crop_mask]</w:t>
+        <w:br/>
+        <w:br/>
         <w:t>assert X_crop.shape[1] &gt; 0,          "ERROR: No spectral points in range!"</w:t>
         <w:br/>
         <w:t>assert np.isnan(X_crop).sum() == 0,  "ERROR: NaN values in data!"</w:t>
@@ -1048,29 +1057,21 @@
         <w:br/>
         <w:t># =============================================================================</w:t>
         <w:br/>
-        <w:t># 4.  STRATIFIED TRAIN / TEST SPLIT  (30+30 train / 10+10 test)</w:t>
-        <w:br/>
-        <w:t>#     Sessions IGNORED — pure random stratified split</w:t>
-        <w:br/>
-        <w:t># =============================================================================</w:t>
-        <w:br/>
-        <w:t>print("\n[SPLIT] Stratified 60/20 split (sessions ignored) ...")</w:t>
-        <w:br/>
-        <w:br/>
-        <w:t>train_idx, test_idx = train_test_split(</w:t>
-        <w:br/>
-        <w:t xml:space="preserve">    np.arange(len(y)), test_size=20,</w:t>
-        <w:br/>
-        <w:t xml:space="preserve">    stratify=y, random_state=RANDOM_STATE)</w:t>
-        <w:br/>
-        <w:t>train_idx = np.sort(train_idx)</w:t>
-        <w:br/>
-        <w:t>test_idx  = np.sort(test_idx)</w:t>
-        <w:br/>
-        <w:br/>
-        <w:t>assert len(train_idx) == 60, "Train size = %d (expected 60)" % len(train_idx)</w:t>
-        <w:br/>
-        <w:t>assert len(test_idx)  == 20, "Test size  = %d (expected 20)" % len(test_idx)</w:t>
+        <w:t># 4.  SPLIT  — Gr-only test set</w:t>
+        <w:br/>
+        <w:t>#</w:t>
+        <w:br/>
+        <w:t>#   Data per class (40 each):  20 Gr  +  20 no-Gr</w:t>
+        <w:br/>
+        <w:t>#</w:t>
+        <w:br/>
+        <w:t>#   Step 1 — Exclude 5 no-Gr per class (10 total) — not used anywhere</w:t>
+        <w:br/>
+        <w:t>#   Step 2 — Test : 5 Gr per class (10 total, Gr spectra only)</w:t>
+        <w:br/>
+        <w:t>#   Step 3 — Train: remaining 30 per class (60 total)</w:t>
+        <w:br/>
+        <w:t>#             = 15 Gr + 15 no-Gr per class</w:t>
       </w:r>
     </w:p>
     <w:p>
@@ -1083,6 +1084,57 @@
           <w:rFonts w:ascii="Courier New" w:hAnsi="Courier New"/>
           <w:sz w:val="16"/>
         </w:rPr>
+        <w:t># =============================================================================</w:t>
+        <w:br/>
+        <w:t>print("\n[SPLIT] Gr-only test split ...")</w:t>
+        <w:br/>
+        <w:br/>
+        <w:t>gr_mask = np.array([has_gr(c) for c in col_names])</w:t>
+        <w:br/>
+        <w:br/>
+        <w:t>pdms_gr_idx    = np.where((classes == 'PDMS')    &amp;  gr_mask)[0]   # 20</w:t>
+        <w:br/>
+        <w:t>pdms_nogr_idx  = np.where((classes == 'PDMS')    &amp; ~gr_mask)[0]   # 20</w:t>
+        <w:br/>
+        <w:t>sio2_gr_idx    = np.where((classes == 'SiO2/Si') &amp;  gr_mask)[0]   # 20</w:t>
+        <w:br/>
+        <w:t>sio2_nogr_idx  = np.where((classes == 'SiO2/Si') &amp; ~gr_mask)[0]   # 20</w:t>
+        <w:br/>
+        <w:br/>
+        <w:t>rng = np.random.default_rng(RANDOM_STATE)</w:t>
+        <w:br/>
+        <w:br/>
+        <w:t># Test: 5 Gr per class  →  10 Gr-only test spectra</w:t>
+        <w:br/>
+        <w:t>pdms_gr_test  = rng.choice(pdms_gr_idx,   size=5, replace=False)</w:t>
+        <w:br/>
+        <w:t>sio2_gr_test  = rng.choice(sio2_gr_idx,   size=5, replace=False)</w:t>
+        <w:br/>
+        <w:t>test_idx      = np.sort(np.concatenate([pdms_gr_test, sio2_gr_test]))</w:t>
+        <w:br/>
+        <w:br/>
+        <w:t># Exclude: 5 no-Gr per class  →  10 spectra dropped entirely</w:t>
+        <w:br/>
+        <w:t>pdms_nogr_excl = rng.choice(pdms_nogr_idx, size=5, replace=False)</w:t>
+        <w:br/>
+        <w:t>sio2_nogr_excl = rng.choice(sio2_nogr_idx, size=5, replace=False)</w:t>
+        <w:br/>
+        <w:t>excl_idx       = np.concatenate([pdms_nogr_excl, sio2_nogr_excl])</w:t>
+        <w:br/>
+        <w:br/>
+        <w:t># Train: everything else  →  60 spectra</w:t>
+        <w:br/>
+        <w:t>all_idx   = np.arange(len(y))</w:t>
+        <w:br/>
+        <w:t>train_idx = np.sort(np.setdiff1d(all_idx, np.concatenate([test_idx, excl_idx])))</w:t>
+        <w:br/>
+        <w:br/>
+        <w:t>assert len(train_idx) == 60, "Train size = %d (expected 60)" % len(train_idx)</w:t>
+        <w:br/>
+        <w:t>assert len(test_idx)  == 10, "Test size  = %d (expected 10)"  % len(test_idx)</w:t>
+        <w:br/>
+        <w:t>assert len(excl_idx)  == 10, "Excl size  = %d (expected 10)"  % len(excl_idx)</w:t>
+        <w:br/>
         <w:br/>
         <w:t>X_train     = X_crop[train_idx]</w:t>
         <w:br/>
@@ -1101,62 +1153,7 @@
         <w:t>names_test  = [col_names[i] for i in test_idx]</w:t>
         <w:br/>
         <w:br/>
-        <w:t>print("[SPLIT] Training : %d spectra" % len(y_train))</w:t>
-        <w:br/>
-        <w:t>for cls, cnt in zip(*np.unique(cls_train, return_counts=True)):</w:t>
-        <w:br/>
-        <w:t xml:space="preserve">    print("           %-12s: %d" % (cls, cnt))</w:t>
-        <w:br/>
-        <w:t>print("[SPLIT] Test     : %d spectra" % len(y_test))</w:t>
-        <w:br/>
-        <w:t>for cls, cnt in zip(*np.unique(cls_test, return_counts=True)):</w:t>
-        <w:br/>
-        <w:t xml:space="preserve">    print("           %-12s: %d" % (cls, cnt))</w:t>
-        <w:br/>
-        <w:br/>
-        <w:t># =============================================================================</w:t>
-        <w:br/>
-        <w:t># 5.  PRE-PROCESSING  (Savitzky-Golay smooth)</w:t>
-        <w:br/>
-        <w:t># =============================================================================</w:t>
-        <w:br/>
-        <w:t>X_train_sm = savgol_filter(X_train, window_length=SG_WINDOW, polyorder=SG_POLY, axis=1)</w:t>
-        <w:br/>
-        <w:t>X_test_sm  = savgol_filter(X_test,  window_length=SG_WINDOW, polyorder=SG_POLY, axis=1)</w:t>
-        <w:br/>
-        <w:t>print("\n[INFO] SG smoothing applied (window=%d, poly=%d)" % (SG_WINDOW, SG_POLY))</w:t>
-        <w:br/>
-        <w:br/>
-        <w:t># =============================================================================</w:t>
-        <w:br/>
-        <w:t># 6.  VIP HELPER</w:t>
-        <w:br/>
-        <w:t># =============================================================================</w:t>
-        <w:br/>
-        <w:t>def compute_vip(fitted_pls):</w:t>
-        <w:br/>
-        <w:t xml:space="preserve">    T_ = fitted_pls.x_scores_</w:t>
-        <w:br/>
-        <w:t xml:space="preserve">    W_ = fitted_pls.x_weights_</w:t>
-        <w:br/>
-        <w:t xml:space="preserve">    Q_ = fitted_pls.y_loadings_</w:t>
-        <w:br/>
-        <w:t xml:space="preserve">    p  = W_.shape[0]</w:t>
-        <w:br/>
-        <w:t xml:space="preserve">    SS = np.sum(T_**2, axis=0) * np.sum(Q_**2, axis=0)</w:t>
-        <w:br/>
-        <w:t xml:space="preserve">    Wn = W_ / np.linalg.norm(W_, axis=0)</w:t>
-        <w:br/>
-        <w:t xml:space="preserve">    return np.sqrt(p * np.sum(SS * Wn**2, axis=1) / np.sum(SS))</w:t>
-        <w:br/>
-        <w:br/>
-        <w:t># =============================================================================</w:t>
-        <w:br/>
-        <w:t># 7.  VIP SELECTION  (3-LV PLS-DA on TRAINING only — no leakage)</w:t>
-        <w:br/>
-        <w:t># =============================================================================</w:t>
-        <w:br/>
-        <w:t>print("\n[VIP] 3-LV PLS-DA on training -&gt; top-%d VIP ..." % VIP_TOP_N)</w:t>
+        <w:t>print("[SPLIT] Training : %d spectra  (15 Gr + 15 no-Gr per class)" % len(y_train))</w:t>
       </w:r>
     </w:p>
     <w:p>
@@ -1169,6 +1166,63 @@
           <w:rFonts w:ascii="Courier New" w:hAnsi="Courier New"/>
           <w:sz w:val="16"/>
         </w:rPr>
+        <w:t>for cls, cnt in zip(*np.unique(cls_train, return_counts=True)):</w:t>
+        <w:br/>
+        <w:t xml:space="preserve">    print("           %-12s: %d" % (cls, cnt))</w:t>
+        <w:br/>
+        <w:t>print("[SPLIT] Test     : %d spectra  (Gr only: 5 per class)" % len(y_test))</w:t>
+        <w:br/>
+        <w:t>for cls, cnt in zip(*np.unique(cls_test, return_counts=True)):</w:t>
+        <w:br/>
+        <w:t xml:space="preserve">    print("           %-12s: %d" % (cls, cnt))</w:t>
+        <w:br/>
+        <w:t>print("[SPLIT] Excluded : %d no-Gr spectra (5 per class, not used)" % len(excl_idx))</w:t>
+        <w:br/>
+        <w:br/>
+        <w:t># =============================================================================</w:t>
+        <w:br/>
+        <w:t># 5.  PRE-PROCESSING  (Savitzky-Golay smooth)</w:t>
+        <w:br/>
+        <w:t># =============================================================================</w:t>
+        <w:br/>
+        <w:t>X_train_sm = savgol_filter(X_train, window_length=SG_WINDOW, polyorder=SG_POLY, axis=1)</w:t>
+        <w:br/>
+        <w:t>X_test_sm  = savgol_filter(X_test,  window_length=SG_WINDOW, polyorder=SG_POLY, axis=1)</w:t>
+        <w:br/>
+        <w:t>print("\n[INFO] SG smoothing applied (window=%d, poly=%d)" % (SG_WINDOW, SG_POLY))</w:t>
+        <w:br/>
+        <w:br/>
+        <w:t># =============================================================================</w:t>
+        <w:br/>
+        <w:t># 6.  VIP HELPER</w:t>
+        <w:br/>
+        <w:t># =============================================================================</w:t>
+        <w:br/>
+        <w:t>def compute_vip(fitted_pls):</w:t>
+        <w:br/>
+        <w:t xml:space="preserve">    T_ = fitted_pls.x_scores_</w:t>
+        <w:br/>
+        <w:t xml:space="preserve">    W_ = fitted_pls.x_weights_</w:t>
+        <w:br/>
+        <w:t xml:space="preserve">    Q_ = fitted_pls.y_loadings_</w:t>
+        <w:br/>
+        <w:t xml:space="preserve">    p  = W_.shape[0]</w:t>
+        <w:br/>
+        <w:t xml:space="preserve">    SS = np.sum(T_**2, axis=0) * np.sum(Q_**2, axis=0)</w:t>
+        <w:br/>
+        <w:t xml:space="preserve">    Wn = W_ / np.linalg.norm(W_, axis=0)</w:t>
+        <w:br/>
+        <w:t xml:space="preserve">    return np.sqrt(p * np.sum(SS * Wn**2, axis=1) / np.sum(SS))</w:t>
+        <w:br/>
+        <w:br/>
+        <w:t># =============================================================================</w:t>
+        <w:br/>
+        <w:t># 7.  VIP SELECTION  (3-LV PLS-DA on TRAINING only — no leakage)</w:t>
+        <w:br/>
+        <w:t># =============================================================================</w:t>
+        <w:br/>
+        <w:t>print("\n[VIP] 3-LV PLS-DA on training -&gt; top-%d VIP ..." % VIP_TOP_N)</w:t>
+        <w:br/>
         <w:br/>
         <w:t>sc_init  = StandardScaler().fit(X_train_sm)</w:t>
         <w:br/>
@@ -1186,62 +1240,6 @@
         <w:t>n_vip_gt1   = int((vip_all &gt; 1).sum())</w:t>
         <w:br/>
         <w:t>top_n       = min(VIP_TOP_N, len(vip_all))</w:t>
-        <w:br/>
-        <w:t>top_idx     = np.argsort(vip_all)[-top_n:]</w:t>
-        <w:br/>
-        <w:t>wn_sel      = wavenumbers[top_idx]</w:t>
-        <w:br/>
-        <w:t>X_train_sel = X_train_sm[:, top_idx]</w:t>
-        <w:br/>
-        <w:t>X_test_sel  = X_test_sm[:,  top_idx]</w:t>
-        <w:br/>
-        <w:br/>
-        <w:t>print("[VIP] VIP &gt; 1 : %d / %d variables" % (n_vip_gt1, len(vip_all)))</w:t>
-        <w:br/>
-        <w:t>print("[VIP] Top-%d selected  (%.1f - %.1f cm-1)" % (</w:t>
-        <w:br/>
-        <w:t xml:space="preserve">    top_n, wn_sel.min(), wn_sel.max()))</w:t>
-        <w:br/>
-        <w:br/>
-        <w:t># =============================================================================</w:t>
-        <w:br/>
-        <w:t># 8.  HELPER CLASSIFIER</w:t>
-        <w:br/>
-        <w:t># =============================================================================</w:t>
-        <w:br/>
-        <w:t>class PLSDAClf(BaseEstimator, ClassifierMixin):</w:t>
-        <w:br/>
-        <w:t xml:space="preserve">    def __init__(self, n_components=3):</w:t>
-        <w:br/>
-        <w:t xml:space="preserve">        self.n_components = n_components</w:t>
-        <w:br/>
-        <w:t xml:space="preserve">    def fit(self, X, y):</w:t>
-        <w:br/>
-        <w:t xml:space="preserve">        self.classes_ = np.unique(y)</w:t>
-        <w:br/>
-        <w:t xml:space="preserve">        Yd = pd.get_dummies(pd.Series(y)).values.astype(float)</w:t>
-        <w:br/>
-        <w:t xml:space="preserve">        self._pls = PLSRegression(n_components=self.n_components,</w:t>
-        <w:br/>
-        <w:t xml:space="preserve">                                  scale=False, max_iter=10000)</w:t>
-        <w:br/>
-        <w:t xml:space="preserve">        self._pls.fit(X, Yd)</w:t>
-        <w:br/>
-        <w:t xml:space="preserve">        return self</w:t>
-        <w:br/>
-        <w:t xml:space="preserve">    def predict(self, X):</w:t>
-        <w:br/>
-        <w:t xml:space="preserve">        return np.argmax(self._pls.predict(X), axis=1)</w:t>
-        <w:br/>
-        <w:t xml:space="preserve">    def transform(self, X):</w:t>
-        <w:br/>
-        <w:t xml:space="preserve">        return self._pls.transform(X)[0]</w:t>
-        <w:br/>
-        <w:br/>
-        <w:t>cv5 = StratifiedKFold(n_splits=5, shuffle=True, random_state=RANDOM_STATE)</w:t>
-        <w:br/>
-        <w:br/>
-        <w:t>sc_final = StandardScaler().fit(X_train_sel)</w:t>
       </w:r>
     </w:p>
     <w:p>
@@ -1254,6 +1252,62 @@
           <w:rFonts w:ascii="Courier New" w:hAnsi="Courier New"/>
           <w:sz w:val="16"/>
         </w:rPr>
+        <w:t>top_idx     = np.argsort(vip_all)[-top_n:]</w:t>
+        <w:br/>
+        <w:t>wn_sel      = wavenumbers[top_idx]</w:t>
+        <w:br/>
+        <w:t>X_train_sel = X_train_sm[:, top_idx]</w:t>
+        <w:br/>
+        <w:t>X_test_sel  = X_test_sm[:,  top_idx]</w:t>
+        <w:br/>
+        <w:br/>
+        <w:t>print("[VIP] VIP &gt; 1 : %d / %d variables" % (n_vip_gt1, len(vip_all)))</w:t>
+        <w:br/>
+        <w:t>print("[VIP] Top-%d selected  (%.1f - %.1f cm-1)" % (</w:t>
+        <w:br/>
+        <w:t xml:space="preserve">    top_n, wn_sel.min(), wn_sel.max()))</w:t>
+        <w:br/>
+        <w:br/>
+        <w:t># =============================================================================</w:t>
+        <w:br/>
+        <w:t># 8.  HELPER CLASSIFIER</w:t>
+        <w:br/>
+        <w:t># =============================================================================</w:t>
+        <w:br/>
+        <w:t>class PLSDAClf(BaseEstimator, ClassifierMixin):</w:t>
+        <w:br/>
+        <w:t xml:space="preserve">    def __init__(self, n_components=3):</w:t>
+        <w:br/>
+        <w:t xml:space="preserve">        self.n_components = n_components</w:t>
+        <w:br/>
+        <w:t xml:space="preserve">    def fit(self, X, y):</w:t>
+        <w:br/>
+        <w:t xml:space="preserve">        self.classes_ = np.unique(y)</w:t>
+        <w:br/>
+        <w:t xml:space="preserve">        Yd = pd.get_dummies(pd.Series(y)).values.astype(float)</w:t>
+        <w:br/>
+        <w:t xml:space="preserve">        self._pls = PLSRegression(n_components=self.n_components,</w:t>
+        <w:br/>
+        <w:t xml:space="preserve">                                  scale=False, max_iter=10000)</w:t>
+        <w:br/>
+        <w:t xml:space="preserve">        self._pls.fit(X, Yd)</w:t>
+        <w:br/>
+        <w:t xml:space="preserve">        return self</w:t>
+        <w:br/>
+        <w:t xml:space="preserve">    def predict(self, X):</w:t>
+        <w:br/>
+        <w:t xml:space="preserve">        return np.argmax(self._pls.predict(X), axis=1)</w:t>
+        <w:br/>
+        <w:t xml:space="preserve">    def transform(self, X):</w:t>
+        <w:br/>
+        <w:t xml:space="preserve">        return self._pls.transform(X)[0]</w:t>
+        <w:br/>
+        <w:br/>
+        <w:t>cv5 = StratifiedKFold(n_splits=5, shuffle=True, random_state=RANDOM_STATE)</w:t>
+        <w:br/>
+        <w:br/>
+        <w:t>sc_final = StandardScaler().fit(X_train_sel)</w:t>
+        <w:br/>
         <w:t>Xtr_fin  = sc_final.transform(X_train_sel)</w:t>
         <w:br/>
         <w:t>Xte_fin  = sc_final.transform(X_test_sel)</w:t>
@@ -1271,61 +1325,6 @@
         <w:t>Yd_fin    = pd.get_dummies(pd.Series(y_train)).values.astype(float)</w:t>
         <w:br/>
         <w:t>pls_final = PLSRegression(n_components=N_COMPONENTS, scale=False, max_iter=10000)</w:t>
-        <w:br/>
-        <w:t>pls_final.fit(Xtr_fin, Yd_fin)</w:t>
-        <w:br/>
-        <w:br/>
-        <w:t>T_train = pls_final.x_scores_           # (60, N_COMPONENTS)</w:t>
-        <w:br/>
-        <w:t>T_test  = pls_final.transform(Xte_fin)  # (20, N_COMPONENTS)</w:t>
-        <w:br/>
-        <w:t>P_load  = pls_final.x_loadings_         # (top_n, N_COMPONENTS)</w:t>
-        <w:br/>
-        <w:br/>
-        <w:t># R2X cumulative</w:t>
-        <w:br/>
-        <w:t>SS_tot  = np.sum(Xtr_fin ** 2)</w:t>
-        <w:br/>
-        <w:t>r2x_cum = []</w:t>
-        <w:br/>
-        <w:t>for lv in range(1, N_COMPONENTS + 1):</w:t>
-        <w:br/>
-        <w:t xml:space="preserve">    Xrec = pls_final.x_scores_[:, :lv] @ pls_final.x_loadings_[:, :lv].T</w:t>
-        <w:br/>
-        <w:t xml:space="preserve">    r2x_cum.append(1 - np.sum((Xtr_fin - Xrec) ** 2) / SS_tot)</w:t>
-        <w:br/>
-        <w:t>print("[PLS-DA] R2X cumulative : " + "  ".join(</w:t>
-        <w:br/>
-        <w:t xml:space="preserve">    ["LV%d=%.1f%%" % (i+1, r*100) for i, r in enumerate(r2x_cum)]))</w:t>
-        <w:br/>
-        <w:br/>
-        <w:t>train_acc_resub = accuracy_score(y_train, np.argmax(pls_final.predict(Xtr_fin), axis=1))</w:t>
-        <w:br/>
-        <w:t>print("[PLS-DA] Training re-sub accuracy : %.1f%%" % (train_acc_resub * 100))</w:t>
-        <w:br/>
-        <w:br/>
-        <w:t># 5-fold CV</w:t>
-        <w:br/>
-        <w:t>clf_pipe_pls = Pipeline([('sc', StandardScaler()), ('plsda', PLSDAClf(N_COMPONENTS))])</w:t>
-        <w:br/>
-        <w:t>print("[PLS-DA] 5-fold CV on training set ...")</w:t>
-        <w:br/>
-        <w:t>y_pls_cv   = cross_val_predict(clf_pipe_pls, X_train_sel, y_train, cv=cv5)</w:t>
-        <w:br/>
-        <w:t>acc_pls_cv = accuracy_score(y_train, y_pls_cv)</w:t>
-        <w:br/>
-        <w:t>cm_pls_cv  = confusion_matrix(y_train, y_pls_cv)</w:t>
-        <w:br/>
-        <w:t>print("[PLS-DA] 5-fold CV accuracy : %.1f%%" % (acc_pls_cv * 100))</w:t>
-        <w:br/>
-        <w:br/>
-        <w:t># External test</w:t>
-        <w:br/>
-        <w:t>y_pls_test   = np.argmax(pls_final.predict(Xte_fin), axis=1)</w:t>
-        <w:br/>
-        <w:t>acc_pls_test = accuracy_score(y_test, y_pls_test)</w:t>
-        <w:br/>
-        <w:t>cm_pls_test  = confusion_matrix(y_test, y_pls_test)</w:t>
       </w:r>
     </w:p>
     <w:p>
@@ -1338,6 +1337,61 @@
           <w:rFonts w:ascii="Courier New" w:hAnsi="Courier New"/>
           <w:sz w:val="16"/>
         </w:rPr>
+        <w:t>pls_final.fit(Xtr_fin, Yd_fin)</w:t>
+        <w:br/>
+        <w:br/>
+        <w:t>T_train = pls_final.x_scores_           # (60, N_COMPONENTS)</w:t>
+        <w:br/>
+        <w:t>T_test  = pls_final.transform(Xte_fin)  # (20, N_COMPONENTS)</w:t>
+        <w:br/>
+        <w:t>P_load  = pls_final.x_loadings_         # (top_n, N_COMPONENTS)</w:t>
+        <w:br/>
+        <w:br/>
+        <w:t># R2X cumulative</w:t>
+        <w:br/>
+        <w:t>SS_tot  = np.sum(Xtr_fin ** 2)</w:t>
+        <w:br/>
+        <w:t>r2x_cum = []</w:t>
+        <w:br/>
+        <w:t>for lv in range(1, N_COMPONENTS + 1):</w:t>
+        <w:br/>
+        <w:t xml:space="preserve">    Xrec = pls_final.x_scores_[:, :lv] @ pls_final.x_loadings_[:, :lv].T</w:t>
+        <w:br/>
+        <w:t xml:space="preserve">    r2x_cum.append(1 - np.sum((Xtr_fin - Xrec) ** 2) / SS_tot)</w:t>
+        <w:br/>
+        <w:t>print("[PLS-DA] R2X cumulative : " + "  ".join(</w:t>
+        <w:br/>
+        <w:t xml:space="preserve">    ["LV%d=%.1f%%" % (i+1, r*100) for i, r in enumerate(r2x_cum)]))</w:t>
+        <w:br/>
+        <w:br/>
+        <w:t>train_acc_resub = accuracy_score(y_train, np.argmax(pls_final.predict(Xtr_fin), axis=1))</w:t>
+        <w:br/>
+        <w:t>print("[PLS-DA] Training re-sub accuracy : %.1f%%" % (train_acc_resub * 100))</w:t>
+        <w:br/>
+        <w:br/>
+        <w:t># 5-fold CV</w:t>
+        <w:br/>
+        <w:t>clf_pipe_pls = Pipeline([('sc', StandardScaler()), ('plsda', PLSDAClf(N_COMPONENTS))])</w:t>
+        <w:br/>
+        <w:t>print("[PLS-DA] 5-fold CV on training set ...")</w:t>
+        <w:br/>
+        <w:t>y_pls_cv   = cross_val_predict(clf_pipe_pls, X_train_sel, y_train, cv=cv5)</w:t>
+        <w:br/>
+        <w:t>acc_pls_cv = accuracy_score(y_train, y_pls_cv)</w:t>
+        <w:br/>
+        <w:t>cm_pls_cv  = confusion_matrix(y_train, y_pls_cv)</w:t>
+        <w:br/>
+        <w:t>print("[PLS-DA] 5-fold CV accuracy : %.1f%%" % (acc_pls_cv * 100))</w:t>
+        <w:br/>
+        <w:br/>
+        <w:t># External test</w:t>
+        <w:br/>
+        <w:t>y_pls_test   = np.argmax(pls_final.predict(Xte_fin), axis=1)</w:t>
+        <w:br/>
+        <w:t>acc_pls_test = accuracy_score(y_test, y_pls_test)</w:t>
+        <w:br/>
+        <w:t>cm_pls_test  = confusion_matrix(y_test, y_pls_test)</w:t>
+        <w:br/>
         <w:t>print("[PLS-DA] External test accuracy : %.1f%%" % (acc_pls_test * 100))</w:t>
         <w:br/>
         <w:br/>
@@ -1356,62 +1410,6 @@
         <w:t xml:space="preserve">    random_state=RANDOM_STATE, n_jobs=-1)</w:t>
         <w:br/>
         <w:t>print("[PLS-DA] Observed : %.2f%%   p = %.4f  [%s]" % (</w:t>
-        <w:br/>
-        <w:t xml:space="preserve">    obs_score * 100, p_val,</w:t>
-        <w:br/>
-        <w:t xml:space="preserve">    'SIGNIFICANT (p&lt;0.05)' if p_val &lt; 0.05 else 'NOT significant'))</w:t>
-        <w:br/>
-        <w:br/>
-        <w:t># =============================================================================</w:t>
-        <w:br/>
-        <w:t># 10. SVM-RBF BINARY</w:t>
-        <w:br/>
-        <w:t># =============================================================================</w:t>
-        <w:br/>
-        <w:t>svm_pipe = Pipeline([</w:t>
-        <w:br/>
-        <w:t xml:space="preserve">    ('sc',  StandardScaler()),</w:t>
-        <w:br/>
-        <w:t xml:space="preserve">    ('svm', SVC(kernel='rbf', C=10, gamma='scale',</w:t>
-        <w:br/>
-        <w:t xml:space="preserve">                probability=True, random_state=RANDOM_STATE))</w:t>
-        <w:br/>
-        <w:t>])</w:t>
-        <w:br/>
-        <w:br/>
-        <w:t>print("\n[SVM-RBF] 5-fold CV on training set ...")</w:t>
-        <w:br/>
-        <w:t>y_svm_cv   = cross_val_predict(svm_pipe, X_train_sel, y_train, cv=cv5)</w:t>
-        <w:br/>
-        <w:t>acc_svm_cv = accuracy_score(y_train, y_svm_cv)</w:t>
-        <w:br/>
-        <w:t>cm_svm_cv  = confusion_matrix(y_train, y_svm_cv)</w:t>
-        <w:br/>
-        <w:t>print("[SVM-RBF] 5-fold CV accuracy : %.1f%%" % (acc_svm_cv * 100))</w:t>
-        <w:br/>
-        <w:br/>
-        <w:t>svm_pipe.fit(X_train_sel, y_train)</w:t>
-        <w:br/>
-        <w:t>y_svm_test   = svm_pipe.predict(X_test_sel)</w:t>
-        <w:br/>
-        <w:t>acc_svm_test = accuracy_score(y_test, y_svm_test)</w:t>
-        <w:br/>
-        <w:t>cm_svm_test  = confusion_matrix(y_test, y_svm_test)</w:t>
-        <w:br/>
-        <w:t>print("[SVM-RBF] External test accuracy : %.1f%%" % (acc_svm_test * 100))</w:t>
-        <w:br/>
-        <w:br/>
-        <w:t># =============================================================================</w:t>
-        <w:br/>
-        <w:t># 11. PCA FOR CLUSTER VISUALISATION  (fit on TRAIN only)</w:t>
-        <w:br/>
-        <w:t># =============================================================================</w:t>
-        <w:br/>
-        <w:t>pca_viz = PCA(n_components=2, random_state=RANDOM_STATE)</w:t>
-        <w:br/>
-        <w:t>sc_viz  = StandardScaler().fit(X_train_sel)</w:t>
-        <w:br/>
-        <w:t>pca_viz.fit(sc_viz.transform(X_train_sel))</w:t>
       </w:r>
     </w:p>
     <w:p>
@@ -1424,6 +1422,62 @@
           <w:rFonts w:ascii="Courier New" w:hAnsi="Courier New"/>
           <w:sz w:val="16"/>
         </w:rPr>
+        <w:t xml:space="preserve">    obs_score * 100, p_val,</w:t>
+        <w:br/>
+        <w:t xml:space="preserve">    'SIGNIFICANT (p&lt;0.05)' if p_val &lt; 0.05 else 'NOT significant'))</w:t>
+        <w:br/>
+        <w:br/>
+        <w:t># =============================================================================</w:t>
+        <w:br/>
+        <w:t># 10. SVM-RBF BINARY</w:t>
+        <w:br/>
+        <w:t># =============================================================================</w:t>
+        <w:br/>
+        <w:t>svm_pipe = Pipeline([</w:t>
+        <w:br/>
+        <w:t xml:space="preserve">    ('sc',  StandardScaler()),</w:t>
+        <w:br/>
+        <w:t xml:space="preserve">    ('svm', SVC(kernel='rbf', C=10, gamma='scale',</w:t>
+        <w:br/>
+        <w:t xml:space="preserve">                probability=True, random_state=RANDOM_STATE))</w:t>
+        <w:br/>
+        <w:t>])</w:t>
+        <w:br/>
+        <w:br/>
+        <w:t>print("\n[SVM-RBF] 5-fold CV on training set ...")</w:t>
+        <w:br/>
+        <w:t>y_svm_cv   = cross_val_predict(svm_pipe, X_train_sel, y_train, cv=cv5)</w:t>
+        <w:br/>
+        <w:t>acc_svm_cv = accuracy_score(y_train, y_svm_cv)</w:t>
+        <w:br/>
+        <w:t>cm_svm_cv  = confusion_matrix(y_train, y_svm_cv)</w:t>
+        <w:br/>
+        <w:t>print("[SVM-RBF] 5-fold CV accuracy : %.1f%%" % (acc_svm_cv * 100))</w:t>
+        <w:br/>
+        <w:br/>
+        <w:t>svm_pipe.fit(X_train_sel, y_train)</w:t>
+        <w:br/>
+        <w:t>y_svm_test   = svm_pipe.predict(X_test_sel)</w:t>
+        <w:br/>
+        <w:t>acc_svm_test = accuracy_score(y_test, y_svm_test)</w:t>
+        <w:br/>
+        <w:t>cm_svm_test  = confusion_matrix(y_test, y_svm_test)</w:t>
+        <w:br/>
+        <w:t>print("[SVM-RBF] External test accuracy : %.1f%%" % (acc_svm_test * 100))</w:t>
+        <w:br/>
+        <w:br/>
+        <w:t># =============================================================================</w:t>
+        <w:br/>
+        <w:t># 11. PCA FOR CLUSTER VISUALISATION  (fit on TRAIN only)</w:t>
+        <w:br/>
+        <w:t># =============================================================================</w:t>
+        <w:br/>
+        <w:t>pca_viz = PCA(n_components=2, random_state=RANDOM_STATE)</w:t>
+        <w:br/>
+        <w:t>sc_viz  = StandardScaler().fit(X_train_sel)</w:t>
+        <w:br/>
+        <w:t>pca_viz.fit(sc_viz.transform(X_train_sel))</w:t>
+        <w:br/>
         <w:t>Z_train = pca_viz.transform(sc_viz.transform(X_train_sel))</w:t>
         <w:br/>
         <w:t>Z_test  = pca_viz.transform(sc_viz.transform(X_test_sel))</w:t>
@@ -1442,62 +1496,6 @@
         <w:t># =============================================================================</w:t>
         <w:br/>
         <w:t>PALETTE = {</w:t>
-        <w:br/>
-        <w:t xml:space="preserve">    'PDMS'    : '#1f77b4',   # blue</w:t>
-        <w:br/>
-        <w:t xml:space="preserve">    'SiO2/Si' : '#d62728',   # red</w:t>
-        <w:br/>
-        <w:t>}</w:t>
-        <w:br/>
-        <w:t>MARKER_TR = {</w:t>
-        <w:br/>
-        <w:t xml:space="preserve">    'PDMS'    : 'o',</w:t>
-        <w:br/>
-        <w:t xml:space="preserve">    'SiO2/Si' : 's',</w:t>
-        <w:br/>
-        <w:t>}</w:t>
-        <w:br/>
-        <w:t>CLASS_LABELS = le.classes_    # ['PDMS', 'SiO2/Si']</w:t>
-        <w:br/>
-        <w:br/>
-        <w:t>TITLE_SUF = "VIP-top-%d | %d LVs | %d-%d cm⁻¹" % (</w:t>
-        <w:br/>
-        <w:t xml:space="preserve">    top_n, N_COMPONENTS, WAVENUMBER_MIN, WAVENUMBER_MAX)</w:t>
-        <w:br/>
-        <w:br/>
-        <w:t>def lv_var(i):</w:t>
-        <w:br/>
-        <w:t xml:space="preserve">    return (r2x_cum[i] - (r2x_cum[i-1] if i &gt; 0 else 0)) * 100</w:t>
-        <w:br/>
-        <w:br/>
-        <w:t>def save_fig(fig, fname):</w:t>
-        <w:br/>
-        <w:t xml:space="preserve">    fig.savefig(os.path.join(OUTPUT_DIR, fname), dpi=150, bbox_inches='tight')</w:t>
-        <w:br/>
-        <w:t xml:space="preserve">    plt.close(fig)</w:t>
-        <w:br/>
-        <w:t xml:space="preserve">    print('[SAVED] %s' % fname)</w:t>
-        <w:br/>
-        <w:br/>
-        <w:t># =============================================================================</w:t>
-        <w:br/>
-        <w:t># HELPER: Per-class Accuracy and Recall</w:t>
-        <w:br/>
-        <w:t>#   Accuracy_i = (TP_i + TN_i) / N_total</w:t>
-        <w:br/>
-        <w:t>#   Recall_i   = TP_i  / (TP_i + FN_i)</w:t>
-        <w:br/>
-        <w:t># =============================================================================</w:t>
-        <w:br/>
-        <w:t>def per_class_metrics(cm):</w:t>
-        <w:br/>
-        <w:t xml:space="preserve">    N = cm.sum()</w:t>
-        <w:br/>
-        <w:t xml:space="preserve">    acc_list, rec_list = [], []</w:t>
-        <w:br/>
-        <w:t xml:space="preserve">    for i in range(len(cm)):</w:t>
-        <w:br/>
-        <w:t xml:space="preserve">        TP = cm[i, i]</w:t>
       </w:r>
     </w:p>
     <w:p>
@@ -1510,6 +1508,62 @@
           <w:rFonts w:ascii="Courier New" w:hAnsi="Courier New"/>
           <w:sz w:val="16"/>
         </w:rPr>
+        <w:t xml:space="preserve">    'PDMS'    : '#1f77b4',   # blue</w:t>
+        <w:br/>
+        <w:t xml:space="preserve">    'SiO2/Si' : '#d62728',   # red</w:t>
+        <w:br/>
+        <w:t>}</w:t>
+        <w:br/>
+        <w:t>MARKER_TR = {</w:t>
+        <w:br/>
+        <w:t xml:space="preserve">    'PDMS'    : 'o',</w:t>
+        <w:br/>
+        <w:t xml:space="preserve">    'SiO2/Si' : 's',</w:t>
+        <w:br/>
+        <w:t>}</w:t>
+        <w:br/>
+        <w:t>CLASS_LABELS = le.classes_    # ['PDMS', 'SiO2/Si']</w:t>
+        <w:br/>
+        <w:br/>
+        <w:t>TITLE_SUF = "VIP-top-%d | %d LVs | %d-%d cm⁻¹" % (</w:t>
+        <w:br/>
+        <w:t xml:space="preserve">    top_n, N_COMPONENTS, WAVENUMBER_MIN, WAVENUMBER_MAX)</w:t>
+        <w:br/>
+        <w:br/>
+        <w:t>def lv_var(i):</w:t>
+        <w:br/>
+        <w:t xml:space="preserve">    return (r2x_cum[i] - (r2x_cum[i-1] if i &gt; 0 else 0)) * 100</w:t>
+        <w:br/>
+        <w:br/>
+        <w:t>def save_fig(fig, fname):</w:t>
+        <w:br/>
+        <w:t xml:space="preserve">    fig.savefig(os.path.join(OUTPUT_DIR, fname), dpi=150, bbox_inches='tight')</w:t>
+        <w:br/>
+        <w:t xml:space="preserve">    plt.close(fig)</w:t>
+        <w:br/>
+        <w:t xml:space="preserve">    print('[SAVED] %s' % fname)</w:t>
+        <w:br/>
+        <w:br/>
+        <w:t># =============================================================================</w:t>
+        <w:br/>
+        <w:t># HELPER: Per-class Accuracy and Recall</w:t>
+        <w:br/>
+        <w:t>#   Accuracy_i = (TP_i + TN_i) / N_total</w:t>
+        <w:br/>
+        <w:t>#   Recall_i   = TP_i  / (TP_i + FN_i)</w:t>
+        <w:br/>
+        <w:t># =============================================================================</w:t>
+        <w:br/>
+        <w:t>def per_class_metrics(cm):</w:t>
+        <w:br/>
+        <w:t xml:space="preserve">    N = cm.sum()</w:t>
+        <w:br/>
+        <w:t xml:space="preserve">    acc_list, rec_list = [], []</w:t>
+        <w:br/>
+        <w:t xml:space="preserve">    for i in range(len(cm)):</w:t>
+        <w:br/>
+        <w:t xml:space="preserve">        TP = cm[i, i]</w:t>
+        <w:br/>
         <w:t xml:space="preserve">        FP = cm[:, i].sum() - TP</w:t>
         <w:br/>
         <w:t xml:space="preserve">        FN = cm[i, :].sum() - TP</w:t>
@@ -1528,63 +1582,6 @@
         <w:t># =============================================================================</w:t>
         <w:br/>
         <w:t># HELPER: Confusion matrix figure with per-class stats table (GridSpec)</w:t>
-        <w:br/>
-        <w:t># =============================================================================</w:t>
-        <w:br/>
-        <w:t>def plot_confusion_with_stats(cm, labels, title, fname, cmap, overall_acc):</w:t>
-        <w:br/>
-        <w:t xml:space="preserve">    acc_list, rec_list = per_class_metrics(cm)</w:t>
-        <w:br/>
-        <w:t xml:space="preserve">    short = [l for l in labels]    # already short for binary</w:t>
-        <w:br/>
-        <w:br/>
-        <w:t xml:space="preserve">    fig = plt.figure(figsize=(7, 8))</w:t>
-        <w:br/>
-        <w:t xml:space="preserve">    gs  = GridSpec(2, 1, figure=fig, height_ratios=[3, 0.9], hspace=0.45)</w:t>
-        <w:br/>
-        <w:t xml:space="preserve">    ax_cm  = fig.add_subplot(gs[0])</w:t>
-        <w:br/>
-        <w:t xml:space="preserve">    ax_tbl = fig.add_subplot(gs[1])</w:t>
-        <w:br/>
-        <w:br/>
-        <w:t xml:space="preserve">    ConfusionMatrixDisplay(cm, display_labels=labels).plot(</w:t>
-        <w:br/>
-        <w:t xml:space="preserve">        ax=ax_cm, colorbar=False, cmap=cmap, xticks_rotation=15)</w:t>
-        <w:br/>
-        <w:t xml:space="preserve">    ax_cm.set_title('%s\nOverall Accuracy = %.1f%%' % (title, overall_acc * 100),</w:t>
-        <w:br/>
-        <w:t xml:space="preserve">                    fontsize=11, fontweight='bold')</w:t>
-        <w:br/>
-        <w:br/>
-        <w:t xml:space="preserve">    ax_tbl.axis('off')</w:t>
-        <w:br/>
-        <w:t xml:space="preserve">    col_labels = ['Class', 'Accuracy (%)', 'Recall (%)']</w:t>
-        <w:br/>
-        <w:t xml:space="preserve">    table_data = [[short[i], '%.1f' % acc_list[i], '%.1f' % rec_list[i]]</w:t>
-        <w:br/>
-        <w:t xml:space="preserve">                  for i in range(len(labels))]</w:t>
-        <w:br/>
-        <w:t xml:space="preserve">    tbl = ax_tbl.table(cellText=table_data, colLabels=col_labels,</w:t>
-        <w:br/>
-        <w:t xml:space="preserve">                       loc='center', cellLoc='center')</w:t>
-        <w:br/>
-        <w:t xml:space="preserve">    tbl.auto_set_font_size(False)</w:t>
-        <w:br/>
-        <w:t xml:space="preserve">    tbl.set_fontsize(10)</w:t>
-        <w:br/>
-        <w:t xml:space="preserve">    tbl.scale(1, 2.0)</w:t>
-        <w:br/>
-        <w:t xml:space="preserve">    for j in range(3):</w:t>
-        <w:br/>
-        <w:t xml:space="preserve">        tbl[0, j].set_facecolor('#404040')</w:t>
-        <w:br/>
-        <w:t xml:space="preserve">        tbl[0, j].set_text_props(color='white', fontweight='bold')</w:t>
-        <w:br/>
-        <w:t xml:space="preserve">    for i, cls in enumerate(labels):</w:t>
-        <w:br/>
-        <w:t xml:space="preserve">        tbl[i+1, 0].set_facecolor(PALETTE.get(cls, '#cccccc'))</w:t>
-        <w:br/>
-        <w:t xml:space="preserve">        tbl[i+1, 0].set_text_props(color='white', fontweight='bold')</w:t>
       </w:r>
     </w:p>
     <w:p>
@@ -1597,6 +1594,63 @@
           <w:rFonts w:ascii="Courier New" w:hAnsi="Courier New"/>
           <w:sz w:val="16"/>
         </w:rPr>
+        <w:t># =============================================================================</w:t>
+        <w:br/>
+        <w:t>def plot_confusion_with_stats(cm, labels, title, fname, cmap, overall_acc):</w:t>
+        <w:br/>
+        <w:t xml:space="preserve">    acc_list, rec_list = per_class_metrics(cm)</w:t>
+        <w:br/>
+        <w:t xml:space="preserve">    short = [l for l in labels]    # already short for binary</w:t>
+        <w:br/>
+        <w:br/>
+        <w:t xml:space="preserve">    fig = plt.figure(figsize=(7, 8))</w:t>
+        <w:br/>
+        <w:t xml:space="preserve">    gs  = GridSpec(2, 1, figure=fig, height_ratios=[3, 0.9], hspace=0.45)</w:t>
+        <w:br/>
+        <w:t xml:space="preserve">    ax_cm  = fig.add_subplot(gs[0])</w:t>
+        <w:br/>
+        <w:t xml:space="preserve">    ax_tbl = fig.add_subplot(gs[1])</w:t>
+        <w:br/>
+        <w:br/>
+        <w:t xml:space="preserve">    ConfusionMatrixDisplay(cm, display_labels=labels).plot(</w:t>
+        <w:br/>
+        <w:t xml:space="preserve">        ax=ax_cm, colorbar=False, cmap=cmap, xticks_rotation=15)</w:t>
+        <w:br/>
+        <w:t xml:space="preserve">    ax_cm.set_title('%s\nOverall Accuracy = %.1f%%' % (title, overall_acc * 100),</w:t>
+        <w:br/>
+        <w:t xml:space="preserve">                    fontsize=11, fontweight='bold')</w:t>
+        <w:br/>
+        <w:br/>
+        <w:t xml:space="preserve">    ax_tbl.axis('off')</w:t>
+        <w:br/>
+        <w:t xml:space="preserve">    col_labels = ['Class', 'Accuracy (%)', 'Recall (%)']</w:t>
+        <w:br/>
+        <w:t xml:space="preserve">    table_data = [[short[i], '%.1f' % acc_list[i], '%.1f' % rec_list[i]]</w:t>
+        <w:br/>
+        <w:t xml:space="preserve">                  for i in range(len(labels))]</w:t>
+        <w:br/>
+        <w:t xml:space="preserve">    tbl = ax_tbl.table(cellText=table_data, colLabels=col_labels,</w:t>
+        <w:br/>
+        <w:t xml:space="preserve">                       loc='center', cellLoc='center')</w:t>
+        <w:br/>
+        <w:t xml:space="preserve">    tbl.auto_set_font_size(False)</w:t>
+        <w:br/>
+        <w:t xml:space="preserve">    tbl.set_fontsize(10)</w:t>
+        <w:br/>
+        <w:t xml:space="preserve">    tbl.scale(1, 2.0)</w:t>
+        <w:br/>
+        <w:t xml:space="preserve">    for j in range(3):</w:t>
+        <w:br/>
+        <w:t xml:space="preserve">        tbl[0, j].set_facecolor('#404040')</w:t>
+        <w:br/>
+        <w:t xml:space="preserve">        tbl[0, j].set_text_props(color='white', fontweight='bold')</w:t>
+        <w:br/>
+        <w:t xml:space="preserve">    for i, cls in enumerate(labels):</w:t>
+        <w:br/>
+        <w:t xml:space="preserve">        tbl[i+1, 0].set_facecolor(PALETTE.get(cls, '#cccccc'))</w:t>
+        <w:br/>
+        <w:t xml:space="preserve">        tbl[i+1, 0].set_text_props(color='white', fontweight='bold')</w:t>
+        <w:br/>
         <w:t xml:space="preserve">        tbl[i+1, 1].set_facecolor('#f0f4ff')</w:t>
         <w:br/>
         <w:t xml:space="preserve">        tbl[i+1, 2].set_facecolor('#fff4f0')</w:t>
@@ -1615,65 +1669,6 @@
         <w:t xml:space="preserve">    acc_m, rec_m = per_class_metrics(cm_main)</w:t>
         <w:br/>
         <w:t xml:space="preserve">    lines = [label_main,</w:t>
-        <w:br/>
-        <w:t xml:space="preserve">             '%-10s  %5s  %6s' % ('Class', 'Acc', 'Recall'),</w:t>
-        <w:br/>
-        <w:t xml:space="preserve">             '-' * 26]</w:t>
-        <w:br/>
-        <w:t xml:space="preserve">    for i, cls in enumerate(CLASS_LABELS):</w:t>
-        <w:br/>
-        <w:t xml:space="preserve">        lines.append('%-10s  %4.1f%%  %5.1f%%' % (cls, acc_m[i], rec_m[i]))</w:t>
-        <w:br/>
-        <w:t xml:space="preserve">    if cm_sec is not None:</w:t>
-        <w:br/>
-        <w:t xml:space="preserve">        acc_s, rec_s = per_class_metrics(cm_sec)</w:t>
-        <w:br/>
-        <w:t xml:space="preserve">        lines += ['', label_sec,</w:t>
-        <w:br/>
-        <w:t xml:space="preserve">                  '%-10s  %5s  %6s' % ('Class', 'Acc', 'Recall'),</w:t>
-        <w:br/>
-        <w:t xml:space="preserve">                  '-' * 26]</w:t>
-        <w:br/>
-        <w:t xml:space="preserve">        for i, cls in enumerate(CLASS_LABELS):</w:t>
-        <w:br/>
-        <w:t xml:space="preserve">            lines.append('%-10s  %4.1f%%  %5.1f%%' % (cls, acc_s[i], rec_s[i]))</w:t>
-        <w:br/>
-        <w:t xml:space="preserve">    ax.text(0.02, 0.02, '\n'.join(lines), transform=ax.transAxes,</w:t>
-        <w:br/>
-        <w:t xml:space="preserve">            fontsize=7.5, verticalalignment='bottom', fontfamily='monospace',</w:t>
-        <w:br/>
-        <w:t xml:space="preserve">            bbox=dict(boxstyle='round,pad=0.4', facecolor='white',</w:t>
-        <w:br/>
-        <w:t xml:space="preserve">                      alpha=0.90, edgecolor='#888888'))</w:t>
-        <w:br/>
-        <w:br/>
-        <w:t># =============================================================================</w:t>
-        <w:br/>
-        <w:t># 13. PLS-DA SCORE PLOTS  (LV space, train + test)</w:t>
-        <w:br/>
-        <w:t># =============================================================================</w:t>
-        <w:br/>
-        <w:t>def scatter_lv(ax, lv_x, lv_y, xlabel, ylabel, title):</w:t>
-        <w:br/>
-        <w:t xml:space="preserve">    for cls in CLASS_LABELS:</w:t>
-        <w:br/>
-        <w:t xml:space="preserve">        idx_tr = cls_train == cls</w:t>
-        <w:br/>
-        <w:t xml:space="preserve">        idx_te = cls_test  == cls</w:t>
-        <w:br/>
-        <w:t xml:space="preserve">        ax.scatter(T_train[idx_tr, lv_x], T_train[idx_tr, lv_y],</w:t>
-        <w:br/>
-        <w:t xml:space="preserve">                   c=PALETTE[cls], marker=MARKER_TR[cls], s=75,</w:t>
-        <w:br/>
-        <w:t xml:space="preserve">                   edgecolors='k', linewidths=0.6, alpha=0.80,</w:t>
-        <w:br/>
-        <w:t xml:space="preserve">                   label='%s (train)' % cls, zorder=3)</w:t>
-        <w:br/>
-        <w:t xml:space="preserve">        ax.scatter(T_test[idx_te, lv_x], T_test[idx_te, lv_y],</w:t>
-        <w:br/>
-        <w:t xml:space="preserve">                   c=PALETTE[cls], marker='*', s=300,</w:t>
-        <w:br/>
-        <w:t xml:space="preserve">                   edgecolors='k', linewidths=1.0, alpha=1.00,</w:t>
       </w:r>
     </w:p>
     <w:p>
@@ -1686,6 +1681,65 @@
           <w:rFonts w:ascii="Courier New" w:hAnsi="Courier New"/>
           <w:sz w:val="16"/>
         </w:rPr>
+        <w:t xml:space="preserve">             '%-10s  %5s  %6s' % ('Class', 'Acc', 'Recall'),</w:t>
+        <w:br/>
+        <w:t xml:space="preserve">             '-' * 26]</w:t>
+        <w:br/>
+        <w:t xml:space="preserve">    for i, cls in enumerate(CLASS_LABELS):</w:t>
+        <w:br/>
+        <w:t xml:space="preserve">        lines.append('%-10s  %4.1f%%  %5.1f%%' % (cls, acc_m[i], rec_m[i]))</w:t>
+        <w:br/>
+        <w:t xml:space="preserve">    if cm_sec is not None:</w:t>
+        <w:br/>
+        <w:t xml:space="preserve">        acc_s, rec_s = per_class_metrics(cm_sec)</w:t>
+        <w:br/>
+        <w:t xml:space="preserve">        lines += ['', label_sec,</w:t>
+        <w:br/>
+        <w:t xml:space="preserve">                  '%-10s  %5s  %6s' % ('Class', 'Acc', 'Recall'),</w:t>
+        <w:br/>
+        <w:t xml:space="preserve">                  '-' * 26]</w:t>
+        <w:br/>
+        <w:t xml:space="preserve">        for i, cls in enumerate(CLASS_LABELS):</w:t>
+        <w:br/>
+        <w:t xml:space="preserve">            lines.append('%-10s  %4.1f%%  %5.1f%%' % (cls, acc_s[i], rec_s[i]))</w:t>
+        <w:br/>
+        <w:t xml:space="preserve">    ax.text(0.02, 0.02, '\n'.join(lines), transform=ax.transAxes,</w:t>
+        <w:br/>
+        <w:t xml:space="preserve">            fontsize=7.5, verticalalignment='bottom', fontfamily='monospace',</w:t>
+        <w:br/>
+        <w:t xml:space="preserve">            bbox=dict(boxstyle='round,pad=0.4', facecolor='white',</w:t>
+        <w:br/>
+        <w:t xml:space="preserve">                      alpha=0.90, edgecolor='#888888'))</w:t>
+        <w:br/>
+        <w:br/>
+        <w:t># =============================================================================</w:t>
+        <w:br/>
+        <w:t># 13. PLS-DA SCORE PLOTS  (LV space, train + test)</w:t>
+        <w:br/>
+        <w:t># =============================================================================</w:t>
+        <w:br/>
+        <w:t>def scatter_lv(ax, lv_x, lv_y, xlabel, ylabel, title):</w:t>
+        <w:br/>
+        <w:t xml:space="preserve">    for cls in CLASS_LABELS:</w:t>
+        <w:br/>
+        <w:t xml:space="preserve">        idx_tr = cls_train == cls</w:t>
+        <w:br/>
+        <w:t xml:space="preserve">        idx_te = cls_test  == cls</w:t>
+        <w:br/>
+        <w:t xml:space="preserve">        ax.scatter(T_train[idx_tr, lv_x], T_train[idx_tr, lv_y],</w:t>
+        <w:br/>
+        <w:t xml:space="preserve">                   c=PALETTE[cls], marker=MARKER_TR[cls], s=75,</w:t>
+        <w:br/>
+        <w:t xml:space="preserve">                   edgecolors='k', linewidths=0.6, alpha=0.80,</w:t>
+        <w:br/>
+        <w:t xml:space="preserve">                   label='%s (train)' % cls, zorder=3)</w:t>
+        <w:br/>
+        <w:t xml:space="preserve">        ax.scatter(T_test[idx_te, lv_x], T_test[idx_te, lv_y],</w:t>
+        <w:br/>
+        <w:t xml:space="preserve">                   c=PALETTE[cls], marker='*', s=300,</w:t>
+        <w:br/>
+        <w:t xml:space="preserve">                   edgecolors='k', linewidths=1.0, alpha=1.00,</w:t>
+        <w:br/>
         <w:t xml:space="preserve">                   label='%s (test)' % cls, zorder=5)</w:t>
         <w:br/>
         <w:t xml:space="preserve">    ax.axhline(0, color='grey', lw=0.7, ls='--')</w:t>
@@ -1704,64 +1758,6 @@
         <w:t># Fig 01 — LV1 vs LV2</w:t>
         <w:br/>
         <w:t>fig, ax = plt.subplots(figsize=(8, 6))</w:t>
-        <w:br/>
-        <w:t>scatter_lv(ax, 0, 1,</w:t>
-        <w:br/>
-        <w:t xml:space="preserve">    'LV1 (%.1f%% var.)' % lv_var(0),</w:t>
-        <w:br/>
-        <w:t xml:space="preserve">    'LV2 (%.1f%% var.)' % lv_var(1),</w:t>
-        <w:br/>
-        <w:t xml:space="preserve">    'PLS-DA Scores  LV1 vs LV2  |  ' + TITLE_SUF +</w:t>
-        <w:br/>
-        <w:t xml:space="preserve">    '\nFilled = train  |  Stars = test')</w:t>
-        <w:br/>
-        <w:t>fig.tight_layout()</w:t>
-        <w:br/>
-        <w:t>save_fig(fig, '01_PLSDA_Scores_LV1_LV2.png')</w:t>
-        <w:br/>
-        <w:br/>
-        <w:t># Fig 02 — LV1 vs LV3</w:t>
-        <w:br/>
-        <w:t>fig, ax = plt.subplots(figsize=(8, 6))</w:t>
-        <w:br/>
-        <w:t>scatter_lv(ax, 0, 2,</w:t>
-        <w:br/>
-        <w:t xml:space="preserve">    'LV1 (%.1f%% var.)' % lv_var(0),</w:t>
-        <w:br/>
-        <w:t xml:space="preserve">    'LV3 (%.1f%% var.)' % lv_var(2),</w:t>
-        <w:br/>
-        <w:t xml:space="preserve">    'PLS-DA Scores  LV1 vs LV3  |  ' + TITLE_SUF +</w:t>
-        <w:br/>
-        <w:t xml:space="preserve">    '\nFilled = train  |  Stars = test')</w:t>
-        <w:br/>
-        <w:t>fig.tight_layout()</w:t>
-        <w:br/>
-        <w:t>save_fig(fig, '02_PLSDA_Scores_LV1_LV3.png')</w:t>
-        <w:br/>
-        <w:br/>
-        <w:t># Fig 03 — 3D scores</w:t>
-        <w:br/>
-        <w:t>fig = plt.figure(figsize=(9, 7))</w:t>
-        <w:br/>
-        <w:t>ax  = fig.add_subplot(111, projection='3d')</w:t>
-        <w:br/>
-        <w:t>for cls in CLASS_LABELS:</w:t>
-        <w:br/>
-        <w:t xml:space="preserve">    itr = cls_train == cls; ite = cls_test == cls</w:t>
-        <w:br/>
-        <w:t xml:space="preserve">    ax.scatter(T_train[itr,0], T_train[itr,1], T_train[itr,2],</w:t>
-        <w:br/>
-        <w:t xml:space="preserve">               c=PALETTE[cls], marker=MARKER_TR[cls], s=55,</w:t>
-        <w:br/>
-        <w:t xml:space="preserve">               edgecolors='k', linewidths=0.4, alpha=0.80, label='%s (train)' % cls)</w:t>
-        <w:br/>
-        <w:t xml:space="preserve">    ax.scatter(T_test[ite,0], T_test[ite,1], T_test[ite,2],</w:t>
-        <w:br/>
-        <w:t xml:space="preserve">               c=PALETTE[cls], marker='*', s=220,</w:t>
-        <w:br/>
-        <w:t xml:space="preserve">               edgecolors='k', linewidths=0.8, alpha=1.00, label='%s (test)' % cls)</w:t>
-        <w:br/>
-        <w:t>ax.set_xlabel('LV1 (%.1f%%)' % lv_var(0), fontsize=9)</w:t>
       </w:r>
     </w:p>
     <w:p>
@@ -1774,6 +1770,64 @@
           <w:rFonts w:ascii="Courier New" w:hAnsi="Courier New"/>
           <w:sz w:val="16"/>
         </w:rPr>
+        <w:t>scatter_lv(ax, 0, 1,</w:t>
+        <w:br/>
+        <w:t xml:space="preserve">    'LV1 (%.1f%% var.)' % lv_var(0),</w:t>
+        <w:br/>
+        <w:t xml:space="preserve">    'LV2 (%.1f%% var.)' % lv_var(1),</w:t>
+        <w:br/>
+        <w:t xml:space="preserve">    'PLS-DA Scores  LV1 vs LV2  |  ' + TITLE_SUF +</w:t>
+        <w:br/>
+        <w:t xml:space="preserve">    '\nFilled = train  |  Stars = test')</w:t>
+        <w:br/>
+        <w:t>fig.tight_layout()</w:t>
+        <w:br/>
+        <w:t>save_fig(fig, '01_PLSDA_Scores_LV1_LV2.png')</w:t>
+        <w:br/>
+        <w:br/>
+        <w:t># Fig 02 — LV1 vs LV3</w:t>
+        <w:br/>
+        <w:t>fig, ax = plt.subplots(figsize=(8, 6))</w:t>
+        <w:br/>
+        <w:t>scatter_lv(ax, 0, 2,</w:t>
+        <w:br/>
+        <w:t xml:space="preserve">    'LV1 (%.1f%% var.)' % lv_var(0),</w:t>
+        <w:br/>
+        <w:t xml:space="preserve">    'LV3 (%.1f%% var.)' % lv_var(2),</w:t>
+        <w:br/>
+        <w:t xml:space="preserve">    'PLS-DA Scores  LV1 vs LV3  |  ' + TITLE_SUF +</w:t>
+        <w:br/>
+        <w:t xml:space="preserve">    '\nFilled = train  |  Stars = test')</w:t>
+        <w:br/>
+        <w:t>fig.tight_layout()</w:t>
+        <w:br/>
+        <w:t>save_fig(fig, '02_PLSDA_Scores_LV1_LV3.png')</w:t>
+        <w:br/>
+        <w:br/>
+        <w:t># Fig 03 — 3D scores</w:t>
+        <w:br/>
+        <w:t>fig = plt.figure(figsize=(9, 7))</w:t>
+        <w:br/>
+        <w:t>ax  = fig.add_subplot(111, projection='3d')</w:t>
+        <w:br/>
+        <w:t>for cls in CLASS_LABELS:</w:t>
+        <w:br/>
+        <w:t xml:space="preserve">    itr = cls_train == cls; ite = cls_test == cls</w:t>
+        <w:br/>
+        <w:t xml:space="preserve">    ax.scatter(T_train[itr,0], T_train[itr,1], T_train[itr,2],</w:t>
+        <w:br/>
+        <w:t xml:space="preserve">               c=PALETTE[cls], marker=MARKER_TR[cls], s=55,</w:t>
+        <w:br/>
+        <w:t xml:space="preserve">               edgecolors='k', linewidths=0.4, alpha=0.80, label='%s (train)' % cls)</w:t>
+        <w:br/>
+        <w:t xml:space="preserve">    ax.scatter(T_test[ite,0], T_test[ite,1], T_test[ite,2],</w:t>
+        <w:br/>
+        <w:t xml:space="preserve">               c=PALETTE[cls], marker='*', s=220,</w:t>
+        <w:br/>
+        <w:t xml:space="preserve">               edgecolors='k', linewidths=0.8, alpha=1.00, label='%s (test)' % cls)</w:t>
+        <w:br/>
+        <w:t>ax.set_xlabel('LV1 (%.1f%%)' % lv_var(0), fontsize=9)</w:t>
+        <w:br/>
         <w:t>ax.set_ylabel('LV2 (%.1f%%)' % lv_var(1), fontsize=9)</w:t>
         <w:br/>
         <w:t>ax.set_zlabel('LV3 (%.1f%%)' % lv_var(2), fontsize=9)</w:t>
@@ -1792,63 +1846,6 @@
         <w:t># =============================================================================</w:t>
         <w:br/>
         <w:t># 14. PLS-DA CONFUSION MATRICES WITH PER-CLASS STATS TABLE</w:t>
-        <w:br/>
-        <w:t># =============================================================================</w:t>
-        <w:br/>
-        <w:t>plot_confusion_with_stats(</w:t>
-        <w:br/>
-        <w:t xml:space="preserve">    cm_pls_cv, CLASS_LABELS,</w:t>
-        <w:br/>
-        <w:t xml:space="preserve">    'PLS-DA  5-fold CV  (train n=60)',</w:t>
-        <w:br/>
-        <w:t xml:space="preserve">    '04_PLSDA_Confusion_5fold.png', 'Blues', acc_pls_cv)</w:t>
-        <w:br/>
-        <w:br/>
-        <w:t>plot_confusion_with_stats(</w:t>
-        <w:br/>
-        <w:t xml:space="preserve">    cm_pls_test, CLASS_LABELS,</w:t>
-        <w:br/>
-        <w:t xml:space="preserve">    'PLS-DA  External Test  (n=20)',</w:t>
-        <w:br/>
-        <w:t xml:space="preserve">    '05_PLSDA_Confusion_Test.png', 'Oranges', acc_pls_test)</w:t>
-        <w:br/>
-        <w:br/>
-        <w:t># =============================================================================</w:t>
-        <w:br/>
-        <w:t># 15. VIP SCORES</w:t>
-        <w:br/>
-        <w:t># =============================================================================</w:t>
-        <w:br/>
-        <w:t>sel_mask = np.zeros(len(wavenumbers), dtype=bool)</w:t>
-        <w:br/>
-        <w:t>sel_mask[top_idx] = True</w:t>
-        <w:br/>
-        <w:br/>
-        <w:t>fig, ax = plt.subplots(figsize=(10, 4))</w:t>
-        <w:br/>
-        <w:t>ax.plot(wavenumbers, vip_all, color='steelblue', lw=1.0, zorder=2)</w:t>
-        <w:br/>
-        <w:t>ax.fill_between(wavenumbers, vip_all, 1, where=(vip_all &gt; 1),</w:t>
-        <w:br/>
-        <w:t xml:space="preserve">                alpha=0.25, color='crimson',</w:t>
-        <w:br/>
-        <w:t xml:space="preserve">                label='VIP &gt; 1  (%d bands)' % n_vip_gt1, zorder=1)</w:t>
-        <w:br/>
-        <w:t>ax.axhline(1, color='crimson', ls='--', lw=1.0, label='VIP = 1 threshold')</w:t>
-        <w:br/>
-        <w:t>ax.fill_between(wavenumbers, 0, 0.07*vip_all.max(), where=sel_mask,</w:t>
-        <w:br/>
-        <w:t xml:space="preserve">                alpha=0.18, color='green',</w:t>
-        <w:br/>
-        <w:t xml:space="preserve">                label='Top-%d selected' % top_n)</w:t>
-        <w:br/>
-        <w:t>ax.set_xlim(WAVENUMBER_MIN, WAVENUMBER_MAX)</w:t>
-        <w:br/>
-        <w:t>ax.set_xlabel('Wavenumber (cm⁻¹)', fontsize=12)</w:t>
-        <w:br/>
-        <w:t>ax.set_ylabel('VIP score', fontsize=12)</w:t>
-        <w:br/>
-        <w:t>ax.set_title('Variable Importance in Projection  |  Binary  |  ' + TITLE_SUF,</w:t>
       </w:r>
     </w:p>
     <w:p>
@@ -1861,6 +1858,63 @@
           <w:rFonts w:ascii="Courier New" w:hAnsi="Courier New"/>
           <w:sz w:val="16"/>
         </w:rPr>
+        <w:t># =============================================================================</w:t>
+        <w:br/>
+        <w:t>plot_confusion_with_stats(</w:t>
+        <w:br/>
+        <w:t xml:space="preserve">    cm_pls_cv, CLASS_LABELS,</w:t>
+        <w:br/>
+        <w:t xml:space="preserve">    'PLS-DA  5-fold CV  (train n=60)',</w:t>
+        <w:br/>
+        <w:t xml:space="preserve">    '04_PLSDA_Confusion_5fold.png', 'Blues', acc_pls_cv)</w:t>
+        <w:br/>
+        <w:br/>
+        <w:t>plot_confusion_with_stats(</w:t>
+        <w:br/>
+        <w:t xml:space="preserve">    cm_pls_test, CLASS_LABELS,</w:t>
+        <w:br/>
+        <w:t xml:space="preserve">    'PLS-DA  External Test  (Gr only, n=10)',</w:t>
+        <w:br/>
+        <w:t xml:space="preserve">    '05_PLSDA_Confusion_Test.png', 'Oranges', acc_pls_test)</w:t>
+        <w:br/>
+        <w:br/>
+        <w:t># =============================================================================</w:t>
+        <w:br/>
+        <w:t># 15. VIP SCORES</w:t>
+        <w:br/>
+        <w:t># =============================================================================</w:t>
+        <w:br/>
+        <w:t>sel_mask = np.zeros(len(wavenumbers), dtype=bool)</w:t>
+        <w:br/>
+        <w:t>sel_mask[top_idx] = True</w:t>
+        <w:br/>
+        <w:br/>
+        <w:t>fig, ax = plt.subplots(figsize=(10, 4))</w:t>
+        <w:br/>
+        <w:t>ax.plot(wavenumbers, vip_all, color='steelblue', lw=1.0, zorder=2)</w:t>
+        <w:br/>
+        <w:t>ax.fill_between(wavenumbers, vip_all, 1, where=(vip_all &gt; 1),</w:t>
+        <w:br/>
+        <w:t xml:space="preserve">                alpha=0.25, color='crimson',</w:t>
+        <w:br/>
+        <w:t xml:space="preserve">                label='VIP &gt; 1  (%d bands)' % n_vip_gt1, zorder=1)</w:t>
+        <w:br/>
+        <w:t>ax.axhline(1, color='crimson', ls='--', lw=1.0, label='VIP = 1 threshold')</w:t>
+        <w:br/>
+        <w:t>ax.fill_between(wavenumbers, 0, 0.07*vip_all.max(), where=sel_mask,</w:t>
+        <w:br/>
+        <w:t xml:space="preserve">                alpha=0.18, color='green',</w:t>
+        <w:br/>
+        <w:t xml:space="preserve">                label='Top-%d selected' % top_n)</w:t>
+        <w:br/>
+        <w:t>ax.set_xlim(WAVENUMBER_MIN, WAVENUMBER_MAX)</w:t>
+        <w:br/>
+        <w:t>ax.set_xlabel('Wavenumber (cm⁻¹)', fontsize=12)</w:t>
+        <w:br/>
+        <w:t>ax.set_ylabel('VIP score', fontsize=12)</w:t>
+        <w:br/>
+        <w:t>ax.set_title('Variable Importance in Projection  |  Binary  |  ' + TITLE_SUF,</w:t>
+        <w:br/>
         <w:t xml:space="preserve">             fontsize=11, fontweight='bold')</w:t>
         <w:br/>
         <w:t>ax.legend(fontsize=9); ax.grid(True, alpha=0.25)</w:t>
@@ -1879,65 +1933,6 @@
         <w:t>fig, axes = plt.subplots(N_COMPONENTS, 1, figsize=(11, 3*N_COMPONENTS), sharex=True)</w:t>
         <w:br/>
         <w:t>colors_load = ['steelblue', 'darkorange', 'seagreen']</w:t>
-        <w:br/>
-        <w:t>for i, (ax, col) in enumerate(zip(axes, colors_load[:N_COMPONENTS])):</w:t>
-        <w:br/>
-        <w:t xml:space="preserve">    ax.stem(wn_sel, P_load[:, i], linefmt=col, markerfmt=' ', basefmt='k-')</w:t>
-        <w:br/>
-        <w:t xml:space="preserve">    ax.axhline(0, color='k', lw=0.5)</w:t>
-        <w:br/>
-        <w:t xml:space="preserve">    ax.set_ylabel('Loading LV%d' % (i+1), fontsize=10)</w:t>
-        <w:br/>
-        <w:t xml:space="preserve">    ax.set_xlim(WAVENUMBER_MIN, WAVENUMBER_MAX)</w:t>
-        <w:br/>
-        <w:t xml:space="preserve">    ax.grid(True, alpha=0.2)</w:t>
-        <w:br/>
-        <w:t xml:space="preserve">    for pk in np.argsort(np.abs(P_load[:, i]))[-5:]:</w:t>
-        <w:br/>
-        <w:t xml:space="preserve">        ax.annotate('%.0f' % wn_sel[pk],</w:t>
-        <w:br/>
-        <w:t xml:space="preserve">                    xy=(wn_sel[pk], P_load[pk, i]), fontsize=7,</w:t>
-        <w:br/>
-        <w:t xml:space="preserve">                    ha='center', xytext=(0, 5), textcoords='offset points')</w:t>
-        <w:br/>
-        <w:t>axes[-1].set_xlabel('Wavenumber (cm⁻¹)', fontsize=12)</w:t>
-        <w:br/>
-        <w:t>axes[0].set_title('PLS-DA Loadings  |  Binary  |  ' + TITLE_SUF,</w:t>
-        <w:br/>
-        <w:t xml:space="preserve">                  fontsize=10, fontweight='bold')</w:t>
-        <w:br/>
-        <w:t>fig.tight_layout()</w:t>
-        <w:br/>
-        <w:t>save_fig(fig, '07_PLSDA_Loadings.png')</w:t>
-        <w:br/>
-        <w:br/>
-        <w:t># =============================================================================</w:t>
-        <w:br/>
-        <w:t># 17. PERMUTATION TEST</w:t>
-        <w:br/>
-        <w:t># =============================================================================</w:t>
-        <w:br/>
-        <w:t>fig, ax = plt.subplots(figsize=(7.5, 4.5))</w:t>
-        <w:br/>
-        <w:t>ax.hist(perm_scores, bins=35, color='lightsteelblue', edgecolor='white',</w:t>
-        <w:br/>
-        <w:t xml:space="preserve">        label='Permuted accuracy')</w:t>
-        <w:br/>
-        <w:t>ax.axvline(obs_score, color='crimson', lw=2.5,</w:t>
-        <w:br/>
-        <w:t xml:space="preserve">           label='Observed: %.1f%%   p=%.4f' % (obs_score*100, p_val))</w:t>
-        <w:br/>
-        <w:t>ax.axvline(0.50, color='grey', lw=1.2, ls=':', label='Chance level (50%)')</w:t>
-        <w:br/>
-        <w:t>ax.set_xlabel('5-fold CV accuracy', fontsize=12)</w:t>
-        <w:br/>
-        <w:t>ax.set_ylabel('Count', fontsize=12)</w:t>
-        <w:br/>
-        <w:t>ax.set_title('Permutation Test (%d perm.)  |  PLS-DA Binary  |  ' % N_PERM + TITLE_SUF,</w:t>
-        <w:br/>
-        <w:t xml:space="preserve">             fontsize=10, fontweight='bold')</w:t>
-        <w:br/>
-        <w:t>ax.legend(fontsize=9); ax.grid(True, alpha=0.25)</w:t>
       </w:r>
     </w:p>
     <w:p>
@@ -1950,8 +1945,67 @@
           <w:rFonts w:ascii="Courier New" w:hAnsi="Courier New"/>
           <w:sz w:val="16"/>
         </w:rPr>
+        <w:t>for i, (ax, col) in enumerate(zip(axes, colors_load[:N_COMPONENTS])):</w:t>
+        <w:br/>
+        <w:t xml:space="preserve">    ax.stem(wn_sel, P_load[:, i], linefmt=col, markerfmt=' ', basefmt='k-')</w:t>
+        <w:br/>
+        <w:t xml:space="preserve">    ax.axhline(0, color='k', lw=0.5)</w:t>
+        <w:br/>
+        <w:t xml:space="preserve">    ax.set_ylabel('Loading LV%d' % (i+1), fontsize=10)</w:t>
+        <w:br/>
+        <w:t xml:space="preserve">    ax.set_xlim(WAVENUMBER_MIN, WAVENUMBER_MAX)</w:t>
+        <w:br/>
+        <w:t xml:space="preserve">    ax.grid(True, alpha=0.2)</w:t>
+        <w:br/>
+        <w:t xml:space="preserve">    for pk in np.argsort(np.abs(P_load[:, i]))[-5:]:</w:t>
+        <w:br/>
+        <w:t xml:space="preserve">        ax.annotate('%.0f' % wn_sel[pk],</w:t>
+        <w:br/>
+        <w:t xml:space="preserve">                    xy=(wn_sel[pk], P_load[pk, i]), fontsize=7,</w:t>
+        <w:br/>
+        <w:t xml:space="preserve">                    ha='center', xytext=(0, 5), textcoords='offset points')</w:t>
+        <w:br/>
+        <w:t>axes[-1].set_xlabel('Wavenumber (cm⁻¹)', fontsize=12)</w:t>
+        <w:br/>
+        <w:t>axes[0].set_title('PLS-DA Loadings  |  Binary  |  ' + TITLE_SUF,</w:t>
+        <w:br/>
+        <w:t xml:space="preserve">                  fontsize=10, fontweight='bold')</w:t>
+        <w:br/>
         <w:t>fig.tight_layout()</w:t>
         <w:br/>
+        <w:t>save_fig(fig, '07_PLSDA_Loadings.png')</w:t>
+        <w:br/>
+        <w:br/>
+        <w:t># =============================================================================</w:t>
+        <w:br/>
+        <w:t># 17. PERMUTATION TEST</w:t>
+        <w:br/>
+        <w:t># =============================================================================</w:t>
+        <w:br/>
+        <w:t>fig, ax = plt.subplots(figsize=(7.5, 4.5))</w:t>
+        <w:br/>
+        <w:t>ax.hist(perm_scores, bins=35, color='lightsteelblue', edgecolor='white',</w:t>
+        <w:br/>
+        <w:t xml:space="preserve">        label='Permuted accuracy')</w:t>
+        <w:br/>
+        <w:t>ax.axvline(obs_score, color='crimson', lw=2.5,</w:t>
+        <w:br/>
+        <w:t xml:space="preserve">           label='Observed: %.1f%%   p=%.4f' % (obs_score*100, p_val))</w:t>
+        <w:br/>
+        <w:t>ax.axvline(0.50, color='grey', lw=1.2, ls=':', label='Chance level (50%)')</w:t>
+        <w:br/>
+        <w:t>ax.set_xlabel('5-fold CV accuracy', fontsize=12)</w:t>
+        <w:br/>
+        <w:t>ax.set_ylabel('Count', fontsize=12)</w:t>
+        <w:br/>
+        <w:t>ax.set_title('Permutation Test (%d perm.)  |  PLS-DA Binary  |  ' % N_PERM + TITLE_SUF,</w:t>
+        <w:br/>
+        <w:t xml:space="preserve">             fontsize=10, fontweight='bold')</w:t>
+        <w:br/>
+        <w:t>ax.legend(fontsize=9); ax.grid(True, alpha=0.25)</w:t>
+        <w:br/>
+        <w:t>fig.tight_layout()</w:t>
+        <w:br/>
         <w:t>save_fig(fig, '08_PLSDA_Permutation.png')</w:t>
         <w:br/>
         <w:br/>
@@ -1967,65 +2021,6 @@
         <w:br/>
         <w:br/>
         <w:t>for cls in CLASS_LABELS:</w:t>
-        <w:br/>
-        <w:t xml:space="preserve">    for i in np.where(cls_train == cls)[0]:</w:t>
-        <w:br/>
-        <w:t xml:space="preserve">        wrong = (le.transform([cls_train[i]])[0] != y_pls_cv[i])</w:t>
-        <w:br/>
-        <w:t xml:space="preserve">        ax.scatter(T_train[i, 0], T_train[i, 1],</w:t>
-        <w:br/>
-        <w:t xml:space="preserve">                   c=PALETTE[cls], marker=MARKER_TR[cls], s=75,</w:t>
-        <w:br/>
-        <w:t xml:space="preserve">                   edgecolors='red' if wrong else 'black',</w:t>
-        <w:br/>
-        <w:t xml:space="preserve">                   linewidths=2.0 if wrong else 0.6, alpha=0.82, zorder=3)</w:t>
-        <w:br/>
-        <w:t xml:space="preserve">    for i in np.where(cls_test == cls)[0]:</w:t>
-        <w:br/>
-        <w:t xml:space="preserve">        wrong = (le.transform([cls_test[i]])[0] != y_pls_test[i])</w:t>
-        <w:br/>
-        <w:t xml:space="preserve">        ax.scatter(T_test[i, 0], T_test[i, 1],</w:t>
-        <w:br/>
-        <w:t xml:space="preserve">                   c=PALETTE[cls], marker='*', s=300,</w:t>
-        <w:br/>
-        <w:t xml:space="preserve">                   edgecolors='red' if wrong else 'black',</w:t>
-        <w:br/>
-        <w:t xml:space="preserve">                   linewidths=2.0 if wrong else 1.0, alpha=1.00, zorder=5)</w:t>
-        <w:br/>
-        <w:br/>
-        <w:t>handles  = [plt.scatter([], [], c=PALETTE[c], marker=MARKER_TR[c],</w:t>
-        <w:br/>
-        <w:t xml:space="preserve">                        s=60, edgecolors='k', label=c) for c in CLASS_LABELS]</w:t>
-        <w:br/>
-        <w:t>handles += [plt.scatter([], [], c='grey', marker='*', s=200,</w:t>
-        <w:br/>
-        <w:t xml:space="preserve">                        edgecolors='k', label='Test samples'),</w:t>
-        <w:br/>
-        <w:t xml:space="preserve">            Line2D([0],[0], marker='o', color='w', markerfacecolor='white',</w:t>
-        <w:br/>
-        <w:t xml:space="preserve">                   markeredgecolor='red', markeredgewidth=2.0, markersize=9,</w:t>
-        <w:br/>
-        <w:t xml:space="preserve">                   label='Misclassified'),</w:t>
-        <w:br/>
-        <w:t xml:space="preserve">            Line2D([0],[0], marker='o', color='w', markerfacecolor='white',</w:t>
-        <w:br/>
-        <w:t xml:space="preserve">                   markeredgecolor='black', markeredgewidth=0.6, markersize=9,</w:t>
-        <w:br/>
-        <w:t xml:space="preserve">                   label='Correct')]</w:t>
-        <w:br/>
-        <w:t>ax.legend(handles=handles, fontsize=9, framealpha=0.85, loc='upper right')</w:t>
-        <w:br/>
-        <w:t>ax.axhline(0, color='grey', lw=0.7, ls='--')</w:t>
-        <w:br/>
-        <w:t>ax.axvline(0, color='grey', lw=0.7, ls='--')</w:t>
-        <w:br/>
-        <w:t>ax.set_xlabel('LV1 (%.1f%% var.)' % lv_var(0), fontsize=11)</w:t>
-        <w:br/>
-        <w:t>ax.set_ylabel('LV2 (%.1f%% var.)' % lv_var(1), fontsize=11)</w:t>
-        <w:br/>
-        <w:t>nw_tr = int((le.transform(cls_train) != y_pls_cv).sum())</w:t>
-        <w:br/>
-        <w:t>nw_te = int((le.transform(cls_test)  != y_pls_test).sum())</w:t>
       </w:r>
     </w:p>
     <w:p>
@@ -2038,11 +2033,70 @@
           <w:rFonts w:ascii="Courier New" w:hAnsi="Courier New"/>
           <w:sz w:val="16"/>
         </w:rPr>
+        <w:t xml:space="preserve">    for i in np.where(cls_train == cls)[0]:</w:t>
+        <w:br/>
+        <w:t xml:space="preserve">        wrong = (le.transform([cls_train[i]])[0] != y_pls_cv[i])</w:t>
+        <w:br/>
+        <w:t xml:space="preserve">        ax.scatter(T_train[i, 0], T_train[i, 1],</w:t>
+        <w:br/>
+        <w:t xml:space="preserve">                   c=PALETTE[cls], marker=MARKER_TR[cls], s=75,</w:t>
+        <w:br/>
+        <w:t xml:space="preserve">                   edgecolors='red' if wrong else 'black',</w:t>
+        <w:br/>
+        <w:t xml:space="preserve">                   linewidths=2.0 if wrong else 0.6, alpha=0.82, zorder=3)</w:t>
+        <w:br/>
+        <w:t xml:space="preserve">    for i in np.where(cls_test == cls)[0]:</w:t>
+        <w:br/>
+        <w:t xml:space="preserve">        wrong = (le.transform([cls_test[i]])[0] != y_pls_test[i])</w:t>
+        <w:br/>
+        <w:t xml:space="preserve">        ax.scatter(T_test[i, 0], T_test[i, 1],</w:t>
+        <w:br/>
+        <w:t xml:space="preserve">                   c=PALETTE[cls], marker='*', s=300,</w:t>
+        <w:br/>
+        <w:t xml:space="preserve">                   edgecolors='red' if wrong else 'black',</w:t>
+        <w:br/>
+        <w:t xml:space="preserve">                   linewidths=2.0 if wrong else 1.0, alpha=1.00, zorder=5)</w:t>
+        <w:br/>
+        <w:br/>
+        <w:t>handles  = [plt.scatter([], [], c=PALETTE[c], marker=MARKER_TR[c],</w:t>
+        <w:br/>
+        <w:t xml:space="preserve">                        s=60, edgecolors='k', label=c) for c in CLASS_LABELS]</w:t>
+        <w:br/>
+        <w:t>handles += [plt.scatter([], [], c='grey', marker='*', s=200,</w:t>
+        <w:br/>
+        <w:t xml:space="preserve">                        edgecolors='k', label='Test samples'),</w:t>
+        <w:br/>
+        <w:t xml:space="preserve">            Line2D([0],[0], marker='o', color='w', markerfacecolor='white',</w:t>
+        <w:br/>
+        <w:t xml:space="preserve">                   markeredgecolor='red', markeredgewidth=2.0, markersize=9,</w:t>
+        <w:br/>
+        <w:t xml:space="preserve">                   label='Misclassified'),</w:t>
+        <w:br/>
+        <w:t xml:space="preserve">            Line2D([0],[0], marker='o', color='w', markerfacecolor='white',</w:t>
+        <w:br/>
+        <w:t xml:space="preserve">                   markeredgecolor='black', markeredgewidth=0.6, markersize=9,</w:t>
+        <w:br/>
+        <w:t xml:space="preserve">                   label='Correct')]</w:t>
+        <w:br/>
+        <w:t>ax.legend(handles=handles, fontsize=9, framealpha=0.85, loc='upper right')</w:t>
+        <w:br/>
+        <w:t>ax.axhline(0, color='grey', lw=0.7, ls='--')</w:t>
+        <w:br/>
+        <w:t>ax.axvline(0, color='grey', lw=0.7, ls='--')</w:t>
+        <w:br/>
+        <w:t>ax.set_xlabel('LV1 (%.1f%% var.)' % lv_var(0), fontsize=11)</w:t>
+        <w:br/>
+        <w:t>ax.set_ylabel('LV2 (%.1f%% var.)' % lv_var(1), fontsize=11)</w:t>
+        <w:br/>
+        <w:t>nw_tr = int((le.transform(cls_train) != y_pls_cv).sum())</w:t>
+        <w:br/>
+        <w:t>nw_te = int((le.transform(cls_test)  != y_pls_test).sum())</w:t>
+        <w:br/>
         <w:t>ax.set_title(</w:t>
         <w:br/>
-        <w:t xml:space="preserve">    'PLS-DA Binary Cluster  |  5-fold CV (train) + External Test\n'</w:t>
-        <w:br/>
-        <w:t xml:space="preserve">    'Train: %d wrong/60  CV acc=%.1f%%     Test: %d wrong/20  acc=%.1f%%' % (</w:t>
+        <w:t xml:space="preserve">    'PLS-DA Binary Cluster  |  5-fold CV (train) + External Test (Gr only)\n'</w:t>
+        <w:br/>
+        <w:t xml:space="preserve">    'Train: %d wrong/60  CV acc=%.1f%%     Test: %d wrong/10  acc=%.1f%%' % (</w:t>
         <w:br/>
         <w:t xml:space="preserve">        nw_tr, acc_pls_cv*100, nw_te, acc_pls_test*100),</w:t>
         <w:br/>
@@ -2057,64 +2111,6 @@
         <w:t>fig.tight_layout()</w:t>
         <w:br/>
         <w:t>save_fig(fig, '09_PLSDA_Cluster_5fold.png')</w:t>
-        <w:br/>
-        <w:br/>
-        <w:t># =============================================================================</w:t>
-        <w:br/>
-        <w:t># 19. SVM-RBF CLUSTER PLOTS  (PCA space)</w:t>
-        <w:br/>
-        <w:t># =============================================================================</w:t>
-        <w:br/>
-        <w:t>def scatter_svm(ax, pred_tr, pred_te, title, cm_cv_arg, cm_te_arg):</w:t>
-        <w:br/>
-        <w:t xml:space="preserve">    for cls in CLASS_LABELS:</w:t>
-        <w:br/>
-        <w:t xml:space="preserve">        for i in np.where(cls_train == cls)[0]:</w:t>
-        <w:br/>
-        <w:t xml:space="preserve">            wrong = (le.transform([cls_train[i]])[0] != pred_tr[i])</w:t>
-        <w:br/>
-        <w:t xml:space="preserve">            ax.scatter(Z_train[i, 0], Z_train[i, 1],</w:t>
-        <w:br/>
-        <w:t xml:space="preserve">                       c=PALETTE[cls], marker=MARKER_TR[cls], s=75,</w:t>
-        <w:br/>
-        <w:t xml:space="preserve">                       edgecolors='red' if wrong else 'black',</w:t>
-        <w:br/>
-        <w:t xml:space="preserve">                       linewidths=1.8 if wrong else 0.6, alpha=0.85, zorder=3)</w:t>
-        <w:br/>
-        <w:t xml:space="preserve">        for i in np.where(cls_test == cls)[0]:</w:t>
-        <w:br/>
-        <w:t xml:space="preserve">            wrong = (le.transform([cls_test[i]])[0] != pred_te[i])</w:t>
-        <w:br/>
-        <w:t xml:space="preserve">            ax.scatter(Z_test[i, 0], Z_test[i, 1],</w:t>
-        <w:br/>
-        <w:t xml:space="preserve">                       c=PALETTE[cls], marker='*', s=300,</w:t>
-        <w:br/>
-        <w:t xml:space="preserve">                       edgecolors='red' if wrong else 'black',</w:t>
-        <w:br/>
-        <w:t xml:space="preserve">                       linewidths=2.0 if wrong else 1.0, alpha=1.00, zorder=5)</w:t>
-        <w:br/>
-        <w:br/>
-        <w:t xml:space="preserve">    handles  = [plt.scatter([], [], c=PALETTE[c], marker=MARKER_TR[c],</w:t>
-        <w:br/>
-        <w:t xml:space="preserve">                            s=60, edgecolors='k', label=c) for c in CLASS_LABELS]</w:t>
-        <w:br/>
-        <w:t xml:space="preserve">    handles += [plt.scatter([], [], c='grey', marker='*', s=200,</w:t>
-        <w:br/>
-        <w:t xml:space="preserve">                            edgecolors='k', label='Test samples'),</w:t>
-        <w:br/>
-        <w:t xml:space="preserve">                Line2D([0],[0], marker='o', color='w', markerfacecolor='white',</w:t>
-        <w:br/>
-        <w:t xml:space="preserve">                       markeredgecolor='red', markeredgewidth=2.0, markersize=9,</w:t>
-        <w:br/>
-        <w:t xml:space="preserve">                       label='Misclassified'),</w:t>
-        <w:br/>
-        <w:t xml:space="preserve">                Line2D([0],[0], marker='o', color='w', markerfacecolor='white',</w:t>
-        <w:br/>
-        <w:t xml:space="preserve">                       markeredgecolor='black', markeredgewidth=0.6, markersize=9,</w:t>
-        <w:br/>
-        <w:t xml:space="preserve">                       label='Correct')]</w:t>
-        <w:br/>
-        <w:t xml:space="preserve">    ax.legend(handles=handles, fontsize=9, framealpha=0.85, loc='upper right')</w:t>
       </w:r>
     </w:p>
     <w:p>
@@ -2127,6 +2123,64 @@
           <w:rFonts w:ascii="Courier New" w:hAnsi="Courier New"/>
           <w:sz w:val="16"/>
         </w:rPr>
+        <w:br/>
+        <w:t># =============================================================================</w:t>
+        <w:br/>
+        <w:t># 19. SVM-RBF CLUSTER PLOTS  (PCA space)</w:t>
+        <w:br/>
+        <w:t># =============================================================================</w:t>
+        <w:br/>
+        <w:t>def scatter_svm(ax, pred_tr, pred_te, title, cm_cv_arg, cm_te_arg):</w:t>
+        <w:br/>
+        <w:t xml:space="preserve">    for cls in CLASS_LABELS:</w:t>
+        <w:br/>
+        <w:t xml:space="preserve">        for i in np.where(cls_train == cls)[0]:</w:t>
+        <w:br/>
+        <w:t xml:space="preserve">            wrong = (le.transform([cls_train[i]])[0] != pred_tr[i])</w:t>
+        <w:br/>
+        <w:t xml:space="preserve">            ax.scatter(Z_train[i, 0], Z_train[i, 1],</w:t>
+        <w:br/>
+        <w:t xml:space="preserve">                       c=PALETTE[cls], marker=MARKER_TR[cls], s=75,</w:t>
+        <w:br/>
+        <w:t xml:space="preserve">                       edgecolors='red' if wrong else 'black',</w:t>
+        <w:br/>
+        <w:t xml:space="preserve">                       linewidths=1.8 if wrong else 0.6, alpha=0.85, zorder=3)</w:t>
+        <w:br/>
+        <w:t xml:space="preserve">        for i in np.where(cls_test == cls)[0]:</w:t>
+        <w:br/>
+        <w:t xml:space="preserve">            wrong = (le.transform([cls_test[i]])[0] != pred_te[i])</w:t>
+        <w:br/>
+        <w:t xml:space="preserve">            ax.scatter(Z_test[i, 0], Z_test[i, 1],</w:t>
+        <w:br/>
+        <w:t xml:space="preserve">                       c=PALETTE[cls], marker='*', s=300,</w:t>
+        <w:br/>
+        <w:t xml:space="preserve">                       edgecolors='red' if wrong else 'black',</w:t>
+        <w:br/>
+        <w:t xml:space="preserve">                       linewidths=2.0 if wrong else 1.0, alpha=1.00, zorder=5)</w:t>
+        <w:br/>
+        <w:br/>
+        <w:t xml:space="preserve">    handles  = [plt.scatter([], [], c=PALETTE[c], marker=MARKER_TR[c],</w:t>
+        <w:br/>
+        <w:t xml:space="preserve">                            s=60, edgecolors='k', label=c) for c in CLASS_LABELS]</w:t>
+        <w:br/>
+        <w:t xml:space="preserve">    handles += [plt.scatter([], [], c='grey', marker='*', s=200,</w:t>
+        <w:br/>
+        <w:t xml:space="preserve">                            edgecolors='k', label='Test samples'),</w:t>
+        <w:br/>
+        <w:t xml:space="preserve">                Line2D([0],[0], marker='o', color='w', markerfacecolor='white',</w:t>
+        <w:br/>
+        <w:t xml:space="preserve">                       markeredgecolor='red', markeredgewidth=2.0, markersize=9,</w:t>
+        <w:br/>
+        <w:t xml:space="preserve">                       label='Misclassified'),</w:t>
+        <w:br/>
+        <w:t xml:space="preserve">                Line2D([0],[0], marker='o', color='w', markerfacecolor='white',</w:t>
+        <w:br/>
+        <w:t xml:space="preserve">                       markeredgecolor='black', markeredgewidth=0.6, markersize=9,</w:t>
+        <w:br/>
+        <w:t xml:space="preserve">                       label='Correct')]</w:t>
+        <w:br/>
+        <w:t xml:space="preserve">    ax.legend(handles=handles, fontsize=9, framealpha=0.85, loc='upper right')</w:t>
+        <w:br/>
         <w:t xml:space="preserve">    ax.set_xlabel('PC1 (%.1f%%)' % (pca_viz.explained_variance_ratio_[0]*100), fontsize=11)</w:t>
         <w:br/>
         <w:t xml:space="preserve">    ax.set_ylabel('PC2 (%.1f%%)' % (pca_viz.explained_variance_ratio_[1]*100), fontsize=11)</w:t>
@@ -2145,63 +2199,6 @@
         <w:t>nw_tr = int((le.transform(cls_train) != y_svm_cv).sum())</w:t>
         <w:br/>
         <w:t>nw_te = int((le.transform(cls_test)  != y_svm_test).sum())</w:t>
-        <w:br/>
-        <w:t>scatter_svm(ax, y_svm_cv, y_svm_test,</w:t>
-        <w:br/>
-        <w:t xml:space="preserve">    'SVM-RBF Binary Cluster  |  5-fold CV (train) + External Test\n'</w:t>
-        <w:br/>
-        <w:t xml:space="preserve">    'Train: %d wrong/60  CV acc=%.1f%%     Test: %d wrong/20  acc=%.1f%%' % (</w:t>
-        <w:br/>
-        <w:t xml:space="preserve">        nw_tr, acc_svm_cv*100, nw_te, acc_svm_test*100),</w:t>
-        <w:br/>
-        <w:t xml:space="preserve">    cm_svm_cv, cm_svm_test)</w:t>
-        <w:br/>
-        <w:t>fig.suptitle(TITLE_SUF, fontsize=10)</w:t>
-        <w:br/>
-        <w:t>fig.tight_layout()</w:t>
-        <w:br/>
-        <w:t>save_fig(fig, '10_SVM_Cluster_5fold.png')</w:t>
-        <w:br/>
-        <w:br/>
-        <w:t># Fig 11 — SVM test-only cluster</w:t>
-        <w:br/>
-        <w:t>fig, ax = plt.subplots(figsize=(9, 7))</w:t>
-        <w:br/>
-        <w:t>nw_te = int((le.transform(cls_test) != y_svm_test).sum())</w:t>
-        <w:br/>
-        <w:t>scatter_svm(ax, le.transform(cls_train), y_svm_test,</w:t>
-        <w:br/>
-        <w:t xml:space="preserve">    'SVM-RBF Binary Cluster  |  External Test focus  (n=20)\n'</w:t>
-        <w:br/>
-        <w:t xml:space="preserve">    'Test: %d wrong/20  |  Test accuracy = %.1f%%' % (nw_te, acc_svm_test*100),</w:t>
-        <w:br/>
-        <w:t xml:space="preserve">    cm_svm_cv, cm_svm_test)</w:t>
-        <w:br/>
-        <w:t>fig.suptitle(TITLE_SUF, fontsize=10)</w:t>
-        <w:br/>
-        <w:t>fig.tight_layout()</w:t>
-        <w:br/>
-        <w:t>save_fig(fig, '11_SVM_Cluster_Test.png')</w:t>
-        <w:br/>
-        <w:br/>
-        <w:t># =============================================================================</w:t>
-        <w:br/>
-        <w:t># 20. SVM CONFUSION MATRICES WITH PER-CLASS STATS TABLE</w:t>
-        <w:br/>
-        <w:t># =============================================================================</w:t>
-        <w:br/>
-        <w:t>plot_confusion_with_stats(</w:t>
-        <w:br/>
-        <w:t xml:space="preserve">    cm_svm_cv, CLASS_LABELS,</w:t>
-        <w:br/>
-        <w:t xml:space="preserve">    'SVM-RBF  5-fold CV  (train n=60)',</w:t>
-        <w:br/>
-        <w:t xml:space="preserve">    '12_SVM_Confusion_5fold.png', 'Blues', acc_svm_cv)</w:t>
-        <w:br/>
-        <w:br/>
-        <w:t>plot_confusion_with_stats(</w:t>
-        <w:br/>
-        <w:t xml:space="preserve">    cm_svm_test, CLASS_LABELS,</w:t>
       </w:r>
     </w:p>
     <w:p>
@@ -2214,7 +2211,64 @@
           <w:rFonts w:ascii="Courier New" w:hAnsi="Courier New"/>
           <w:sz w:val="16"/>
         </w:rPr>
-        <w:t xml:space="preserve">    'SVM-RBF  External Test  (n=20)',</w:t>
+        <w:t>scatter_svm(ax, y_svm_cv, y_svm_test,</w:t>
+        <w:br/>
+        <w:t xml:space="preserve">    'SVM-RBF Binary Cluster  |  5-fold CV (train) + External Test (Gr only)\n'</w:t>
+        <w:br/>
+        <w:t xml:space="preserve">    'Train: %d wrong/60  CV acc=%.1f%%     Test: %d wrong/10  acc=%.1f%%' % (</w:t>
+        <w:br/>
+        <w:t xml:space="preserve">        nw_tr, acc_svm_cv*100, nw_te, acc_svm_test*100),</w:t>
+        <w:br/>
+        <w:t xml:space="preserve">    cm_svm_cv, cm_svm_test)</w:t>
+        <w:br/>
+        <w:t>fig.suptitle(TITLE_SUF, fontsize=10)</w:t>
+        <w:br/>
+        <w:t>fig.tight_layout()</w:t>
+        <w:br/>
+        <w:t>save_fig(fig, '10_SVM_Cluster_5fold.png')</w:t>
+        <w:br/>
+        <w:br/>
+        <w:t># Fig 11 — SVM test-only cluster</w:t>
+        <w:br/>
+        <w:t>fig, ax = plt.subplots(figsize=(9, 7))</w:t>
+        <w:br/>
+        <w:t>nw_te = int((le.transform(cls_test) != y_svm_test).sum())</w:t>
+        <w:br/>
+        <w:t>scatter_svm(ax, le.transform(cls_train), y_svm_test,</w:t>
+        <w:br/>
+        <w:t xml:space="preserve">    'SVM-RBF Binary Cluster  |  External Test focus  (Gr only, n=10)\n'</w:t>
+        <w:br/>
+        <w:t xml:space="preserve">    'Test: %d wrong/10  |  Test accuracy = %.1f%%' % (nw_te, acc_svm_test*100),</w:t>
+        <w:br/>
+        <w:t xml:space="preserve">    cm_svm_cv, cm_svm_test)</w:t>
+        <w:br/>
+        <w:t>fig.suptitle(TITLE_SUF, fontsize=10)</w:t>
+        <w:br/>
+        <w:t>fig.tight_layout()</w:t>
+        <w:br/>
+        <w:t>save_fig(fig, '11_SVM_Cluster_Test.png')</w:t>
+        <w:br/>
+        <w:br/>
+        <w:t># =============================================================================</w:t>
+        <w:br/>
+        <w:t># 20. SVM CONFUSION MATRICES WITH PER-CLASS STATS TABLE</w:t>
+        <w:br/>
+        <w:t># =============================================================================</w:t>
+        <w:br/>
+        <w:t>plot_confusion_with_stats(</w:t>
+        <w:br/>
+        <w:t xml:space="preserve">    cm_svm_cv, CLASS_LABELS,</w:t>
+        <w:br/>
+        <w:t xml:space="preserve">    'SVM-RBF  5-fold CV  (train n=60)',</w:t>
+        <w:br/>
+        <w:t xml:space="preserve">    '12_SVM_Confusion_5fold.png', 'Blues', acc_svm_cv)</w:t>
+        <w:br/>
+        <w:br/>
+        <w:t>plot_confusion_with_stats(</w:t>
+        <w:br/>
+        <w:t xml:space="preserve">    cm_svm_test, CLASS_LABELS,</w:t>
+        <w:br/>
+        <w:t xml:space="preserve">    'SVM-RBF  External Test  (Gr only, n=10)',</w:t>
         <w:br/>
         <w:t xml:space="preserve">    '13_SVM_Confusion_Test.png', 'Oranges', acc_svm_test)</w:t>
         <w:br/>
@@ -2232,63 +2286,6 @@
         <w:t>svm_acc_cv_v,  svm_rec_cv_v  = per_class_metrics(cm_svm_cv)</w:t>
         <w:br/>
         <w:t>pls_acc_te_v,  pls_rec_te_v  = per_class_metrics(cm_pls_test)</w:t>
-        <w:br/>
-        <w:t>svm_acc_te_v,  svm_rec_te_v  = per_class_metrics(cm_svm_test)</w:t>
-        <w:br/>
-        <w:br/>
-        <w:t>fig, axes = plt.subplots(1, 3, figsize=(18, 6))</w:t>
-        <w:br/>
-        <w:t>x_ov = np.arange(2); w_ov = 0.28</w:t>
-        <w:br/>
-        <w:t>groups   = ['5-fold CV\n(train n=60)', 'External Test\n(n=20)']</w:t>
-        <w:br/>
-        <w:t>xc = np.arange(len(CLASS_LABELS)); wc = 0.30</w:t>
-        <w:br/>
-        <w:br/>
-        <w:t># Panel 1: Overall accuracy</w:t>
-        <w:br/>
-        <w:t>ax = axes[0]</w:t>
-        <w:br/>
-        <w:t>b1 = ax.bar(x_ov - w_ov/2, [acc_pls_cv*100, acc_pls_test*100], w_ov,</w:t>
-        <w:br/>
-        <w:t xml:space="preserve">            color='steelblue', edgecolor='k', lw=0.8, label='PLS-DA')</w:t>
-        <w:br/>
-        <w:t>b2 = ax.bar(x_ov + w_ov/2, [acc_svm_cv*100, acc_svm_test*100], w_ov,</w:t>
-        <w:br/>
-        <w:t xml:space="preserve">            color='darkorange', edgecolor='k', lw=0.8, label='SVM-RBF')</w:t>
-        <w:br/>
-        <w:t>for bar in list(b1)+list(b2):</w:t>
-        <w:br/>
-        <w:t xml:space="preserve">    ax.text(bar.get_x()+bar.get_width()/2, bar.get_height()+0.8,</w:t>
-        <w:br/>
-        <w:t xml:space="preserve">            '%.1f%%' % bar.get_height(), ha='center', va='bottom',</w:t>
-        <w:br/>
-        <w:t xml:space="preserve">            fontsize=11, fontweight='bold')</w:t>
-        <w:br/>
-        <w:t>ax.axhline(100, color='grey', ls=':', lw=1)</w:t>
-        <w:br/>
-        <w:t>ax.set_xticks(x_ov); ax.set_xticklabels(groups, fontsize=10)</w:t>
-        <w:br/>
-        <w:t>ax.set_ylabel('Accuracy (%)', fontsize=12); ax.set_ylim(0, 118)</w:t>
-        <w:br/>
-        <w:t>ax.set_title('Overall Accuracy', fontsize=11, fontweight='bold')</w:t>
-        <w:br/>
-        <w:t>ax.legend(fontsize=10); ax.grid(True, alpha=0.2, axis='y')</w:t>
-        <w:br/>
-        <w:br/>
-        <w:t># Panel 2: Per-class accuracy (5-fold CV)</w:t>
-        <w:br/>
-        <w:t>ax = axes[1]</w:t>
-        <w:br/>
-        <w:t>b1 = ax.bar(xc-wc/2, pls_acc_cv_v, wc, color='steelblue',  edgecolor='k', lw=0.7, label='PLS-DA')</w:t>
-        <w:br/>
-        <w:t>b2 = ax.bar(xc+wc/2, svm_acc_cv_v, wc, color='darkorange', edgecolor='k', lw=0.7, label='SVM-RBF')</w:t>
-        <w:br/>
-        <w:t>for bar in list(b1)+list(b2):</w:t>
-        <w:br/>
-        <w:t xml:space="preserve">    ax.text(bar.get_x()+bar.get_width()/2, bar.get_height()+0.6,</w:t>
-        <w:br/>
-        <w:t xml:space="preserve">            '%.1f%%' % bar.get_height(), ha='center', va='bottom',</w:t>
       </w:r>
     </w:p>
     <w:p>
@@ -2301,6 +2298,63 @@
           <w:rFonts w:ascii="Courier New" w:hAnsi="Courier New"/>
           <w:sz w:val="16"/>
         </w:rPr>
+        <w:t>svm_acc_te_v,  svm_rec_te_v  = per_class_metrics(cm_svm_test)</w:t>
+        <w:br/>
+        <w:br/>
+        <w:t>fig, axes = plt.subplots(1, 3, figsize=(18, 6))</w:t>
+        <w:br/>
+        <w:t>x_ov = np.arange(2); w_ov = 0.28</w:t>
+        <w:br/>
+        <w:t>groups   = ['5-fold CV\n(train n=60)', 'External Test\n(Gr only, n=10)']</w:t>
+        <w:br/>
+        <w:t>xc = np.arange(len(CLASS_LABELS)); wc = 0.30</w:t>
+        <w:br/>
+        <w:br/>
+        <w:t># Panel 1: Overall accuracy</w:t>
+        <w:br/>
+        <w:t>ax = axes[0]</w:t>
+        <w:br/>
+        <w:t>b1 = ax.bar(x_ov - w_ov/2, [acc_pls_cv*100, acc_pls_test*100], w_ov,</w:t>
+        <w:br/>
+        <w:t xml:space="preserve">            color='steelblue', edgecolor='k', lw=0.8, label='PLS-DA')</w:t>
+        <w:br/>
+        <w:t>b2 = ax.bar(x_ov + w_ov/2, [acc_svm_cv*100, acc_svm_test*100], w_ov,</w:t>
+        <w:br/>
+        <w:t xml:space="preserve">            color='darkorange', edgecolor='k', lw=0.8, label='SVM-RBF')</w:t>
+        <w:br/>
+        <w:t>for bar in list(b1)+list(b2):</w:t>
+        <w:br/>
+        <w:t xml:space="preserve">    ax.text(bar.get_x()+bar.get_width()/2, bar.get_height()+0.8,</w:t>
+        <w:br/>
+        <w:t xml:space="preserve">            '%.1f%%' % bar.get_height(), ha='center', va='bottom',</w:t>
+        <w:br/>
+        <w:t xml:space="preserve">            fontsize=11, fontweight='bold')</w:t>
+        <w:br/>
+        <w:t>ax.axhline(100, color='grey', ls=':', lw=1)</w:t>
+        <w:br/>
+        <w:t>ax.set_xticks(x_ov); ax.set_xticklabels(groups, fontsize=10)</w:t>
+        <w:br/>
+        <w:t>ax.set_ylabel('Accuracy (%)', fontsize=12); ax.set_ylim(0, 118)</w:t>
+        <w:br/>
+        <w:t>ax.set_title('Overall Accuracy', fontsize=11, fontweight='bold')</w:t>
+        <w:br/>
+        <w:t>ax.legend(fontsize=10); ax.grid(True, alpha=0.2, axis='y')</w:t>
+        <w:br/>
+        <w:br/>
+        <w:t># Panel 2: Per-class accuracy (5-fold CV)</w:t>
+        <w:br/>
+        <w:t>ax = axes[1]</w:t>
+        <w:br/>
+        <w:t>b1 = ax.bar(xc-wc/2, pls_acc_cv_v, wc, color='steelblue',  edgecolor='k', lw=0.7, label='PLS-DA')</w:t>
+        <w:br/>
+        <w:t>b2 = ax.bar(xc+wc/2, svm_acc_cv_v, wc, color='darkorange', edgecolor='k', lw=0.7, label='SVM-RBF')</w:t>
+        <w:br/>
+        <w:t>for bar in list(b1)+list(b2):</w:t>
+        <w:br/>
+        <w:t xml:space="preserve">    ax.text(bar.get_x()+bar.get_width()/2, bar.get_height()+0.6,</w:t>
+        <w:br/>
+        <w:t xml:space="preserve">            '%.1f%%' % bar.get_height(), ha='center', va='bottom',</w:t>
+        <w:br/>
         <w:t xml:space="preserve">            fontsize=9, fontweight='bold')</w:t>
         <w:br/>
         <w:t>ax.axhline(100, color='grey', ls=':', lw=1)</w:t>
@@ -2319,63 +2373,6 @@
         <w:t>ax = axes[2]</w:t>
         <w:br/>
         <w:t>b1 = ax.bar(xc-wc/2, pls_acc_te_v, wc, color='steelblue',  edgecolor='k', lw=0.7, label='PLS-DA')</w:t>
-        <w:br/>
-        <w:t>b2 = ax.bar(xc+wc/2, svm_acc_te_v, wc, color='darkorange', edgecolor='k', lw=0.7, label='SVM-RBF')</w:t>
-        <w:br/>
-        <w:t>for bar in list(b1)+list(b2):</w:t>
-        <w:br/>
-        <w:t xml:space="preserve">    ax.text(bar.get_x()+bar.get_width()/2, bar.get_height()+0.6,</w:t>
-        <w:br/>
-        <w:t xml:space="preserve">            '%.1f%%' % bar.get_height(), ha='center', va='bottom',</w:t>
-        <w:br/>
-        <w:t xml:space="preserve">            fontsize=9, fontweight='bold')</w:t>
-        <w:br/>
-        <w:t>ax.axhline(100, color='grey', ls=':', lw=1)</w:t>
-        <w:br/>
-        <w:t>ax.set_xticks(xc); ax.set_xticklabels(CLASS_LABELS, fontsize=10)</w:t>
-        <w:br/>
-        <w:t>ax.set_ylabel('Accuracy (%)', fontsize=12); ax.set_ylim(0, 118)</w:t>
-        <w:br/>
-        <w:t>ax.set_title('Per-Class Accuracy\nExternal Test', fontsize=11, fontweight='bold')</w:t>
-        <w:br/>
-        <w:t>ax.legend(fontsize=10); ax.grid(True, alpha=0.2, axis='y')</w:t>
-        <w:br/>
-        <w:br/>
-        <w:t>fig.suptitle('Accuracy  |  Binary: PDMS vs SiO2/Si  |  PLS-DA vs SVM-RBF  |  ' + TITLE_SUF,</w:t>
-        <w:br/>
-        <w:t xml:space="preserve">             fontsize=11, fontweight='bold')</w:t>
-        <w:br/>
-        <w:t>fig.tight_layout()</w:t>
-        <w:br/>
-        <w:t>save_fig(fig, '14_Accuracy_Comparison.png')</w:t>
-        <w:br/>
-        <w:br/>
-        <w:t># =============================================================================</w:t>
-        <w:br/>
-        <w:t># 22. RECALL COMPARISON  (3-panel)</w:t>
-        <w:br/>
-        <w:t>#     P1: Macro recall  P2: Per-class recall CV  P3: Per-class recall Test</w:t>
-        <w:br/>
-        <w:t># =============================================================================</w:t>
-        <w:br/>
-        <w:t>fig, axes = plt.subplots(1, 3, figsize=(18, 6))</w:t>
-        <w:br/>
-        <w:br/>
-        <w:t># Panel 1: Macro recall</w:t>
-        <w:br/>
-        <w:t>ax = axes[0]</w:t>
-        <w:br/>
-        <w:t>b1 = ax.bar(x_ov-w_ov/2, [pls_rec_cv_v.mean(), pls_rec_te_v.mean()], w_ov,</w:t>
-        <w:br/>
-        <w:t xml:space="preserve">            color='steelblue', edgecolor='k', lw=0.8, label='PLS-DA')</w:t>
-        <w:br/>
-        <w:t>b2 = ax.bar(x_ov+w_ov/2, [svm_rec_cv_v.mean(), svm_rec_te_v.mean()], w_ov,</w:t>
-        <w:br/>
-        <w:t xml:space="preserve">            color='darkorange', edgecolor='k', lw=0.8, label='SVM-RBF')</w:t>
-        <w:br/>
-        <w:t>for bar in list(b1)+list(b2):</w:t>
-        <w:br/>
-        <w:t xml:space="preserve">    ax.text(bar.get_x()+bar.get_width()/2, bar.get_height()+0.8,</w:t>
       </w:r>
     </w:p>
     <w:p>
@@ -2388,8 +2385,65 @@
           <w:rFonts w:ascii="Courier New" w:hAnsi="Courier New"/>
           <w:sz w:val="16"/>
         </w:rPr>
+        <w:t>b2 = ax.bar(xc+wc/2, svm_acc_te_v, wc, color='darkorange', edgecolor='k', lw=0.7, label='SVM-RBF')</w:t>
+        <w:br/>
+        <w:t>for bar in list(b1)+list(b2):</w:t>
+        <w:br/>
+        <w:t xml:space="preserve">    ax.text(bar.get_x()+bar.get_width()/2, bar.get_height()+0.6,</w:t>
+        <w:br/>
         <w:t xml:space="preserve">            '%.1f%%' % bar.get_height(), ha='center', va='bottom',</w:t>
         <w:br/>
+        <w:t xml:space="preserve">            fontsize=9, fontweight='bold')</w:t>
+        <w:br/>
+        <w:t>ax.axhline(100, color='grey', ls=':', lw=1)</w:t>
+        <w:br/>
+        <w:t>ax.set_xticks(xc); ax.set_xticklabels(CLASS_LABELS, fontsize=10)</w:t>
+        <w:br/>
+        <w:t>ax.set_ylabel('Accuracy (%)', fontsize=12); ax.set_ylim(0, 118)</w:t>
+        <w:br/>
+        <w:t>ax.set_title('Per-Class Accuracy\nExternal Test (Gr only)', fontsize=11, fontweight='bold')</w:t>
+        <w:br/>
+        <w:t>ax.legend(fontsize=10); ax.grid(True, alpha=0.2, axis='y')</w:t>
+        <w:br/>
+        <w:br/>
+        <w:t>fig.suptitle('Accuracy  |  PDMS vs SiO2/Si  |  PLS-DA vs SVM-RBF  |  ' + TITLE_SUF,</w:t>
+        <w:br/>
+        <w:t xml:space="preserve">             fontsize=11, fontweight='bold')</w:t>
+        <w:br/>
+        <w:t>fig.tight_layout()</w:t>
+        <w:br/>
+        <w:t>save_fig(fig, '14_Accuracy_Comparison.png')</w:t>
+        <w:br/>
+        <w:br/>
+        <w:t># =============================================================================</w:t>
+        <w:br/>
+        <w:t># 22. RECALL COMPARISON  (3-panel)</w:t>
+        <w:br/>
+        <w:t>#     P1: Macro recall  P2: Per-class recall CV  P3: Per-class recall Test</w:t>
+        <w:br/>
+        <w:t># =============================================================================</w:t>
+        <w:br/>
+        <w:t>fig, axes = plt.subplots(1, 3, figsize=(18, 6))</w:t>
+        <w:br/>
+        <w:br/>
+        <w:t># Panel 1: Macro recall</w:t>
+        <w:br/>
+        <w:t>ax = axes[0]</w:t>
+        <w:br/>
+        <w:t>b1 = ax.bar(x_ov-w_ov/2, [pls_rec_cv_v.mean(), pls_rec_te_v.mean()], w_ov,</w:t>
+        <w:br/>
+        <w:t xml:space="preserve">            color='steelblue', edgecolor='k', lw=0.8, label='PLS-DA')</w:t>
+        <w:br/>
+        <w:t>b2 = ax.bar(x_ov+w_ov/2, [svm_rec_cv_v.mean(), svm_rec_te_v.mean()], w_ov,</w:t>
+        <w:br/>
+        <w:t xml:space="preserve">            color='darkorange', edgecolor='k', lw=0.8, label='SVM-RBF')</w:t>
+        <w:br/>
+        <w:t>for bar in list(b1)+list(b2):</w:t>
+        <w:br/>
+        <w:t xml:space="preserve">    ax.text(bar.get_x()+bar.get_width()/2, bar.get_height()+0.8,</w:t>
+        <w:br/>
+        <w:t xml:space="preserve">            '%.1f%%' % bar.get_height(), ha='center', va='bottom',</w:t>
+        <w:br/>
         <w:t xml:space="preserve">            fontsize=11, fontweight='bold')</w:t>
         <w:br/>
         <w:t>ax.axhline(100, color='grey', ls=':', lw=1)</w:t>
@@ -2406,64 +2460,6 @@
         <w:t># Panel 2: Per-class recall (5-fold CV)</w:t>
         <w:br/>
         <w:t>ax = axes[1]</w:t>
-        <w:br/>
-        <w:t>b1 = ax.bar(xc-wc/2, pls_rec_cv_v, wc, color='steelblue',  edgecolor='k', lw=0.7, label='PLS-DA')</w:t>
-        <w:br/>
-        <w:t>b2 = ax.bar(xc+wc/2, svm_rec_cv_v, wc, color='darkorange', edgecolor='k', lw=0.7, label='SVM-RBF')</w:t>
-        <w:br/>
-        <w:t>for bar in list(b1)+list(b2):</w:t>
-        <w:br/>
-        <w:t xml:space="preserve">    ax.text(bar.get_x()+bar.get_width()/2, bar.get_height()+1.5,</w:t>
-        <w:br/>
-        <w:t xml:space="preserve">            '%.0f%%' % bar.get_height(), ha='center', va='bottom',</w:t>
-        <w:br/>
-        <w:t xml:space="preserve">            fontsize=9, fontweight='bold')</w:t>
-        <w:br/>
-        <w:t>ax.axhline(100, color='grey', ls=':', lw=1)</w:t>
-        <w:br/>
-        <w:t>ax.set_xticks(xc); ax.set_xticklabels(CLASS_LABELS, fontsize=10)</w:t>
-        <w:br/>
-        <w:t>ax.set_ylabel('Recall (%)', fontsize=12); ax.set_ylim(0, 122)</w:t>
-        <w:br/>
-        <w:t>ax.set_title('Per-Class Recall\n5-fold CV (train)', fontsize=11, fontweight='bold')</w:t>
-        <w:br/>
-        <w:t>ax.legend(fontsize=10); ax.grid(True, alpha=0.2, axis='y')</w:t>
-        <w:br/>
-        <w:br/>
-        <w:t># Panel 3: Per-class recall (External Test)</w:t>
-        <w:br/>
-        <w:t>ax = axes[2]</w:t>
-        <w:br/>
-        <w:t>b1 = ax.bar(xc-wc/2, pls_rec_te_v, wc, color='steelblue',  edgecolor='k', lw=0.7, label='PLS-DA')</w:t>
-        <w:br/>
-        <w:t>b2 = ax.bar(xc+wc/2, svm_rec_te_v, wc, color='darkorange', edgecolor='k', lw=0.7, label='SVM-RBF')</w:t>
-        <w:br/>
-        <w:t>for bar in list(b1)+list(b2):</w:t>
-        <w:br/>
-        <w:t xml:space="preserve">    ax.text(bar.get_x()+bar.get_width()/2, bar.get_height()+1.5,</w:t>
-        <w:br/>
-        <w:t xml:space="preserve">            '%.0f%%' % bar.get_height(), ha='center', va='bottom',</w:t>
-        <w:br/>
-        <w:t xml:space="preserve">            fontsize=9, fontweight='bold')</w:t>
-        <w:br/>
-        <w:t>ax.axhline(100, color='grey', ls=':', lw=1)</w:t>
-        <w:br/>
-        <w:t>ax.set_xticks(xc); ax.set_xticklabels(CLASS_LABELS, fontsize=10)</w:t>
-        <w:br/>
-        <w:t>ax.set_ylabel('Recall (%)', fontsize=12); ax.set_ylim(0, 122)</w:t>
-        <w:br/>
-        <w:t>ax.set_title('Per-Class Recall\nExternal Test', fontsize=11, fontweight='bold')</w:t>
-        <w:br/>
-        <w:t>ax.legend(fontsize=10); ax.grid(True, alpha=0.2, axis='y')</w:t>
-        <w:br/>
-        <w:br/>
-        <w:t>fig.suptitle('Recall  |  Binary: PDMS vs SiO2/Si  |  PLS-DA vs SVM-RBF  |  ' + TITLE_SUF,</w:t>
-        <w:br/>
-        <w:t xml:space="preserve">             fontsize=12, fontweight='bold')</w:t>
-        <w:br/>
-        <w:t>fig.tight_layout()</w:t>
-        <w:br/>
-        <w:t>save_fig(fig, '15_Recall_Comparison.png')</w:t>
       </w:r>
     </w:p>
     <w:p>
@@ -2476,6 +2472,64 @@
           <w:rFonts w:ascii="Courier New" w:hAnsi="Courier New"/>
           <w:sz w:val="16"/>
         </w:rPr>
+        <w:t>b1 = ax.bar(xc-wc/2, pls_rec_cv_v, wc, color='steelblue',  edgecolor='k', lw=0.7, label='PLS-DA')</w:t>
+        <w:br/>
+        <w:t>b2 = ax.bar(xc+wc/2, svm_rec_cv_v, wc, color='darkorange', edgecolor='k', lw=0.7, label='SVM-RBF')</w:t>
+        <w:br/>
+        <w:t>for bar in list(b1)+list(b2):</w:t>
+        <w:br/>
+        <w:t xml:space="preserve">    ax.text(bar.get_x()+bar.get_width()/2, bar.get_height()+1.5,</w:t>
+        <w:br/>
+        <w:t xml:space="preserve">            '%.0f%%' % bar.get_height(), ha='center', va='bottom',</w:t>
+        <w:br/>
+        <w:t xml:space="preserve">            fontsize=9, fontweight='bold')</w:t>
+        <w:br/>
+        <w:t>ax.axhline(100, color='grey', ls=':', lw=1)</w:t>
+        <w:br/>
+        <w:t>ax.set_xticks(xc); ax.set_xticklabels(CLASS_LABELS, fontsize=10)</w:t>
+        <w:br/>
+        <w:t>ax.set_ylabel('Recall (%)', fontsize=12); ax.set_ylim(0, 122)</w:t>
+        <w:br/>
+        <w:t>ax.set_title('Per-Class Recall\n5-fold CV (train)', fontsize=11, fontweight='bold')</w:t>
+        <w:br/>
+        <w:t>ax.legend(fontsize=10); ax.grid(True, alpha=0.2, axis='y')</w:t>
+        <w:br/>
+        <w:br/>
+        <w:t># Panel 3: Per-class recall (External Test)</w:t>
+        <w:br/>
+        <w:t>ax = axes[2]</w:t>
+        <w:br/>
+        <w:t>b1 = ax.bar(xc-wc/2, pls_rec_te_v, wc, color='steelblue',  edgecolor='k', lw=0.7, label='PLS-DA')</w:t>
+        <w:br/>
+        <w:t>b2 = ax.bar(xc+wc/2, svm_rec_te_v, wc, color='darkorange', edgecolor='k', lw=0.7, label='SVM-RBF')</w:t>
+        <w:br/>
+        <w:t>for bar in list(b1)+list(b2):</w:t>
+        <w:br/>
+        <w:t xml:space="preserve">    ax.text(bar.get_x()+bar.get_width()/2, bar.get_height()+1.5,</w:t>
+        <w:br/>
+        <w:t xml:space="preserve">            '%.0f%%' % bar.get_height(), ha='center', va='bottom',</w:t>
+        <w:br/>
+        <w:t xml:space="preserve">            fontsize=9, fontweight='bold')</w:t>
+        <w:br/>
+        <w:t>ax.axhline(100, color='grey', ls=':', lw=1)</w:t>
+        <w:br/>
+        <w:t>ax.set_xticks(xc); ax.set_xticklabels(CLASS_LABELS, fontsize=10)</w:t>
+        <w:br/>
+        <w:t>ax.set_ylabel('Recall (%)', fontsize=12); ax.set_ylim(0, 122)</w:t>
+        <w:br/>
+        <w:t>ax.set_title('Per-Class Recall\nExternal Test (Gr only)', fontsize=11, fontweight='bold')</w:t>
+        <w:br/>
+        <w:t>ax.legend(fontsize=10); ax.grid(True, alpha=0.2, axis='y')</w:t>
+        <w:br/>
+        <w:br/>
+        <w:t>fig.suptitle('Recall  |  PDMS vs SiO2/Si  |  PLS-DA vs SVM-RBF  |  ' + TITLE_SUF,</w:t>
+        <w:br/>
+        <w:t xml:space="preserve">             fontsize=12, fontweight='bold')</w:t>
+        <w:br/>
+        <w:t>fig.tight_layout()</w:t>
+        <w:br/>
+        <w:t>save_fig(fig, '15_Recall_Comparison.png')</w:t>
+        <w:br/>
         <w:br/>
         <w:t># =============================================================================</w:t>
         <w:br/>
@@ -2493,63 +2547,6 @@
         <w:t xml:space="preserve">    idx = classes == cls</w:t>
         <w:br/>
         <w:t xml:space="preserve">    m = X_all_sm[idx].mean(axis=0)</w:t>
-        <w:br/>
-        <w:t xml:space="preserve">    s = X_all_sm[idx].std(axis=0)</w:t>
-        <w:br/>
-        <w:t xml:space="preserve">    ax.plot(wavenumbers, m, color=PALETTE[cls], lw=2.0, label='%s (n=%d)' % (cls, idx.sum()))</w:t>
-        <w:br/>
-        <w:t xml:space="preserve">    ax.fill_between(wavenumbers, m-s, m+s, color=PALETTE[cls], alpha=0.15)</w:t>
-        <w:br/>
-        <w:t>ax.set_xlim(WAVENUMBER_MIN, WAVENUMBER_MAX)</w:t>
-        <w:br/>
-        <w:t>ax.set_xlabel('Wavenumber (cm⁻¹)', fontsize=12)</w:t>
-        <w:br/>
-        <w:t>ax.set_ylabel('Intensity (a.u.)', fontsize=12)</w:t>
-        <w:br/>
-        <w:t>ax.set_title('Mean Raman Spectra ± 1 SD  |  Binary Classes  |  %d–%d cm⁻¹' % (</w:t>
-        <w:br/>
-        <w:t xml:space="preserve">    WAVENUMBER_MIN, WAVENUMBER_MAX), fontsize=11, fontweight='bold')</w:t>
-        <w:br/>
-        <w:t>ax.legend(fontsize=10); ax.grid(True, alpha=0.25)</w:t>
-        <w:br/>
-        <w:t>fig.tight_layout()</w:t>
-        <w:br/>
-        <w:t>save_fig(fig, '16_Mean_Spectra.png')</w:t>
-        <w:br/>
-        <w:br/>
-        <w:t># =============================================================================</w:t>
-        <w:br/>
-        <w:t># 24. SAVE ALL RESULTS TO EXCEL</w:t>
-        <w:br/>
-        <w:t># =============================================================================</w:t>
-        <w:br/>
-        <w:t>out_xlsx = os.path.join(OUTPUT_DIR, 'Results_Binary.xlsx')</w:t>
-        <w:br/>
-        <w:br/>
-        <w:t>with pd.ExcelWriter(out_xlsx, engine='openpyxl') as writer:</w:t>
-        <w:br/>
-        <w:br/>
-        <w:t xml:space="preserve">    # Summary</w:t>
-        <w:br/>
-        <w:t xml:space="preserve">    rows = [</w:t>
-        <w:br/>
-        <w:t xml:space="preserve">        ('Input file',                         FILE_NAME),</w:t>
-        <w:br/>
-        <w:t xml:space="preserve">        ('Binary Class 1 (PDMS)',              'SSY-PDMS + SSY-Gr-PDMS  (n=40)'),</w:t>
-        <w:br/>
-        <w:t xml:space="preserve">        ('Binary Class 2 (SiO2/Si)',           'SSY-SiO2/Si + SSY-Gr-SiO2/Si  (n=40)'),</w:t>
-        <w:br/>
-        <w:t xml:space="preserve">        ('Spectral window (cm-1)',              '%d-%d' % (WAVENUMBER_MIN, WAVENUMBER_MAX)),</w:t>
-        <w:br/>
-        <w:t xml:space="preserve">        ('Spectral points in window',           X_crop.shape[1]),</w:t>
-        <w:br/>
-        <w:t xml:space="preserve">        ('SG window / poly',                    '%d/%d' % (SG_WINDOW, SG_POLY)),</w:t>
-        <w:br/>
-        <w:t xml:space="preserve">        ('VIP &gt; 1 (initial model)',             n_vip_gt1),</w:t>
-        <w:br/>
-        <w:t xml:space="preserve">        ('VIP top-N selected',                  top_n),</w:t>
-        <w:br/>
-        <w:t xml:space="preserve">        ('N latent variables (PLS-DA)',         N_COMPONENTS),</w:t>
       </w:r>
     </w:p>
     <w:p>
@@ -2562,11 +2559,70 @@
           <w:rFonts w:ascii="Courier New" w:hAnsi="Courier New"/>
           <w:sz w:val="16"/>
         </w:rPr>
+        <w:t xml:space="preserve">    s = X_all_sm[idx].std(axis=0)</w:t>
+        <w:br/>
+        <w:t xml:space="preserve">    ax.plot(wavenumbers, m, color=PALETTE[cls], lw=2.0, label='%s (n=%d)' % (cls, idx.sum()))</w:t>
+        <w:br/>
+        <w:t xml:space="preserve">    ax.fill_between(wavenumbers, m-s, m+s, color=PALETTE[cls], alpha=0.15)</w:t>
+        <w:br/>
+        <w:t>ax.set_xlim(WAVENUMBER_MIN, WAVENUMBER_MAX)</w:t>
+        <w:br/>
+        <w:t>ax.set_xlabel('Wavenumber (cm⁻¹)', fontsize=12)</w:t>
+        <w:br/>
+        <w:t>ax.set_ylabel('Intensity (a.u.)', fontsize=12)</w:t>
+        <w:br/>
+        <w:t>ax.set_title('Mean Raman Spectra ± 1 SD  |  Binary Classes  |  %d–%d cm⁻¹' % (</w:t>
+        <w:br/>
+        <w:t xml:space="preserve">    WAVENUMBER_MIN, WAVENUMBER_MAX), fontsize=11, fontweight='bold')</w:t>
+        <w:br/>
+        <w:t>ax.legend(fontsize=10); ax.grid(True, alpha=0.25)</w:t>
+        <w:br/>
+        <w:t>fig.tight_layout()</w:t>
+        <w:br/>
+        <w:t>save_fig(fig, '16_Mean_Spectra.png')</w:t>
+        <w:br/>
+        <w:br/>
+        <w:t># =============================================================================</w:t>
+        <w:br/>
+        <w:t># 24. SAVE ALL RESULTS TO EXCEL</w:t>
+        <w:br/>
+        <w:t># =============================================================================</w:t>
+        <w:br/>
+        <w:t>out_xlsx = os.path.join(OUTPUT_DIR, 'Results_Binary.xlsx')</w:t>
+        <w:br/>
+        <w:br/>
+        <w:t>with pd.ExcelWriter(out_xlsx, engine='openpyxl') as writer:</w:t>
+        <w:br/>
+        <w:br/>
+        <w:t xml:space="preserve">    # Summary</w:t>
+        <w:br/>
+        <w:t xml:space="preserve">    rows = [</w:t>
+        <w:br/>
+        <w:t xml:space="preserve">        ('Input file',                         FILE_NAME),</w:t>
+        <w:br/>
+        <w:t xml:space="preserve">        ('Binary Class 1 (PDMS)',              'PDMS + Gr-PDMS  (n=40 total)'),</w:t>
+        <w:br/>
+        <w:t xml:space="preserve">        ('Binary Class 2 (SiO2/Si)',           'SiO2/Si + Gr-SiO2/Si  (n=40 total)'),</w:t>
+        <w:br/>
+        <w:t xml:space="preserve">        ('Spectral window (cm-1)',              '%d-%d' % (WAVENUMBER_MIN, WAVENUMBER_MAX)),</w:t>
+        <w:br/>
+        <w:t xml:space="preserve">        ('Spectral points in window',           X_crop.shape[1]),</w:t>
+        <w:br/>
+        <w:t xml:space="preserve">        ('SG window / poly',                    '%d/%d' % (SG_WINDOW, SG_POLY)),</w:t>
+        <w:br/>
+        <w:t xml:space="preserve">        ('VIP &gt; 1 (initial model)',             n_vip_gt1),</w:t>
+        <w:br/>
+        <w:t xml:space="preserve">        ('VIP top-N selected',                  top_n),</w:t>
+        <w:br/>
+        <w:t xml:space="preserve">        ('N latent variables (PLS-DA)',         N_COMPONENTS),</w:t>
+        <w:br/>
         <w:t xml:space="preserve">        ('Total samples',                       len(y)),</w:t>
         <w:br/>
-        <w:t xml:space="preserve">        ('Training set',                        '%d (30 PDMS + 30 SiO2/Si)' % len(y_train)),</w:t>
-        <w:br/>
-        <w:t xml:space="preserve">        ('Test set',                            '%d (10 PDMS + 10 SiO2/Si)' % len(y_test)),</w:t>
+        <w:t xml:space="preserve">        ('Training set',                        '%d (15 Gr-PDMS + 15 PDMS + 15 Gr-SiO2/Si + 15 SiO2/Si)' % len(y_train)),</w:t>
+        <w:br/>
+        <w:t xml:space="preserve">        ('Test set',                            '%d — Gr only (5 Gr-PDMS + 5 Gr-SiO2/Si)' % len(y_test)),</w:t>
+        <w:br/>
+        <w:t xml:space="preserve">        ('Excluded (no-Gr)',                    '10 spectra excluded entirely (5 per class)'),</w:t>
         <w:br/>
         <w:t xml:space="preserve">        ('', ''),</w:t>
         <w:br/>
@@ -2579,67 +2635,6 @@
         <w:t xml:space="preserve">        ('PLS-DA External test acc (%)',        '%.2f' % (acc_pls_test * 100)),</w:t>
         <w:br/>
         <w:t xml:space="preserve">        ('PLS-DA Permutation p-value',          '%.4f' % p_val),</w:t>
-        <w:br/>
-        <w:t xml:space="preserve">        ('PLS-DA Permutation result',</w:t>
-        <w:br/>
-        <w:t xml:space="preserve">         'Significant (p&lt;0.05)' if p_val &lt; 0.05 else 'NOT significant'),</w:t>
-        <w:br/>
-        <w:t xml:space="preserve">        ('', ''),</w:t>
-        <w:br/>
-        <w:t xml:space="preserve">        ('--- SVM-RBF ---',                     ''),</w:t>
-        <w:br/>
-        <w:t xml:space="preserve">        ('SVM-RBF 5-fold CV acc (%)',           '%.2f' % (acc_svm_cv   * 100)),</w:t>
-        <w:br/>
-        <w:t xml:space="preserve">        ('SVM-RBF External test acc (%)',       '%.2f' % (acc_svm_test * 100)),</w:t>
-        <w:br/>
-        <w:t xml:space="preserve">        ('SVM kernel', 'RBF'), ('SVM C', 10), ('SVM gamma', 'scale'),</w:t>
-        <w:br/>
-        <w:t xml:space="preserve">    ]</w:t>
-        <w:br/>
-        <w:t xml:space="preserve">    for i, r2 in enumerate(r2x_cum, 1):</w:t>
-        <w:br/>
-        <w:t xml:space="preserve">        rows.append(('R2X cumulative LV%d (%%)' % i, '%.4f' % (r2 * 100)))</w:t>
-        <w:br/>
-        <w:t xml:space="preserve">    pd.DataFrame(rows, columns=['Metric', 'Value']).to_excel(</w:t>
-        <w:br/>
-        <w:t xml:space="preserve">        writer, sheet_name='Summary', index=False)</w:t>
-        <w:br/>
-        <w:br/>
-        <w:t xml:space="preserve">    # Per-class Accuracy &amp; Recall</w:t>
-        <w:br/>
-        <w:t xml:space="preserve">    cls_rows = []</w:t>
-        <w:br/>
-        <w:t xml:space="preserve">    for i, cls in enumerate(CLASS_LABELS):</w:t>
-        <w:br/>
-        <w:t xml:space="preserve">        cls_rows.append({</w:t>
-        <w:br/>
-        <w:t xml:space="preserve">            'Class':                 cls,</w:t>
-        <w:br/>
-        <w:t xml:space="preserve">            'N_Train':               int(cm_pls_cv[i,:].sum()),</w:t>
-        <w:br/>
-        <w:t xml:space="preserve">            'N_Test':                int(cm_pls_test[i,:].sum()),</w:t>
-        <w:br/>
-        <w:t xml:space="preserve">            'PLSDA_CV_Accuracy_%':   '%.2f' % pls_acc_cv_v[i],</w:t>
-        <w:br/>
-        <w:t xml:space="preserve">            'PLSDA_CV_Recall_%':     '%.2f' % pls_rec_cv_v[i],</w:t>
-        <w:br/>
-        <w:t xml:space="preserve">            'PLSDA_Test_Accuracy_%': '%.2f' % pls_acc_te_v[i],</w:t>
-        <w:br/>
-        <w:t xml:space="preserve">            'PLSDA_Test_Recall_%':   '%.2f' % pls_rec_te_v[i],</w:t>
-        <w:br/>
-        <w:t xml:space="preserve">            'SVM_CV_Accuracy_%':     '%.2f' % svm_acc_cv_v[i],</w:t>
-        <w:br/>
-        <w:t xml:space="preserve">            'SVM_CV_Recall_%':       '%.2f' % svm_rec_cv_v[i],</w:t>
-        <w:br/>
-        <w:t xml:space="preserve">            'SVM_Test_Accuracy_%':   '%.2f' % svm_acc_te_v[i],</w:t>
-        <w:br/>
-        <w:t xml:space="preserve">            'SVM_Test_Recall_%':     '%.2f' % svm_rec_te_v[i],</w:t>
-        <w:br/>
-        <w:t xml:space="preserve">        })</w:t>
-        <w:br/>
-        <w:t xml:space="preserve">    pd.DataFrame(cls_rows).to_excel(</w:t>
-        <w:br/>
-        <w:t xml:space="preserve">        writer, sheet_name='Per_Class_Metrics', index=False)</w:t>
       </w:r>
     </w:p>
     <w:p>
@@ -2652,6 +2647,67 @@
           <w:rFonts w:ascii="Courier New" w:hAnsi="Courier New"/>
           <w:sz w:val="16"/>
         </w:rPr>
+        <w:t xml:space="preserve">        ('PLS-DA Permutation result',</w:t>
+        <w:br/>
+        <w:t xml:space="preserve">         'Significant (p&lt;0.05)' if p_val &lt; 0.05 else 'NOT significant'),</w:t>
+        <w:br/>
+        <w:t xml:space="preserve">        ('', ''),</w:t>
+        <w:br/>
+        <w:t xml:space="preserve">        ('--- SVM-RBF ---',                     ''),</w:t>
+        <w:br/>
+        <w:t xml:space="preserve">        ('SVM-RBF 5-fold CV acc (%)',           '%.2f' % (acc_svm_cv   * 100)),</w:t>
+        <w:br/>
+        <w:t xml:space="preserve">        ('SVM-RBF External test acc (%)',       '%.2f' % (acc_svm_test * 100)),</w:t>
+        <w:br/>
+        <w:t xml:space="preserve">        ('SVM kernel', 'RBF'), ('SVM C', 10), ('SVM gamma', 'scale'),</w:t>
+        <w:br/>
+        <w:t xml:space="preserve">    ]</w:t>
+        <w:br/>
+        <w:t xml:space="preserve">    for i, r2 in enumerate(r2x_cum, 1):</w:t>
+        <w:br/>
+        <w:t xml:space="preserve">        rows.append(('R2X cumulative LV%d (%%)' % i, '%.4f' % (r2 * 100)))</w:t>
+        <w:br/>
+        <w:t xml:space="preserve">    pd.DataFrame(rows, columns=['Metric', 'Value']).to_excel(</w:t>
+        <w:br/>
+        <w:t xml:space="preserve">        writer, sheet_name='Summary', index=False)</w:t>
+        <w:br/>
+        <w:br/>
+        <w:t xml:space="preserve">    # Per-class Accuracy &amp; Recall</w:t>
+        <w:br/>
+        <w:t xml:space="preserve">    cls_rows = []</w:t>
+        <w:br/>
+        <w:t xml:space="preserve">    for i, cls in enumerate(CLASS_LABELS):</w:t>
+        <w:br/>
+        <w:t xml:space="preserve">        cls_rows.append({</w:t>
+        <w:br/>
+        <w:t xml:space="preserve">            'Class':                 cls,</w:t>
+        <w:br/>
+        <w:t xml:space="preserve">            'N_Train':               int(cm_pls_cv[i,:].sum()),</w:t>
+        <w:br/>
+        <w:t xml:space="preserve">            'N_Test':                int(cm_pls_test[i,:].sum()),</w:t>
+        <w:br/>
+        <w:t xml:space="preserve">            'PLSDA_CV_Accuracy_%':   '%.2f' % pls_acc_cv_v[i],</w:t>
+        <w:br/>
+        <w:t xml:space="preserve">            'PLSDA_CV_Recall_%':     '%.2f' % pls_rec_cv_v[i],</w:t>
+        <w:br/>
+        <w:t xml:space="preserve">            'PLSDA_Test_Accuracy_%': '%.2f' % pls_acc_te_v[i],</w:t>
+        <w:br/>
+        <w:t xml:space="preserve">            'PLSDA_Test_Recall_%':   '%.2f' % pls_rec_te_v[i],</w:t>
+        <w:br/>
+        <w:t xml:space="preserve">            'SVM_CV_Accuracy_%':     '%.2f' % svm_acc_cv_v[i],</w:t>
+        <w:br/>
+        <w:t xml:space="preserve">            'SVM_CV_Recall_%':       '%.2f' % svm_rec_cv_v[i],</w:t>
+        <w:br/>
+        <w:t xml:space="preserve">            'SVM_Test_Accuracy_%':   '%.2f' % svm_acc_te_v[i],</w:t>
+        <w:br/>
+        <w:t xml:space="preserve">            'SVM_Test_Recall_%':     '%.2f' % svm_rec_te_v[i],</w:t>
+        <w:br/>
+        <w:t xml:space="preserve">        })</w:t>
+        <w:br/>
+        <w:t xml:space="preserve">    pd.DataFrame(cls_rows).to_excel(</w:t>
+        <w:br/>
+        <w:t xml:space="preserve">        writer, sheet_name='Per_Class_Metrics', index=False)</w:t>
+        <w:br/>
         <w:br/>
         <w:t xml:space="preserve">    # CV predictions (train)</w:t>
         <w:br/>
@@ -2668,65 +2724,6 @@
         <w:t xml:space="preserve">        'SVM_5fold_Pred':      le.inverse_transform(y_svm_cv),</w:t>
         <w:br/>
         <w:t xml:space="preserve">        'SVM_5fold_Correct':   (cls_train == le.inverse_transform(y_svm_cv)),</w:t>
-        <w:br/>
-        <w:t xml:space="preserve">        'LV1': T_train[:,0], 'LV2': T_train[:,1],</w:t>
-        <w:br/>
-        <w:t xml:space="preserve">        'LV3': T_train[:,2], 'PC1': Z_train[:,0], 'PC2': Z_train[:,1],</w:t>
-        <w:br/>
-        <w:t xml:space="preserve">    }).to_excel(writer, sheet_name='Train_CV_Predictions', index=False)</w:t>
-        <w:br/>
-        <w:br/>
-        <w:t xml:space="preserve">    # Test predictions</w:t>
-        <w:br/>
-        <w:t xml:space="preserve">    pd.DataFrame({</w:t>
-        <w:br/>
-        <w:t xml:space="preserve">        'Label':              names_test,</w:t>
-        <w:br/>
-        <w:t xml:space="preserve">        'True_Class':         cls_test,</w:t>
-        <w:br/>
-        <w:t xml:space="preserve">        'PLSDA_Test_Pred':    le.inverse_transform(y_pls_test),</w:t>
-        <w:br/>
-        <w:t xml:space="preserve">        'PLSDA_Test_Correct': (cls_test == le.inverse_transform(y_pls_test)),</w:t>
-        <w:br/>
-        <w:t xml:space="preserve">        'SVM_Test_Pred':      le.inverse_transform(y_svm_test),</w:t>
-        <w:br/>
-        <w:t xml:space="preserve">        'SVM_Test_Correct':   (cls_test == le.inverse_transform(y_svm_test)),</w:t>
-        <w:br/>
-        <w:t xml:space="preserve">        'LV1': T_test[:,0], 'LV2': T_test[:,1],</w:t>
-        <w:br/>
-        <w:t xml:space="preserve">        'LV3': T_test[:,2], 'PC1': Z_test[:,0], 'PC2': Z_test[:,1],</w:t>
-        <w:br/>
-        <w:t xml:space="preserve">    }).to_excel(writer, sheet_name='Test_Predictions', index=False)</w:t>
-        <w:br/>
-        <w:br/>
-        <w:t xml:space="preserve">    # Confusion matrices</w:t>
-        <w:br/>
-        <w:t xml:space="preserve">    for sheet, cm in [</w:t>
-        <w:br/>
-        <w:t xml:space="preserve">        ('CM_PLSDA_5fold', cm_pls_cv),</w:t>
-        <w:br/>
-        <w:t xml:space="preserve">        ('CM_PLSDA_Test',  cm_pls_test),</w:t>
-        <w:br/>
-        <w:t xml:space="preserve">        ('CM_SVM_5fold',   cm_svm_cv),</w:t>
-        <w:br/>
-        <w:t xml:space="preserve">        ('CM_SVM_Test',    cm_svm_test),</w:t>
-        <w:br/>
-        <w:t xml:space="preserve">    ]:</w:t>
-        <w:br/>
-        <w:t xml:space="preserve">        pd.DataFrame(cm,</w:t>
-        <w:br/>
-        <w:t xml:space="preserve">                     index=pd.Index(CLASS_LABELS, name='True\\Predicted'),</w:t>
-        <w:br/>
-        <w:t xml:space="preserve">                     columns=CLASS_LABELS).to_excel(writer, sheet_name=sheet)</w:t>
-        <w:br/>
-        <w:br/>
-        <w:t xml:space="preserve">    # VIP scores</w:t>
-        <w:br/>
-        <w:t xml:space="preserve">    pd.DataFrame({</w:t>
-        <w:br/>
-        <w:t xml:space="preserve">        'Wavenumber_cm1':         wavenumbers,</w:t>
-        <w:br/>
-        <w:t xml:space="preserve">        'VIP_Score':              vip_all,</w:t>
       </w:r>
     </w:p>
     <w:p>
@@ -2739,6 +2736,65 @@
           <w:rFonts w:ascii="Courier New" w:hAnsi="Courier New"/>
           <w:sz w:val="16"/>
         </w:rPr>
+        <w:t xml:space="preserve">        'LV1': T_train[:,0], 'LV2': T_train[:,1],</w:t>
+        <w:br/>
+        <w:t xml:space="preserve">        'LV3': T_train[:,2], 'PC1': Z_train[:,0], 'PC2': Z_train[:,1],</w:t>
+        <w:br/>
+        <w:t xml:space="preserve">    }).to_excel(writer, sheet_name='Train_CV_Predictions', index=False)</w:t>
+        <w:br/>
+        <w:br/>
+        <w:t xml:space="preserve">    # Test predictions</w:t>
+        <w:br/>
+        <w:t xml:space="preserve">    pd.DataFrame({</w:t>
+        <w:br/>
+        <w:t xml:space="preserve">        'Label':              names_test,</w:t>
+        <w:br/>
+        <w:t xml:space="preserve">        'True_Class':         cls_test,</w:t>
+        <w:br/>
+        <w:t xml:space="preserve">        'PLSDA_Test_Pred':    le.inverse_transform(y_pls_test),</w:t>
+        <w:br/>
+        <w:t xml:space="preserve">        'PLSDA_Test_Correct': (cls_test == le.inverse_transform(y_pls_test)),</w:t>
+        <w:br/>
+        <w:t xml:space="preserve">        'SVM_Test_Pred':      le.inverse_transform(y_svm_test),</w:t>
+        <w:br/>
+        <w:t xml:space="preserve">        'SVM_Test_Correct':   (cls_test == le.inverse_transform(y_svm_test)),</w:t>
+        <w:br/>
+        <w:t xml:space="preserve">        'LV1': T_test[:,0], 'LV2': T_test[:,1],</w:t>
+        <w:br/>
+        <w:t xml:space="preserve">        'LV3': T_test[:,2], 'PC1': Z_test[:,0], 'PC2': Z_test[:,1],</w:t>
+        <w:br/>
+        <w:t xml:space="preserve">    }).to_excel(writer, sheet_name='Test_Predictions', index=False)</w:t>
+        <w:br/>
+        <w:br/>
+        <w:t xml:space="preserve">    # Confusion matrices</w:t>
+        <w:br/>
+        <w:t xml:space="preserve">    for sheet, cm in [</w:t>
+        <w:br/>
+        <w:t xml:space="preserve">        ('CM_PLSDA_5fold', cm_pls_cv),</w:t>
+        <w:br/>
+        <w:t xml:space="preserve">        ('CM_PLSDA_Test',  cm_pls_test),</w:t>
+        <w:br/>
+        <w:t xml:space="preserve">        ('CM_SVM_5fold',   cm_svm_cv),</w:t>
+        <w:br/>
+        <w:t xml:space="preserve">        ('CM_SVM_Test',    cm_svm_test),</w:t>
+        <w:br/>
+        <w:t xml:space="preserve">    ]:</w:t>
+        <w:br/>
+        <w:t xml:space="preserve">        pd.DataFrame(cm,</w:t>
+        <w:br/>
+        <w:t xml:space="preserve">                     index=pd.Index(CLASS_LABELS, name='True\\Predicted'),</w:t>
+        <w:br/>
+        <w:t xml:space="preserve">                     columns=CLASS_LABELS).to_excel(writer, sheet_name=sheet)</w:t>
+        <w:br/>
+        <w:br/>
+        <w:t xml:space="preserve">    # VIP scores</w:t>
+        <w:br/>
+        <w:t xml:space="preserve">    pd.DataFrame({</w:t>
+        <w:br/>
+        <w:t xml:space="preserve">        'Wavenumber_cm1':         wavenumbers,</w:t>
+        <w:br/>
+        <w:t xml:space="preserve">        'VIP_Score':              vip_all,</w:t>
+        <w:br/>
         <w:t xml:space="preserve">        'VIP_gt_1':               vip_all &gt; 1,</w:t>
         <w:br/>
         <w:t xml:space="preserve">        'Selected_Top%d' % top_n: sel_mask,</w:t>
@@ -2755,65 +2811,6 @@
         <w:t xml:space="preserve">    load_df.insert(0, 'Wavenumber_cm1', wn_sel)</w:t>
         <w:br/>
         <w:t xml:space="preserve">    load_df.to_excel(writer, sheet_name='Loadings', index=False)</w:t>
-        <w:br/>
-        <w:br/>
-        <w:t xml:space="preserve">    # Permutation</w:t>
-        <w:br/>
-        <w:t xml:space="preserve">    pd.DataFrame({</w:t>
-        <w:br/>
-        <w:t xml:space="preserve">        'Permutation_Index': np.arange(1, N_PERM+1),</w:t>
-        <w:br/>
-        <w:t xml:space="preserve">        'Permuted_Accuracy': perm_scores,</w:t>
-        <w:br/>
-        <w:t xml:space="preserve">    }).to_excel(writer, sheet_name='Permutation_Test', index=False)</w:t>
-        <w:br/>
-        <w:br/>
-        <w:t>print('\n[SAVED] %s' % out_xlsx)</w:t>
-        <w:br/>
-        <w:br/>
-        <w:t># =============================================================================</w:t>
-        <w:br/>
-        <w:t># 25. FINAL CONSOLE SUMMARY</w:t>
-        <w:br/>
-        <w:t># =============================================================================</w:t>
-        <w:br/>
-        <w:t>print('\n' + '=' * 68)</w:t>
-        <w:br/>
-        <w:t>print('  BINARY RESULTS  |  PDMS vs SiO2/Si  |  5-fold CV + External Test')</w:t>
-        <w:br/>
-        <w:t>print('=' * 68)</w:t>
-        <w:br/>
-        <w:t>print('  Spectral window  : %d-%d cm-1   |   %d points' % (</w:t>
-        <w:br/>
-        <w:t xml:space="preserve">    WAVENUMBER_MIN, WAVENUMBER_MAX, X_crop.shape[1]))</w:t>
-        <w:br/>
-        <w:t>print('  VIP &gt; 1          : %d / %d   -&gt;   top-%d selected' % (</w:t>
-        <w:br/>
-        <w:t xml:space="preserve">    n_vip_gt1, len(vip_all), top_n))</w:t>
-        <w:br/>
-        <w:t>print('  Split            : 60 train (30+30)  |  20 test (10+10)')</w:t>
-        <w:br/>
-        <w:t>print()</w:t>
-        <w:br/>
-        <w:t>print('  %-10s  %20s  %18s' % ('MODEL', '5-fold CV (train)', 'External Test'))</w:t>
-        <w:br/>
-        <w:t>print('  ' + '-' * 52)</w:t>
-        <w:br/>
-        <w:t>print('  %-10s  %19.1f%%  %17.1f%%' % ('PLS-DA',  acc_pls_cv*100,  acc_pls_test*100))</w:t>
-        <w:br/>
-        <w:t>print('  %-10s  %19.1f%%  %17.1f%%' % ('SVM-RBF', acc_svm_cv*100,  acc_svm_test*100))</w:t>
-        <w:br/>
-        <w:t>print()</w:t>
-        <w:br/>
-        <w:t>print('  PLS-DA permutation p-value : %.4f  [%s]' % (</w:t>
-        <w:br/>
-        <w:t xml:space="preserve">    p_val, 'SIGNIFICANT' if p_val &lt; 0.05 else 'NOT significant'))</w:t>
-        <w:br/>
-        <w:t>print()</w:t>
-        <w:br/>
-        <w:t>print('  Per-class Accuracy &amp; Recall — 5-fold CV (train):')</w:t>
-        <w:br/>
-        <w:t>print('  %-12s  %9s  %7s  |  %9s  %7s' % (</w:t>
       </w:r>
     </w:p>
     <w:p>
@@ -2826,6 +2823,65 @@
           <w:rFonts w:ascii="Courier New" w:hAnsi="Courier New"/>
           <w:sz w:val="16"/>
         </w:rPr>
+        <w:br/>
+        <w:t xml:space="preserve">    # Permutation</w:t>
+        <w:br/>
+        <w:t xml:space="preserve">    pd.DataFrame({</w:t>
+        <w:br/>
+        <w:t xml:space="preserve">        'Permutation_Index': np.arange(1, N_PERM+1),</w:t>
+        <w:br/>
+        <w:t xml:space="preserve">        'Permuted_Accuracy': perm_scores,</w:t>
+        <w:br/>
+        <w:t xml:space="preserve">    }).to_excel(writer, sheet_name='Permutation_Test', index=False)</w:t>
+        <w:br/>
+        <w:br/>
+        <w:t>print('\n[SAVED] %s' % out_xlsx)</w:t>
+        <w:br/>
+        <w:br/>
+        <w:t># =============================================================================</w:t>
+        <w:br/>
+        <w:t># 25. FINAL CONSOLE SUMMARY</w:t>
+        <w:br/>
+        <w:t># =============================================================================</w:t>
+        <w:br/>
+        <w:t>print('\n' + '=' * 68)</w:t>
+        <w:br/>
+        <w:t>print('  BINARY RESULTS  |  PDMS vs SiO2/Si  |  5-fold CV + External Test')</w:t>
+        <w:br/>
+        <w:t>print('=' * 68)</w:t>
+        <w:br/>
+        <w:t>print('  Spectral window  : %d-%d cm-1   |   %d points' % (</w:t>
+        <w:br/>
+        <w:t xml:space="preserve">    WAVENUMBER_MIN, WAVENUMBER_MAX, X_crop.shape[1]))</w:t>
+        <w:br/>
+        <w:t>print('  VIP &gt; 1          : %d / %d   -&gt;   top-%d selected' % (</w:t>
+        <w:br/>
+        <w:t xml:space="preserve">    n_vip_gt1, len(vip_all), top_n))</w:t>
+        <w:br/>
+        <w:t>print('  Split            : 60 train  |  10 test (Gr only: 5+5)  |  10 excluded (no-Gr)')</w:t>
+        <w:br/>
+        <w:t>print()</w:t>
+        <w:br/>
+        <w:t>print('  %-10s  %20s  %18s' % ('MODEL', '5-fold CV (train)', 'External Test'))</w:t>
+        <w:br/>
+        <w:t>print('  ' + '-' * 52)</w:t>
+        <w:br/>
+        <w:t>print('  %-10s  %19.1f%%  %17.1f%%' % ('PLS-DA',  acc_pls_cv*100,  acc_pls_test*100))</w:t>
+        <w:br/>
+        <w:t>print('  %-10s  %19.1f%%  %17.1f%%' % ('SVM-RBF', acc_svm_cv*100,  acc_svm_test*100))</w:t>
+        <w:br/>
+        <w:t>print()</w:t>
+        <w:br/>
+        <w:t>print('  PLS-DA permutation p-value : %.4f  [%s]' % (</w:t>
+        <w:br/>
+        <w:t xml:space="preserve">    p_val, 'SIGNIFICANT' if p_val &lt; 0.05 else 'NOT significant'))</w:t>
+        <w:br/>
+        <w:t>print()</w:t>
+        <w:br/>
+        <w:t>print('  Per-class Accuracy &amp; Recall — 5-fold CV (train):')</w:t>
+        <w:br/>
+        <w:t>print('  %-12s  %9s  %7s  |  %9s  %7s' % (</w:t>
+        <w:br/>
         <w:t xml:space="preserve">    'Class', 'PLS Acc', 'PLS Rec', 'SVM Acc', 'SVM Rec'))</w:t>
         <w:br/>
         <w:t>print('  ' + '-' * 54)</w:t>
@@ -2843,7 +2899,18 @@
         <w:t>print('  %-12s  %9s  %7s  |  %9s  %7s' % (</w:t>
         <w:br/>
         <w:t xml:space="preserve">    'Class', 'PLS Acc', 'PLS Rec', 'SVM Acc', 'SVM Rec'))</w:t>
-        <w:br/>
+      </w:r>
+    </w:p>
+    <w:p>
+      <w:pPr>
+        <w:shd w:val="clear" w:color="auto" w:fill="F2F2F2"/>
+        <w:spacing w:after="0" w:before="0"/>
+      </w:pPr>
+      <w:r>
+        <w:rPr>
+          <w:rFonts w:ascii="Courier New" w:hAnsi="Courier New"/>
+          <w:sz w:val="16"/>
+        </w:rPr>
         <w:t>print('  ' + '-' * 54)</w:t>
         <w:br/>
         <w:t>for i, cls in enumerate(CLASS_LABELS):</w:t>

</xml_diff>

<commit_message>
Update PLSDA_SVM_Binary: VIP_TOP_N changed from 2200 to 1800
https://claude.ai/code/session_01MNVMUP3XQfcv4xQxHGe3PS
</commit_message>
<xml_diff>
--- a/PLSDA_SVM_Binary.docx
+++ b/PLSDA_SVM_Binary.docx
@@ -41,7 +41,7 @@
     </w:p>
     <w:p>
       <w:r>
-        <w:t>Binary classification of Raman spectra into PDMS (PDMS + Gr-PDMS) vs SiO₂/Si (SiO₂/Si + Gr-SiO₂/Si). Split: 10 no-Gr spectra excluded entirely (5 per class); Test = 10 Gr-only spectra (5 Gr-PDMS + 5 Gr-SiO₂/Si); Train = remaining 60 (15 Gr + 15 no-Gr per class). VIP top-2200, 3-LV PLS-DA, 5-fold CV on training set, external test. Per-class Accuracy = (TP+TN)/N  and  Recall = TP/(TP+FN) for every model. SSY not shown in plot titles/labels.</w:t>
+        <w:t>Binary classification of Raman spectra into PDMS (PDMS + Gr-PDMS) vs SiO₂/Si (SiO₂/Si + Gr-SiO₂/Si). Split: 10 no-Gr spectra excluded entirely (5 per class); Test = 10 Gr-only spectra (5 Gr-PDMS + 5 Gr-SiO₂/Si); Train = remaining 60 (15 Gr + 15 no-Gr per class). VIP top-1800, 3-LV PLS-DA, 5-fold CV on training set, external test. Per-class Accuracy = (TP+TN)/N  and  Recall = TP/(TP+FN) for every model.</w:t>
       </w:r>
     </w:p>
     <w:p>
@@ -254,7 +254,7 @@
           </w:tcPr>
           <w:p>
             <w:r>
-              <w:t>VIP scores with top-2200 selection highlighted</w:t>
+              <w:t>VIP scores with top-1800 selection highlighted</w:t>
             </w:r>
           </w:p>
         </w:tc>
@@ -755,7 +755,7 @@
         <w:br/>
         <w:t>SG_POLY        = 2</w:t>
         <w:br/>
-        <w:t>VIP_TOP_N      = 2200</w:t>
+        <w:t>VIP_TOP_N      = 1800</w:t>
         <w:br/>
         <w:t>N_COMPONENTS   = 3          # binary PLS-DA: 3 LVs sufficient</w:t>
         <w:br/>

</xml_diff>

<commit_message>
Update PLSDA_SVM_Binary: VIP_TOP_N changed from 1800 to 1500
https://claude.ai/code/session_01MNVMUP3XQfcv4xQxHGe3PS
</commit_message>
<xml_diff>
--- a/PLSDA_SVM_Binary.docx
+++ b/PLSDA_SVM_Binary.docx
@@ -41,7 +41,7 @@
     </w:p>
     <w:p>
       <w:r>
-        <w:t>Binary classification of Raman spectra into PDMS (PDMS + Gr-PDMS) vs SiO₂/Si (SiO₂/Si + Gr-SiO₂/Si). Split: 10 no-Gr spectra excluded entirely (5 per class); Test = 10 Gr-only spectra (5 Gr-PDMS + 5 Gr-SiO₂/Si); Train = remaining 60 (15 Gr + 15 no-Gr per class). VIP top-1800, 3-LV PLS-DA, 5-fold CV on training set, external test. Per-class Accuracy = (TP+TN)/N  and  Recall = TP/(TP+FN) for every model.</w:t>
+        <w:t>Binary classification of Raman spectra into PDMS (PDMS + Gr-PDMS) vs SiO₂/Si (SiO₂/Si + Gr-SiO₂/Si). Split: 10 no-Gr spectra excluded entirely (5 per class); Test = 10 Gr-only spectra (5 Gr-PDMS + 5 Gr-SiO₂/Si); Train = remaining 60 (15 Gr + 15 no-Gr per class). VIP top-1500, 3-LV PLS-DA, 5-fold CV on training set, external test. Per-class Accuracy = (TP+TN)/N  and  Recall = TP/(TP+FN) for every model.</w:t>
       </w:r>
     </w:p>
     <w:p>
@@ -254,7 +254,7 @@
           </w:tcPr>
           <w:p>
             <w:r>
-              <w:t>VIP scores with top-1800 selection highlighted</w:t>
+              <w:t>VIP scores with top-1500 selection highlighted</w:t>
             </w:r>
           </w:p>
         </w:tc>
@@ -755,7 +755,7 @@
         <w:br/>
         <w:t>SG_POLY        = 2</w:t>
         <w:br/>
-        <w:t>VIP_TOP_N      = 1800</w:t>
+        <w:t>VIP_TOP_N      = 1500</w:t>
         <w:br/>
         <w:t>N_COMPONENTS   = 3          # binary PLS-DA: 3 LVs sufficient</w:t>
         <w:br/>

</xml_diff>

<commit_message>
Update PLSDA_SVM_Binary: VIP_TOP_N changed from 1500 to 1000
https://claude.ai/code/session_01MNVMUP3XQfcv4xQxHGe3PS
</commit_message>
<xml_diff>
--- a/PLSDA_SVM_Binary.docx
+++ b/PLSDA_SVM_Binary.docx
@@ -41,7 +41,7 @@
     </w:p>
     <w:p>
       <w:r>
-        <w:t>Binary classification of Raman spectra into PDMS (PDMS + Gr-PDMS) vs SiO₂/Si (SiO₂/Si + Gr-SiO₂/Si). Split: 10 no-Gr spectra excluded entirely (5 per class); Test = 10 Gr-only spectra (5 Gr-PDMS + 5 Gr-SiO₂/Si); Train = remaining 60 (15 Gr + 15 no-Gr per class). VIP top-1500, 3-LV PLS-DA, 5-fold CV on training set, external test. Per-class Accuracy = (TP+TN)/N  and  Recall = TP/(TP+FN) for every model.</w:t>
+        <w:t>Binary classification of Raman spectra into PDMS (PDMS + Gr-PDMS) vs SiO₂/Si (SiO₂/Si + Gr-SiO₂/Si). Split: 10 no-Gr spectra excluded entirely (5 per class); Test = 10 Gr-only spectra (5 Gr-PDMS + 5 Gr-SiO₂/Si); Train = remaining 60 (15 Gr + 15 no-Gr per class). VIP top-1000, 3-LV PLS-DA, 5-fold CV on training set, external test. Per-class Accuracy = (TP+TN)/N  and  Recall = TP/(TP+FN) for every model.</w:t>
       </w:r>
     </w:p>
     <w:p>
@@ -254,7 +254,7 @@
           </w:tcPr>
           <w:p>
             <w:r>
-              <w:t>VIP scores with top-1500 selection highlighted</w:t>
+              <w:t>VIP scores with top-1000 selection highlighted</w:t>
             </w:r>
           </w:p>
         </w:tc>
@@ -755,7 +755,7 @@
         <w:br/>
         <w:t>SG_POLY        = 2</w:t>
         <w:br/>
-        <w:t>VIP_TOP_N      = 1500</w:t>
+        <w:t>VIP_TOP_N      = 1000</w:t>
         <w:br/>
         <w:t>N_COMPONENTS   = 3          # binary PLS-DA: 3 LVs sufficient</w:t>
         <w:br/>

</xml_diff>

<commit_message>
Add SVM-RBF permutation test (999 permutations)
- Run permutation_test_score on svm_pipe after external test
- Add 08b_SVM_Permutation.png figure (lightsalmon histogram, darkred observed line)
- Add SVM p-value to Excel Summary sheet and Permutation_Test sheet
- Add SVM permutation result to console final summary

https://claude.ai/code/session_01MNVMUP3XQfcv4xQxHGe3PS
</commit_message>
<xml_diff>
--- a/PLSDA_SVM_Binary.docx
+++ b/PLSDA_SVM_Binary.docx
@@ -4,568 +4,12 @@
   <w:body>
     <w:p>
       <w:pPr>
-        <w:pStyle w:val="Heading1"/>
-        <w:jc w:val="center"/>
-      </w:pPr>
-      <w:r>
-        <w:rPr>
-          <w:color w:val="1A1A8C"/>
-        </w:rPr>
-        <w:t>PLS-DA + SVM-RBF | Binary Classification | Raman Spectroscopy</w:t>
-      </w:r>
-    </w:p>
-    <w:p>
-      <w:pPr>
-        <w:jc w:val="center"/>
-      </w:pPr>
-      <w:r>
-        <w:rPr>
-          <w:b/>
-          <w:color w:val="444444"/>
-          <w:sz w:val="22"/>
-        </w:rPr>
-        <w:t>PDMS vs SiO2/Si  |  60 Train / 10 Test (Gr only)  |  5-fold CV + External Test</w:t>
-      </w:r>
-    </w:p>
-    <w:p/>
-    <w:p>
-      <w:r>
-        <w:rPr>
-          <w:b/>
-        </w:rPr>
-        <w:t xml:space="preserve">Script: </w:t>
-      </w:r>
-      <w:r>
-        <w:t>PLSDA_SVM_Binary.py</w:t>
-      </w:r>
-    </w:p>
-    <w:p>
-      <w:r>
-        <w:t>Binary classification of Raman spectra into PDMS (PDMS + Gr-PDMS) vs SiO₂/Si (SiO₂/Si + Gr-SiO₂/Si). Split: 10 no-Gr spectra excluded entirely (5 per class); Test = 10 Gr-only spectra (5 Gr-PDMS + 5 Gr-SiO₂/Si); Train = remaining 60 (15 Gr + 15 no-Gr per class). VIP top-1000, 3-LV PLS-DA, 5-fold CV on training set, external test. Per-class Accuracy = (TP+TN)/N  and  Recall = TP/(TP+FN) for every model.</w:t>
-      </w:r>
-    </w:p>
-    <w:p>
-      <w:pPr>
-        <w:pStyle w:val="Heading2"/>
-      </w:pPr>
-      <w:r>
-        <w:t>Installation (run once in PyCharm Terminal)</w:t>
-      </w:r>
-    </w:p>
-    <w:p>
-      <w:pPr>
-        <w:shd w:val="clear" w:color="auto" w:fill="FFFF99"/>
+        <w:jc w:val="left"/>
       </w:pPr>
       <w:r>
         <w:rPr>
           <w:rFonts w:ascii="Courier New" w:hAnsi="Courier New"/>
-          <w:b/>
-          <w:sz w:val="20"/>
-        </w:rPr>
-        <w:t>pip install pandas openpyxl scikit-learn scipy matplotlib xlrd python-docx</w:t>
-      </w:r>
-    </w:p>
-    <w:p>
-      <w:pPr>
-        <w:pStyle w:val="Heading2"/>
-      </w:pPr>
-      <w:r>
-        <w:t>Output Files</w:t>
-      </w:r>
-    </w:p>
-    <w:tbl>
-      <w:tblPr>
-        <w:tblStyle w:val="TableGrid"/>
-        <w:tblW w:type="auto" w:w="0"/>
-        <w:tblLook w:firstColumn="1" w:firstRow="1" w:lastColumn="0" w:lastRow="0" w:noHBand="0" w:noVBand="1" w:val="04A0"/>
-      </w:tblPr>
-      <w:tblGrid>
-        <w:gridCol w:w="4986"/>
-        <w:gridCol w:w="4986"/>
-      </w:tblGrid>
-      <w:tr>
-        <w:tc>
-          <w:tcPr>
-            <w:tcW w:type="dxa" w:w="4986"/>
-            <w:shd w:val="clear" w:color="auto" w:fill="2E4057"/>
-          </w:tcPr>
-          <w:p>
-            <w:r>
-              <w:rPr>
-                <w:b/>
-                <w:color w:val="FFFFFF"/>
-              </w:rPr>
-              <w:t>File</w:t>
-            </w:r>
-          </w:p>
-        </w:tc>
-        <w:tc>
-          <w:tcPr>
-            <w:tcW w:type="dxa" w:w="4986"/>
-            <w:shd w:val="clear" w:color="auto" w:fill="2E4057"/>
-          </w:tcPr>
-          <w:p>
-            <w:r>
-              <w:rPr>
-                <w:b/>
-                <w:color w:val="FFFFFF"/>
-              </w:rPr>
-              <w:t>Description</w:t>
-            </w:r>
-          </w:p>
-        </w:tc>
-      </w:tr>
-      <w:tr>
-        <w:tc>
-          <w:tcPr>
-            <w:tcW w:type="dxa" w:w="4986"/>
-            <w:shd w:val="clear" w:color="auto" w:fill="F0F4FF"/>
-          </w:tcPr>
-          <w:p>
-            <w:r>
-              <w:t>01_PLSDA_Scores_LV1_LV2.png</w:t>
-            </w:r>
-          </w:p>
-        </w:tc>
-        <w:tc>
-          <w:tcPr>
-            <w:tcW w:type="dxa" w:w="4986"/>
-            <w:shd w:val="clear" w:color="auto" w:fill="F0F4FF"/>
-          </w:tcPr>
-          <w:p>
-            <w:r>
-              <w:t>PLS-DA score plot LV1 vs LV2 (train+test)</w:t>
-            </w:r>
-          </w:p>
-        </w:tc>
-      </w:tr>
-      <w:tr>
-        <w:tc>
-          <w:tcPr>
-            <w:tcW w:type="dxa" w:w="4986"/>
-            <w:shd w:val="clear" w:color="auto" w:fill="FFFFFF"/>
-          </w:tcPr>
-          <w:p>
-            <w:r>
-              <w:t>02_PLSDA_Scores_LV1_LV3.png</w:t>
-            </w:r>
-          </w:p>
-        </w:tc>
-        <w:tc>
-          <w:tcPr>
-            <w:tcW w:type="dxa" w:w="4986"/>
-            <w:shd w:val="clear" w:color="auto" w:fill="FFFFFF"/>
-          </w:tcPr>
-          <w:p>
-            <w:r>
-              <w:t>PLS-DA score plot LV1 vs LV3</w:t>
-            </w:r>
-          </w:p>
-        </w:tc>
-      </w:tr>
-      <w:tr>
-        <w:tc>
-          <w:tcPr>
-            <w:tcW w:type="dxa" w:w="4986"/>
-            <w:shd w:val="clear" w:color="auto" w:fill="F0F4FF"/>
-          </w:tcPr>
-          <w:p>
-            <w:r>
-              <w:t>03_PLSDA_Scores_3D.png</w:t>
-            </w:r>
-          </w:p>
-        </w:tc>
-        <w:tc>
-          <w:tcPr>
-            <w:tcW w:type="dxa" w:w="4986"/>
-            <w:shd w:val="clear" w:color="auto" w:fill="F0F4FF"/>
-          </w:tcPr>
-          <w:p>
-            <w:r>
-              <w:t>PLS-DA 3D score plot (LV1/LV2/LV3)</w:t>
-            </w:r>
-          </w:p>
-        </w:tc>
-      </w:tr>
-      <w:tr>
-        <w:tc>
-          <w:tcPr>
-            <w:tcW w:type="dxa" w:w="4986"/>
-            <w:shd w:val="clear" w:color="auto" w:fill="FFFFFF"/>
-          </w:tcPr>
-          <w:p>
-            <w:r>
-              <w:t>04_PLSDA_Confusion_5fold.png</w:t>
-            </w:r>
-          </w:p>
-        </w:tc>
-        <w:tc>
-          <w:tcPr>
-            <w:tcW w:type="dxa" w:w="4986"/>
-            <w:shd w:val="clear" w:color="auto" w:fill="FFFFFF"/>
-          </w:tcPr>
-          <w:p>
-            <w:r>
-              <w:t>PLS-DA confusion matrix — 5-fold CV + per-class table</w:t>
-            </w:r>
-          </w:p>
-        </w:tc>
-      </w:tr>
-      <w:tr>
-        <w:tc>
-          <w:tcPr>
-            <w:tcW w:type="dxa" w:w="4986"/>
-            <w:shd w:val="clear" w:color="auto" w:fill="F0F4FF"/>
-          </w:tcPr>
-          <w:p>
-            <w:r>
-              <w:t>05_PLSDA_Confusion_Test.png</w:t>
-            </w:r>
-          </w:p>
-        </w:tc>
-        <w:tc>
-          <w:tcPr>
-            <w:tcW w:type="dxa" w:w="4986"/>
-            <w:shd w:val="clear" w:color="auto" w:fill="F0F4FF"/>
-          </w:tcPr>
-          <w:p>
-            <w:r>
-              <w:t>PLS-DA confusion matrix — External Test (Gr only, n=10)</w:t>
-            </w:r>
-          </w:p>
-        </w:tc>
-      </w:tr>
-      <w:tr>
-        <w:tc>
-          <w:tcPr>
-            <w:tcW w:type="dxa" w:w="4986"/>
-            <w:shd w:val="clear" w:color="auto" w:fill="FFFFFF"/>
-          </w:tcPr>
-          <w:p>
-            <w:r>
-              <w:t>06_PLSDA_VIP_Scores.png</w:t>
-            </w:r>
-          </w:p>
-        </w:tc>
-        <w:tc>
-          <w:tcPr>
-            <w:tcW w:type="dxa" w:w="4986"/>
-            <w:shd w:val="clear" w:color="auto" w:fill="FFFFFF"/>
-          </w:tcPr>
-          <w:p>
-            <w:r>
-              <w:t>VIP scores with top-1000 selection highlighted</w:t>
-            </w:r>
-          </w:p>
-        </w:tc>
-      </w:tr>
-      <w:tr>
-        <w:tc>
-          <w:tcPr>
-            <w:tcW w:type="dxa" w:w="4986"/>
-            <w:shd w:val="clear" w:color="auto" w:fill="F0F4FF"/>
-          </w:tcPr>
-          <w:p>
-            <w:r>
-              <w:t>07_PLSDA_Loadings.png</w:t>
-            </w:r>
-          </w:p>
-        </w:tc>
-        <w:tc>
-          <w:tcPr>
-            <w:tcW w:type="dxa" w:w="4986"/>
-            <w:shd w:val="clear" w:color="auto" w:fill="F0F4FF"/>
-          </w:tcPr>
-          <w:p>
-            <w:r>
-              <w:t>PLS-DA loadings LV1/LV2/LV3</w:t>
-            </w:r>
-          </w:p>
-        </w:tc>
-      </w:tr>
-      <w:tr>
-        <w:tc>
-          <w:tcPr>
-            <w:tcW w:type="dxa" w:w="4986"/>
-            <w:shd w:val="clear" w:color="auto" w:fill="FFFFFF"/>
-          </w:tcPr>
-          <w:p>
-            <w:r>
-              <w:t>08_PLSDA_Permutation.png</w:t>
-            </w:r>
-          </w:p>
-        </w:tc>
-        <w:tc>
-          <w:tcPr>
-            <w:tcW w:type="dxa" w:w="4986"/>
-            <w:shd w:val="clear" w:color="auto" w:fill="FFFFFF"/>
-          </w:tcPr>
-          <w:p>
-            <w:r>
-              <w:t>Permutation test (999 permutations)</w:t>
-            </w:r>
-          </w:p>
-        </w:tc>
-      </w:tr>
-      <w:tr>
-        <w:tc>
-          <w:tcPr>
-            <w:tcW w:type="dxa" w:w="4986"/>
-            <w:shd w:val="clear" w:color="auto" w:fill="F0F4FF"/>
-          </w:tcPr>
-          <w:p>
-            <w:r>
-              <w:t>09_PLSDA_Cluster_5fold.png</w:t>
-            </w:r>
-          </w:p>
-        </w:tc>
-        <w:tc>
-          <w:tcPr>
-            <w:tcW w:type="dxa" w:w="4986"/>
-            <w:shd w:val="clear" w:color="auto" w:fill="F0F4FF"/>
-          </w:tcPr>
-          <w:p>
-            <w:r>
-              <w:t>PLS-DA cluster plot (LV space) with stats annotation</w:t>
-            </w:r>
-          </w:p>
-        </w:tc>
-      </w:tr>
-      <w:tr>
-        <w:tc>
-          <w:tcPr>
-            <w:tcW w:type="dxa" w:w="4986"/>
-            <w:shd w:val="clear" w:color="auto" w:fill="FFFFFF"/>
-          </w:tcPr>
-          <w:p>
-            <w:r>
-              <w:t>10_SVM_Cluster_5fold.png</w:t>
-            </w:r>
-          </w:p>
-        </w:tc>
-        <w:tc>
-          <w:tcPr>
-            <w:tcW w:type="dxa" w:w="4986"/>
-            <w:shd w:val="clear" w:color="auto" w:fill="FFFFFF"/>
-          </w:tcPr>
-          <w:p>
-            <w:r>
-              <w:t>SVM-RBF cluster plot (PCA space, 5-fold CV + Gr test)</w:t>
-            </w:r>
-          </w:p>
-        </w:tc>
-      </w:tr>
-      <w:tr>
-        <w:tc>
-          <w:tcPr>
-            <w:tcW w:type="dxa" w:w="4986"/>
-            <w:shd w:val="clear" w:color="auto" w:fill="F0F4FF"/>
-          </w:tcPr>
-          <w:p>
-            <w:r>
-              <w:t>11_SVM_Cluster_Test.png</w:t>
-            </w:r>
-          </w:p>
-        </w:tc>
-        <w:tc>
-          <w:tcPr>
-            <w:tcW w:type="dxa" w:w="4986"/>
-            <w:shd w:val="clear" w:color="auto" w:fill="F0F4FF"/>
-          </w:tcPr>
-          <w:p>
-            <w:r>
-              <w:t>SVM-RBF cluster — Gr-only test focus</w:t>
-            </w:r>
-          </w:p>
-        </w:tc>
-      </w:tr>
-      <w:tr>
-        <w:tc>
-          <w:tcPr>
-            <w:tcW w:type="dxa" w:w="4986"/>
-            <w:shd w:val="clear" w:color="auto" w:fill="FFFFFF"/>
-          </w:tcPr>
-          <w:p>
-            <w:r>
-              <w:t>12_SVM_Confusion_5fold.png</w:t>
-            </w:r>
-          </w:p>
-        </w:tc>
-        <w:tc>
-          <w:tcPr>
-            <w:tcW w:type="dxa" w:w="4986"/>
-            <w:shd w:val="clear" w:color="auto" w:fill="FFFFFF"/>
-          </w:tcPr>
-          <w:p>
-            <w:r>
-              <w:t>SVM-RBF confusion matrix — 5-fold CV + per-class table</w:t>
-            </w:r>
-          </w:p>
-        </w:tc>
-      </w:tr>
-      <w:tr>
-        <w:tc>
-          <w:tcPr>
-            <w:tcW w:type="dxa" w:w="4986"/>
-            <w:shd w:val="clear" w:color="auto" w:fill="F0F4FF"/>
-          </w:tcPr>
-          <w:p>
-            <w:r>
-              <w:t>13_SVM_Confusion_Test.png</w:t>
-            </w:r>
-          </w:p>
-        </w:tc>
-        <w:tc>
-          <w:tcPr>
-            <w:tcW w:type="dxa" w:w="4986"/>
-            <w:shd w:val="clear" w:color="auto" w:fill="F0F4FF"/>
-          </w:tcPr>
-          <w:p>
-            <w:r>
-              <w:t>SVM-RBF confusion matrix — External Test (Gr only, n=10)</w:t>
-            </w:r>
-          </w:p>
-        </w:tc>
-      </w:tr>
-      <w:tr>
-        <w:tc>
-          <w:tcPr>
-            <w:tcW w:type="dxa" w:w="4986"/>
-            <w:shd w:val="clear" w:color="auto" w:fill="FFFFFF"/>
-          </w:tcPr>
-          <w:p>
-            <w:r>
-              <w:t>14_Accuracy_Comparison.png</w:t>
-            </w:r>
-          </w:p>
-        </w:tc>
-        <w:tc>
-          <w:tcPr>
-            <w:tcW w:type="dxa" w:w="4986"/>
-            <w:shd w:val="clear" w:color="auto" w:fill="FFFFFF"/>
-          </w:tcPr>
-          <w:p>
-            <w:r>
-              <w:t>3-panel accuracy: overall + per-class CV + per-class test</w:t>
-            </w:r>
-          </w:p>
-        </w:tc>
-      </w:tr>
-      <w:tr>
-        <w:tc>
-          <w:tcPr>
-            <w:tcW w:type="dxa" w:w="4986"/>
-            <w:shd w:val="clear" w:color="auto" w:fill="F0F4FF"/>
-          </w:tcPr>
-          <w:p>
-            <w:r>
-              <w:t>15_Recall_Comparison.png</w:t>
-            </w:r>
-          </w:p>
-        </w:tc>
-        <w:tc>
-          <w:tcPr>
-            <w:tcW w:type="dxa" w:w="4986"/>
-            <w:shd w:val="clear" w:color="auto" w:fill="F0F4FF"/>
-          </w:tcPr>
-          <w:p>
-            <w:r>
-              <w:t>3-panel recall: macro-avg + per-class CV + per-class test</w:t>
-            </w:r>
-          </w:p>
-        </w:tc>
-      </w:tr>
-      <w:tr>
-        <w:tc>
-          <w:tcPr>
-            <w:tcW w:type="dxa" w:w="4986"/>
-            <w:shd w:val="clear" w:color="auto" w:fill="FFFFFF"/>
-          </w:tcPr>
-          <w:p>
-            <w:r>
-              <w:t>16_Mean_Spectra.png</w:t>
-            </w:r>
-          </w:p>
-        </w:tc>
-        <w:tc>
-          <w:tcPr>
-            <w:tcW w:type="dxa" w:w="4986"/>
-            <w:shd w:val="clear" w:color="auto" w:fill="FFFFFF"/>
-          </w:tcPr>
-          <w:p>
-            <w:r>
-              <w:t>Mean Raman spectra ± 1 SD for each binary class</w:t>
-            </w:r>
-          </w:p>
-        </w:tc>
-      </w:tr>
-      <w:tr>
-        <w:tc>
-          <w:tcPr>
-            <w:tcW w:type="dxa" w:w="4986"/>
-            <w:shd w:val="clear" w:color="auto" w:fill="F0F4FF"/>
-          </w:tcPr>
-          <w:p>
-            <w:r>
-              <w:t>Results_Binary.xlsx</w:t>
-            </w:r>
-          </w:p>
-        </w:tc>
-        <w:tc>
-          <w:tcPr>
-            <w:tcW w:type="dxa" w:w="4986"/>
-            <w:shd w:val="clear" w:color="auto" w:fill="F0F4FF"/>
-          </w:tcPr>
-          <w:p>
-            <w:r>
-              <w:t>Excel: Summary, Per_Class_Metrics, Train/Test predictions, CMs, VIP, Loadings, Permutation</w:t>
-            </w:r>
-          </w:p>
-        </w:tc>
-      </w:tr>
-    </w:tbl>
-    <w:p>
-      <w:r>
-        <w:br w:type="page"/>
-      </w:r>
-    </w:p>
-    <w:p>
-      <w:pPr>
-        <w:pStyle w:val="Heading1"/>
-      </w:pPr>
-      <w:r>
-        <w:t>Full Python Source Code</w:t>
-      </w:r>
-    </w:p>
-    <w:p>
-      <w:r>
-        <w:rPr>
-          <w:i/>
-        </w:rPr>
-        <w:t xml:space="preserve">Copy the block below into PyCharm as </w:t>
-      </w:r>
-      <w:r>
-        <w:rPr>
-          <w:b/>
-        </w:rPr>
-        <w:t>PLSDA_SVM_Binary.py</w:t>
-      </w:r>
-      <w:r>
-        <w:rPr>
-          <w:i/>
-        </w:rPr>
-        <w:t xml:space="preserve"> and run. All outputs go to the OUTPUT_DIR folder.</w:t>
-      </w:r>
-    </w:p>
-    <w:p>
-      <w:pPr>
-        <w:shd w:val="clear" w:color="auto" w:fill="F2F2F2"/>
-        <w:spacing w:after="0" w:before="0"/>
-      </w:pPr>
-      <w:r>
-        <w:rPr>
-          <w:rFonts w:ascii="Courier New" w:hAnsi="Courier New"/>
-          <w:sz w:val="16"/>
+          <w:sz w:val="18"/>
         </w:rPr>
         <w:t>"""</w:t>
         <w:br/>
@@ -623,6 +67,8 @@
         <w:br/>
         <w:t xml:space="preserve">  08_PLSDA_Permutation.png</w:t>
         <w:br/>
+        <w:t xml:space="preserve">  08b_SVM_Permutation.png</w:t>
+        <w:br/>
         <w:t xml:space="preserve">  09_PLSDA_Cluster_5fold.png</w:t>
         <w:br/>
         <w:t xml:space="preserve">  10_SVM_Cluster_5fold.png</w:t>
@@ -641,18 +87,7 @@
         <w:br/>
         <w:t xml:space="preserve">  Results_Binary.xlsx</w:t>
         <w:br/>
-      </w:r>
-    </w:p>
-    <w:p>
-      <w:pPr>
-        <w:shd w:val="clear" w:color="auto" w:fill="F2F2F2"/>
-        <w:spacing w:after="0" w:before="0"/>
-      </w:pPr>
-      <w:r>
-        <w:rPr>
-          <w:rFonts w:ascii="Courier New" w:hAnsi="Courier New"/>
-          <w:sz w:val="16"/>
-        </w:rPr>
+        <w:br/>
         <w:t>HOW TO RUN (PyCharm Terminal):</w:t>
         <w:br/>
         <w:t xml:space="preserve">  pip install pandas openpyxl scikit-learn scipy matplotlib xlrd</w:t>
@@ -727,18 +162,7 @@
         <w:t># 0.  SETTINGS</w:t>
         <w:br/>
         <w:t># =============================================================================</w:t>
-      </w:r>
-    </w:p>
-    <w:p>
-      <w:pPr>
-        <w:shd w:val="clear" w:color="auto" w:fill="F2F2F2"/>
-        <w:spacing w:after="0" w:before="0"/>
-      </w:pPr>
-      <w:r>
-        <w:rPr>
-          <w:rFonts w:ascii="Courier New" w:hAnsi="Courier New"/>
-          <w:sz w:val="16"/>
-        </w:rPr>
+        <w:br/>
         <w:t>DATA_PATH      = r"C:\Users\Hira Aman\Desktop\PROF_DOMENICO'S"</w:t>
         <w:br/>
         <w:t>FILE_NAME      = "Book1.xls"</w:t>
@@ -813,18 +237,7 @@
         <w:t>def load_xls(file_path, sheet):</w:t>
         <w:br/>
         <w:t xml:space="preserve">    try:</w:t>
-      </w:r>
-    </w:p>
-    <w:p>
-      <w:pPr>
-        <w:shd w:val="clear" w:color="auto" w:fill="F2F2F2"/>
-        <w:spacing w:after="0" w:before="0"/>
-      </w:pPr>
-      <w:r>
-        <w:rPr>
-          <w:rFonts w:ascii="Courier New" w:hAnsi="Courier New"/>
-          <w:sz w:val="16"/>
-        </w:rPr>
+        <w:br/>
         <w:t xml:space="preserve">        df = pd.read_excel(file_path, sheet_name=sheet,</w:t>
         <w:br/>
         <w:t xml:space="preserve">                           header=0, index_col=0, engine='xlrd')</w:t>
@@ -904,18 +317,7 @@
         <w:t xml:space="preserve">    raise RuntimeError(</w:t>
         <w:br/>
         <w:t xml:space="preserve">        "\n[ERROR] Cannot read the .xls file.\n"</w:t>
-      </w:r>
-    </w:p>
-    <w:p>
-      <w:pPr>
-        <w:shd w:val="clear" w:color="auto" w:fill="F2F2F2"/>
-        <w:spacing w:after="0" w:before="0"/>
-      </w:pPr>
-      <w:r>
-        <w:rPr>
-          <w:rFonts w:ascii="Courier New" w:hAnsi="Courier New"/>
-          <w:sz w:val="16"/>
-        </w:rPr>
+        <w:br/>
         <w:t xml:space="preserve">        "Run:  pip install xlrd   then re-run.")</w:t>
         <w:br/>
         <w:br/>
@@ -988,18 +390,7 @@
         <w:br/>
         <w:t>X_all           = raw.values.T.astype(float)</w:t>
         <w:br/>
-      </w:r>
-    </w:p>
-    <w:p>
-      <w:pPr>
-        <w:shd w:val="clear" w:color="auto" w:fill="F2F2F2"/>
-        <w:spacing w:after="0" w:before="0"/>
-      </w:pPr>
-      <w:r>
-        <w:rPr>
-          <w:rFonts w:ascii="Courier New" w:hAnsi="Courier New"/>
-          <w:sz w:val="16"/>
-        </w:rPr>
+        <w:br/>
         <w:t>crop_mask   = ((wavenumbers_all &gt;= WAVENUMBER_MIN) &amp;</w:t>
         <w:br/>
         <w:t xml:space="preserve">               (wavenumbers_all &lt;= WAVENUMBER_MAX))</w:t>
@@ -1072,18 +463,7 @@
         <w:t>#   Step 3 — Train: remaining 30 per class (60 total)</w:t>
         <w:br/>
         <w:t>#             = 15 Gr + 15 no-Gr per class</w:t>
-      </w:r>
-    </w:p>
-    <w:p>
-      <w:pPr>
-        <w:shd w:val="clear" w:color="auto" w:fill="F2F2F2"/>
-        <w:spacing w:after="0" w:before="0"/>
-      </w:pPr>
-      <w:r>
-        <w:rPr>
-          <w:rFonts w:ascii="Courier New" w:hAnsi="Courier New"/>
-          <w:sz w:val="16"/>
-        </w:rPr>
+        <w:br/>
         <w:t># =============================================================================</w:t>
         <w:br/>
         <w:t>print("\n[SPLIT] Gr-only test split ...")</w:t>
@@ -1154,18 +534,7 @@
         <w:br/>
         <w:br/>
         <w:t>print("[SPLIT] Training : %d spectra  (15 Gr + 15 no-Gr per class)" % len(y_train))</w:t>
-      </w:r>
-    </w:p>
-    <w:p>
-      <w:pPr>
-        <w:shd w:val="clear" w:color="auto" w:fill="F2F2F2"/>
-        <w:spacing w:after="0" w:before="0"/>
-      </w:pPr>
-      <w:r>
-        <w:rPr>
-          <w:rFonts w:ascii="Courier New" w:hAnsi="Courier New"/>
-          <w:sz w:val="16"/>
-        </w:rPr>
+        <w:br/>
         <w:t>for cls, cnt in zip(*np.unique(cls_train, return_counts=True)):</w:t>
         <w:br/>
         <w:t xml:space="preserve">    print("           %-12s: %d" % (cls, cnt))</w:t>
@@ -1240,18 +609,7 @@
         <w:t>n_vip_gt1   = int((vip_all &gt; 1).sum())</w:t>
         <w:br/>
         <w:t>top_n       = min(VIP_TOP_N, len(vip_all))</w:t>
-      </w:r>
-    </w:p>
-    <w:p>
-      <w:pPr>
-        <w:shd w:val="clear" w:color="auto" w:fill="F2F2F2"/>
-        <w:spacing w:after="0" w:before="0"/>
-      </w:pPr>
-      <w:r>
-        <w:rPr>
-          <w:rFonts w:ascii="Courier New" w:hAnsi="Courier New"/>
-          <w:sz w:val="16"/>
-        </w:rPr>
+        <w:br/>
         <w:t>top_idx     = np.argsort(vip_all)[-top_n:]</w:t>
         <w:br/>
         <w:t>wn_sel      = wavenumbers[top_idx]</w:t>
@@ -1325,18 +683,7 @@
         <w:t>Yd_fin    = pd.get_dummies(pd.Series(y_train)).values.astype(float)</w:t>
         <w:br/>
         <w:t>pls_final = PLSRegression(n_components=N_COMPONENTS, scale=False, max_iter=10000)</w:t>
-      </w:r>
-    </w:p>
-    <w:p>
-      <w:pPr>
-        <w:shd w:val="clear" w:color="auto" w:fill="F2F2F2"/>
-        <w:spacing w:after="0" w:before="0"/>
-      </w:pPr>
-      <w:r>
-        <w:rPr>
-          <w:rFonts w:ascii="Courier New" w:hAnsi="Courier New"/>
-          <w:sz w:val="16"/>
-        </w:rPr>
+        <w:br/>
         <w:t>pls_final.fit(Xtr_fin, Yd_fin)</w:t>
         <w:br/>
         <w:br/>
@@ -1410,18 +757,7 @@
         <w:t xml:space="preserve">    random_state=RANDOM_STATE, n_jobs=-1)</w:t>
         <w:br/>
         <w:t>print("[PLS-DA] Observed : %.2f%%   p = %.4f  [%s]" % (</w:t>
-      </w:r>
-    </w:p>
-    <w:p>
-      <w:pPr>
-        <w:shd w:val="clear" w:color="auto" w:fill="F2F2F2"/>
-        <w:spacing w:after="0" w:before="0"/>
-      </w:pPr>
-      <w:r>
-        <w:rPr>
-          <w:rFonts w:ascii="Courier New" w:hAnsi="Courier New"/>
-          <w:sz w:val="16"/>
-        </w:rPr>
+        <w:br/>
         <w:t xml:space="preserve">    obs_score * 100, p_val,</w:t>
         <w:br/>
         <w:t xml:space="preserve">    'SIGNIFICANT (p&lt;0.05)' if p_val &lt; 0.05 else 'NOT significant'))</w:t>
@@ -1466,6 +802,27 @@
         <w:t>print("[SVM-RBF] External test accuracy : %.1f%%" % (acc_svm_test * 100))</w:t>
         <w:br/>
         <w:br/>
+        <w:t># Permutation test</w:t>
+        <w:br/>
+        <w:t>print("[SVM-RBF] Permutation test (%d permutations) ..." % N_PERM)</w:t>
+        <w:br/>
+        <w:t>obs_score_svm, perm_scores_svm, p_val_svm = permutation_test_score(</w:t>
+        <w:br/>
+        <w:t xml:space="preserve">    svm_pipe, X_train_sel, y_train,</w:t>
+        <w:br/>
+        <w:t xml:space="preserve">    scoring='accuracy', cv=cv5,</w:t>
+        <w:br/>
+        <w:t xml:space="preserve">    n_permutations=N_PERM,</w:t>
+        <w:br/>
+        <w:t xml:space="preserve">    random_state=RANDOM_STATE, n_jobs=-1)</w:t>
+        <w:br/>
+        <w:t>print("[SVM-RBF] Observed : %.2f%%   p = %.4f  [%s]" % (</w:t>
+        <w:br/>
+        <w:t xml:space="preserve">    obs_score_svm * 100, p_val_svm,</w:t>
+        <w:br/>
+        <w:t xml:space="preserve">    'SIGNIFICANT (p&lt;0.05)' if p_val_svm &lt; 0.05 else 'NOT significant'))</w:t>
+        <w:br/>
+        <w:br/>
         <w:t># =============================================================================</w:t>
         <w:br/>
         <w:t># 11. PCA FOR CLUSTER VISUALISATION  (fit on TRAIN only)</w:t>
@@ -1496,18 +853,7 @@
         <w:t># =============================================================================</w:t>
         <w:br/>
         <w:t>PALETTE = {</w:t>
-      </w:r>
-    </w:p>
-    <w:p>
-      <w:pPr>
-        <w:shd w:val="clear" w:color="auto" w:fill="F2F2F2"/>
-        <w:spacing w:after="0" w:before="0"/>
-      </w:pPr>
-      <w:r>
-        <w:rPr>
-          <w:rFonts w:ascii="Courier New" w:hAnsi="Courier New"/>
-          <w:sz w:val="16"/>
-        </w:rPr>
+        <w:br/>
         <w:t xml:space="preserve">    'PDMS'    : '#1f77b4',   # blue</w:t>
         <w:br/>
         <w:t xml:space="preserve">    'SiO2/Si' : '#d62728',   # red</w:t>
@@ -1582,18 +928,7 @@
         <w:t># =============================================================================</w:t>
         <w:br/>
         <w:t># HELPER: Confusion matrix figure with per-class stats table (GridSpec)</w:t>
-      </w:r>
-    </w:p>
-    <w:p>
-      <w:pPr>
-        <w:shd w:val="clear" w:color="auto" w:fill="F2F2F2"/>
-        <w:spacing w:after="0" w:before="0"/>
-      </w:pPr>
-      <w:r>
-        <w:rPr>
-          <w:rFonts w:ascii="Courier New" w:hAnsi="Courier New"/>
-          <w:sz w:val="16"/>
-        </w:rPr>
+        <w:br/>
         <w:t># =============================================================================</w:t>
         <w:br/>
         <w:t>def plot_confusion_with_stats(cm, labels, title, fname, cmap, overall_acc):</w:t>
@@ -1669,18 +1004,7 @@
         <w:t xml:space="preserve">    acc_m, rec_m = per_class_metrics(cm_main)</w:t>
         <w:br/>
         <w:t xml:space="preserve">    lines = [label_main,</w:t>
-      </w:r>
-    </w:p>
-    <w:p>
-      <w:pPr>
-        <w:shd w:val="clear" w:color="auto" w:fill="F2F2F2"/>
-        <w:spacing w:after="0" w:before="0"/>
-      </w:pPr>
-      <w:r>
-        <w:rPr>
-          <w:rFonts w:ascii="Courier New" w:hAnsi="Courier New"/>
-          <w:sz w:val="16"/>
-        </w:rPr>
+        <w:br/>
         <w:t xml:space="preserve">             '%-10s  %5s  %6s' % ('Class', 'Acc', 'Recall'),</w:t>
         <w:br/>
         <w:t xml:space="preserve">             '-' * 26]</w:t>
@@ -1758,18 +1082,7 @@
         <w:t># Fig 01 — LV1 vs LV2</w:t>
         <w:br/>
         <w:t>fig, ax = plt.subplots(figsize=(8, 6))</w:t>
-      </w:r>
-    </w:p>
-    <w:p>
-      <w:pPr>
-        <w:shd w:val="clear" w:color="auto" w:fill="F2F2F2"/>
-        <w:spacing w:after="0" w:before="0"/>
-      </w:pPr>
-      <w:r>
-        <w:rPr>
-          <w:rFonts w:ascii="Courier New" w:hAnsi="Courier New"/>
-          <w:sz w:val="16"/>
-        </w:rPr>
+        <w:br/>
         <w:t>scatter_lv(ax, 0, 1,</w:t>
         <w:br/>
         <w:t xml:space="preserve">    'LV1 (%.1f%% var.)' % lv_var(0),</w:t>
@@ -1846,18 +1159,7 @@
         <w:t># =============================================================================</w:t>
         <w:br/>
         <w:t># 14. PLS-DA CONFUSION MATRICES WITH PER-CLASS STATS TABLE</w:t>
-      </w:r>
-    </w:p>
-    <w:p>
-      <w:pPr>
-        <w:shd w:val="clear" w:color="auto" w:fill="F2F2F2"/>
-        <w:spacing w:after="0" w:before="0"/>
-      </w:pPr>
-      <w:r>
-        <w:rPr>
-          <w:rFonts w:ascii="Courier New" w:hAnsi="Courier New"/>
-          <w:sz w:val="16"/>
-        </w:rPr>
+        <w:br/>
         <w:t># =============================================================================</w:t>
         <w:br/>
         <w:t>plot_confusion_with_stats(</w:t>
@@ -1933,18 +1235,7 @@
         <w:t>fig, axes = plt.subplots(N_COMPONENTS, 1, figsize=(11, 3*N_COMPONENTS), sharex=True)</w:t>
         <w:br/>
         <w:t>colors_load = ['steelblue', 'darkorange', 'seagreen']</w:t>
-      </w:r>
-    </w:p>
-    <w:p>
-      <w:pPr>
-        <w:shd w:val="clear" w:color="auto" w:fill="F2F2F2"/>
-        <w:spacing w:after="0" w:before="0"/>
-      </w:pPr>
-      <w:r>
-        <w:rPr>
-          <w:rFonts w:ascii="Courier New" w:hAnsi="Courier New"/>
-          <w:sz w:val="16"/>
-        </w:rPr>
+        <w:br/>
         <w:t>for i, (ax, col) in enumerate(zip(axes, colors_load[:N_COMPONENTS])):</w:t>
         <w:br/>
         <w:t xml:space="preserve">    ax.stem(wn_sel, P_load[:, i], linefmt=col, markerfmt=' ', basefmt='k-')</w:t>
@@ -2009,6 +1300,35 @@
         <w:t>save_fig(fig, '08_PLSDA_Permutation.png')</w:t>
         <w:br/>
         <w:br/>
+        <w:t># SVM-RBF Permutation</w:t>
+        <w:br/>
+        <w:t>fig, ax = plt.subplots(figsize=(7.5, 4.5))</w:t>
+        <w:br/>
+        <w:t>ax.hist(perm_scores_svm, bins=35, color='lightsalmon', edgecolor='white',</w:t>
+        <w:br/>
+        <w:t xml:space="preserve">        label='Permuted accuracy')</w:t>
+        <w:br/>
+        <w:t>ax.axvline(obs_score_svm, color='darkred', lw=2.5,</w:t>
+        <w:br/>
+        <w:t xml:space="preserve">           label='Observed: %.1f%%   p=%.4f' % (obs_score_svm*100, p_val_svm))</w:t>
+        <w:br/>
+        <w:t>ax.axvline(0.50, color='grey', lw=1.2, ls=':', label='Chance level (50%)')</w:t>
+        <w:br/>
+        <w:t>ax.set_xlabel('5-fold CV accuracy', fontsize=12)</w:t>
+        <w:br/>
+        <w:t>ax.set_ylabel('Count', fontsize=12)</w:t>
+        <w:br/>
+        <w:t>ax.set_title('Permutation Test (%d perm.)  |  SVM-RBF Binary  |  ' % N_PERM + TITLE_SUF,</w:t>
+        <w:br/>
+        <w:t xml:space="preserve">             fontsize=10, fontweight='bold')</w:t>
+        <w:br/>
+        <w:t>ax.legend(fontsize=9); ax.grid(True, alpha=0.25)</w:t>
+        <w:br/>
+        <w:t>fig.tight_layout()</w:t>
+        <w:br/>
+        <w:t>save_fig(fig, '08b_SVM_Permutation.png')</w:t>
+        <w:br/>
+        <w:br/>
         <w:t># =============================================================================</w:t>
         <w:br/>
         <w:t># 18. PLS-DA CLUSTER PLOT  (LV1 vs LV2)</w:t>
@@ -2021,18 +1341,7 @@
         <w:br/>
         <w:br/>
         <w:t>for cls in CLASS_LABELS:</w:t>
-      </w:r>
-    </w:p>
-    <w:p>
-      <w:pPr>
-        <w:shd w:val="clear" w:color="auto" w:fill="F2F2F2"/>
-        <w:spacing w:after="0" w:before="0"/>
-      </w:pPr>
-      <w:r>
-        <w:rPr>
-          <w:rFonts w:ascii="Courier New" w:hAnsi="Courier New"/>
-          <w:sz w:val="16"/>
-        </w:rPr>
+        <w:br/>
         <w:t xml:space="preserve">    for i in np.where(cls_train == cls)[0]:</w:t>
         <w:br/>
         <w:t xml:space="preserve">        wrong = (le.transform([cls_train[i]])[0] != y_pls_cv[i])</w:t>
@@ -2111,18 +1420,7 @@
         <w:t>fig.tight_layout()</w:t>
         <w:br/>
         <w:t>save_fig(fig, '09_PLSDA_Cluster_5fold.png')</w:t>
-      </w:r>
-    </w:p>
-    <w:p>
-      <w:pPr>
-        <w:shd w:val="clear" w:color="auto" w:fill="F2F2F2"/>
-        <w:spacing w:after="0" w:before="0"/>
-      </w:pPr>
-      <w:r>
-        <w:rPr>
-          <w:rFonts w:ascii="Courier New" w:hAnsi="Courier New"/>
-          <w:sz w:val="16"/>
-        </w:rPr>
+        <w:br/>
         <w:br/>
         <w:t># =============================================================================</w:t>
         <w:br/>
@@ -2199,18 +1497,7 @@
         <w:t>nw_tr = int((le.transform(cls_train) != y_svm_cv).sum())</w:t>
         <w:br/>
         <w:t>nw_te = int((le.transform(cls_test)  != y_svm_test).sum())</w:t>
-      </w:r>
-    </w:p>
-    <w:p>
-      <w:pPr>
-        <w:shd w:val="clear" w:color="auto" w:fill="F2F2F2"/>
-        <w:spacing w:after="0" w:before="0"/>
-      </w:pPr>
-      <w:r>
-        <w:rPr>
-          <w:rFonts w:ascii="Courier New" w:hAnsi="Courier New"/>
-          <w:sz w:val="16"/>
-        </w:rPr>
+        <w:br/>
         <w:t>scatter_svm(ax, y_svm_cv, y_svm_test,</w:t>
         <w:br/>
         <w:t xml:space="preserve">    'SVM-RBF Binary Cluster  |  5-fold CV (train) + External Test (Gr only)\n'</w:t>
@@ -2286,18 +1573,7 @@
         <w:t>svm_acc_cv_v,  svm_rec_cv_v  = per_class_metrics(cm_svm_cv)</w:t>
         <w:br/>
         <w:t>pls_acc_te_v,  pls_rec_te_v  = per_class_metrics(cm_pls_test)</w:t>
-      </w:r>
-    </w:p>
-    <w:p>
-      <w:pPr>
-        <w:shd w:val="clear" w:color="auto" w:fill="F2F2F2"/>
-        <w:spacing w:after="0" w:before="0"/>
-      </w:pPr>
-      <w:r>
-        <w:rPr>
-          <w:rFonts w:ascii="Courier New" w:hAnsi="Courier New"/>
-          <w:sz w:val="16"/>
-        </w:rPr>
+        <w:br/>
         <w:t>svm_acc_te_v,  svm_rec_te_v  = per_class_metrics(cm_svm_test)</w:t>
         <w:br/>
         <w:br/>
@@ -2373,18 +1649,7 @@
         <w:t>ax = axes[2]</w:t>
         <w:br/>
         <w:t>b1 = ax.bar(xc-wc/2, pls_acc_te_v, wc, color='steelblue',  edgecolor='k', lw=0.7, label='PLS-DA')</w:t>
-      </w:r>
-    </w:p>
-    <w:p>
-      <w:pPr>
-        <w:shd w:val="clear" w:color="auto" w:fill="F2F2F2"/>
-        <w:spacing w:after="0" w:before="0"/>
-      </w:pPr>
-      <w:r>
-        <w:rPr>
-          <w:rFonts w:ascii="Courier New" w:hAnsi="Courier New"/>
-          <w:sz w:val="16"/>
-        </w:rPr>
+        <w:br/>
         <w:t>b2 = ax.bar(xc+wc/2, svm_acc_te_v, wc, color='darkorange', edgecolor='k', lw=0.7, label='SVM-RBF')</w:t>
         <w:br/>
         <w:t>for bar in list(b1)+list(b2):</w:t>
@@ -2460,18 +1725,7 @@
         <w:t># Panel 2: Per-class recall (5-fold CV)</w:t>
         <w:br/>
         <w:t>ax = axes[1]</w:t>
-      </w:r>
-    </w:p>
-    <w:p>
-      <w:pPr>
-        <w:shd w:val="clear" w:color="auto" w:fill="F2F2F2"/>
-        <w:spacing w:after="0" w:before="0"/>
-      </w:pPr>
-      <w:r>
-        <w:rPr>
-          <w:rFonts w:ascii="Courier New" w:hAnsi="Courier New"/>
-          <w:sz w:val="16"/>
-        </w:rPr>
+        <w:br/>
         <w:t>b1 = ax.bar(xc-wc/2, pls_rec_cv_v, wc, color='steelblue',  edgecolor='k', lw=0.7, label='PLS-DA')</w:t>
         <w:br/>
         <w:t>b2 = ax.bar(xc+wc/2, svm_rec_cv_v, wc, color='darkorange', edgecolor='k', lw=0.7, label='SVM-RBF')</w:t>
@@ -2547,18 +1801,7 @@
         <w:t xml:space="preserve">    idx = classes == cls</w:t>
         <w:br/>
         <w:t xml:space="preserve">    m = X_all_sm[idx].mean(axis=0)</w:t>
-      </w:r>
-    </w:p>
-    <w:p>
-      <w:pPr>
-        <w:shd w:val="clear" w:color="auto" w:fill="F2F2F2"/>
-        <w:spacing w:after="0" w:before="0"/>
-      </w:pPr>
-      <w:r>
-        <w:rPr>
-          <w:rFonts w:ascii="Courier New" w:hAnsi="Courier New"/>
-          <w:sz w:val="16"/>
-        </w:rPr>
+        <w:br/>
         <w:t xml:space="preserve">    s = X_all_sm[idx].std(axis=0)</w:t>
         <w:br/>
         <w:t xml:space="preserve">    ax.plot(wavenumbers, m, color=PALETTE[cls], lw=2.0, label='%s (n=%d)' % (cls, idx.sum()))</w:t>
@@ -2635,18 +1878,7 @@
         <w:t xml:space="preserve">        ('PLS-DA External test acc (%)',        '%.2f' % (acc_pls_test * 100)),</w:t>
         <w:br/>
         <w:t xml:space="preserve">        ('PLS-DA Permutation p-value',          '%.4f' % p_val),</w:t>
-      </w:r>
-    </w:p>
-    <w:p>
-      <w:pPr>
-        <w:shd w:val="clear" w:color="auto" w:fill="F2F2F2"/>
-        <w:spacing w:after="0" w:before="0"/>
-      </w:pPr>
-      <w:r>
-        <w:rPr>
-          <w:rFonts w:ascii="Courier New" w:hAnsi="Courier New"/>
-          <w:sz w:val="16"/>
-        </w:rPr>
+        <w:br/>
         <w:t xml:space="preserve">        ('PLS-DA Permutation result',</w:t>
         <w:br/>
         <w:t xml:space="preserve">         'Significant (p&lt;0.05)' if p_val &lt; 0.05 else 'NOT significant'),</w:t>
@@ -2659,6 +1891,12 @@
         <w:br/>
         <w:t xml:space="preserve">        ('SVM-RBF External test acc (%)',       '%.2f' % (acc_svm_test * 100)),</w:t>
         <w:br/>
+        <w:t xml:space="preserve">        ('SVM-RBF Permutation p-value',         '%.4f' % p_val_svm),</w:t>
+        <w:br/>
+        <w:t xml:space="preserve">        ('SVM-RBF Permutation result',</w:t>
+        <w:br/>
+        <w:t xml:space="preserve">         'Significant (p&lt;0.05)' if p_val_svm &lt; 0.05 else 'NOT significant'),</w:t>
+        <w:br/>
         <w:t xml:space="preserve">        ('SVM kernel', 'RBF'), ('SVM C', 10), ('SVM gamma', 'scale'),</w:t>
         <w:br/>
         <w:t xml:space="preserve">    ]</w:t>
@@ -2724,18 +1962,7 @@
         <w:t xml:space="preserve">        'SVM_5fold_Pred':      le.inverse_transform(y_svm_cv),</w:t>
         <w:br/>
         <w:t xml:space="preserve">        'SVM_5fold_Correct':   (cls_train == le.inverse_transform(y_svm_cv)),</w:t>
-      </w:r>
-    </w:p>
-    <w:p>
-      <w:pPr>
-        <w:shd w:val="clear" w:color="auto" w:fill="F2F2F2"/>
-        <w:spacing w:after="0" w:before="0"/>
-      </w:pPr>
-      <w:r>
-        <w:rPr>
-          <w:rFonts w:ascii="Courier New" w:hAnsi="Courier New"/>
-          <w:sz w:val="16"/>
-        </w:rPr>
+        <w:br/>
         <w:t xml:space="preserve">        'LV1': T_train[:,0], 'LV2': T_train[:,1],</w:t>
         <w:br/>
         <w:t xml:space="preserve">        'LV3': T_train[:,2], 'PC1': Z_train[:,0], 'PC2': Z_train[:,1],</w:t>
@@ -2811,26 +2038,17 @@
         <w:t xml:space="preserve">    load_df.insert(0, 'Wavenumber_cm1', wn_sel)</w:t>
         <w:br/>
         <w:t xml:space="preserve">    load_df.to_excel(writer, sheet_name='Loadings', index=False)</w:t>
-      </w:r>
-    </w:p>
-    <w:p>
-      <w:pPr>
-        <w:shd w:val="clear" w:color="auto" w:fill="F2F2F2"/>
-        <w:spacing w:after="0" w:before="0"/>
-      </w:pPr>
-      <w:r>
-        <w:rPr>
-          <w:rFonts w:ascii="Courier New" w:hAnsi="Courier New"/>
-          <w:sz w:val="16"/>
-        </w:rPr>
+        <w:br/>
         <w:br/>
         <w:t xml:space="preserve">    # Permutation</w:t>
         <w:br/>
         <w:t xml:space="preserve">    pd.DataFrame({</w:t>
         <w:br/>
-        <w:t xml:space="preserve">        'Permutation_Index': np.arange(1, N_PERM+1),</w:t>
-        <w:br/>
-        <w:t xml:space="preserve">        'Permuted_Accuracy': perm_scores,</w:t>
+        <w:t xml:space="preserve">        'Permutation_Index':       np.arange(1, N_PERM+1),</w:t>
+        <w:br/>
+        <w:t xml:space="preserve">        'PLSDA_Permuted_Accuracy': perm_scores,</w:t>
+        <w:br/>
+        <w:t xml:space="preserve">        'SVM_Permuted_Accuracy':   perm_scores_svm,</w:t>
         <w:br/>
         <w:t xml:space="preserve">    }).to_excel(writer, sheet_name='Permutation_Test', index=False)</w:t>
         <w:br/>
@@ -2872,9 +2090,13 @@
         <w:br/>
         <w:t>print()</w:t>
         <w:br/>
-        <w:t>print('  PLS-DA permutation p-value : %.4f  [%s]' % (</w:t>
-        <w:br/>
-        <w:t xml:space="preserve">    p_val, 'SIGNIFICANT' if p_val &lt; 0.05 else 'NOT significant'))</w:t>
+        <w:t>print('  PLS-DA  permutation p-value : %.4f  [%s]' % (</w:t>
+        <w:br/>
+        <w:t xml:space="preserve">    p_val,     'SIGNIFICANT' if p_val     &lt; 0.05 else 'NOT significant'))</w:t>
+        <w:br/>
+        <w:t>print('  SVM-RBF permutation p-value : %.4f  [%s]' % (</w:t>
+        <w:br/>
+        <w:t xml:space="preserve">    p_val_svm, 'SIGNIFICANT' if p_val_svm &lt; 0.05 else 'NOT significant'))</w:t>
         <w:br/>
         <w:t>print()</w:t>
         <w:br/>
@@ -2899,18 +2121,7 @@
         <w:t>print('  %-12s  %9s  %7s  |  %9s  %7s' % (</w:t>
         <w:br/>
         <w:t xml:space="preserve">    'Class', 'PLS Acc', 'PLS Rec', 'SVM Acc', 'SVM Rec'))</w:t>
-      </w:r>
-    </w:p>
-    <w:p>
-      <w:pPr>
-        <w:shd w:val="clear" w:color="auto" w:fill="F2F2F2"/>
-        <w:spacing w:after="0" w:before="0"/>
-      </w:pPr>
-      <w:r>
-        <w:rPr>
-          <w:rFonts w:ascii="Courier New" w:hAnsi="Courier New"/>
-          <w:sz w:val="16"/>
-        </w:rPr>
+        <w:br/>
         <w:t>print('  ' + '-' * 54)</w:t>
         <w:br/>
         <w:t>for i, cls in enumerate(CLASS_LABELS):</w:t>
@@ -2937,7 +2148,7 @@
     </w:p>
     <w:sectPr>
       <w:pgSz w:w="12240" w:h="15840"/>
-      <w:pgMar w:top="1020" w:right="1134" w:bottom="1020" w:left="1134" w:header="720" w:footer="720" w:gutter="0"/>
+      <w:pgMar w:top="1440" w:right="1800" w:bottom="1440" w:left="1800" w:header="720" w:footer="720" w:gutter="0"/>
       <w:cols w:space="720"/>
       <w:docGrid w:linePitch="360"/>
     </w:sectPr>
@@ -3308,6 +2519,10 @@
     <w:name w:val="Normal"/>
     <w:qFormat/>
     <w:rsid w:val="00FC693F"/>
+    <w:rPr>
+      <w:rFonts w:ascii="Courier New" w:hAnsi="Courier New"/>
+      <w:sz w:val="18"/>
+    </w:rPr>
   </w:style>
   <w:style w:type="paragraph" w:styleId="Header">
     <w:name w:val="header"/>

</xml_diff>